<commit_message>
Rebuild report, manual and slides with the database consoles
Co-Authored-By: Claude Opus 5.5 <noreply@anthropic.com>
</commit_message>
<xml_diff>
--- a/review3/Final_Report_GraphRAG_CTI_Platform.docx
+++ b/review3/Final_Report_GraphRAG_CTI_Platform.docx
@@ -1371,7 +1371,7 @@
                 <w:sz w:val="22"/>
                 <w:szCs w:val="22"/>
               </w:rPr>
-              <w:t xml:space="preserve">12</w:t>
+              <w:t xml:space="preserve">13</w:t>
             </w:r>
           </w:p>
         </w:tc>
@@ -1447,7 +1447,7 @@
                 <w:sz w:val="22"/>
                 <w:szCs w:val="22"/>
               </w:rPr>
-              <w:t xml:space="preserve">13</w:t>
+              <w:t xml:space="preserve">14</w:t>
             </w:r>
           </w:p>
         </w:tc>
@@ -1523,7 +1523,7 @@
                 <w:sz w:val="22"/>
                 <w:szCs w:val="22"/>
               </w:rPr>
-              <w:t xml:space="preserve">15</w:t>
+              <w:t xml:space="preserve">16</w:t>
             </w:r>
           </w:p>
         </w:tc>
@@ -1599,7 +1599,7 @@
                 <w:sz w:val="22"/>
                 <w:szCs w:val="22"/>
               </w:rPr>
-              <w:t xml:space="preserve">22</w:t>
+              <w:t xml:space="preserve">23</w:t>
             </w:r>
           </w:p>
         </w:tc>
@@ -1675,7 +1675,7 @@
                 <w:sz w:val="22"/>
                 <w:szCs w:val="22"/>
               </w:rPr>
-              <w:t xml:space="preserve">22</w:t>
+              <w:t xml:space="preserve">23</w:t>
             </w:r>
           </w:p>
         </w:tc>
@@ -1751,7 +1751,7 @@
                 <w:sz w:val="22"/>
                 <w:szCs w:val="22"/>
               </w:rPr>
-              <w:t xml:space="preserve">23</w:t>
+              <w:t xml:space="preserve">24</w:t>
             </w:r>
           </w:p>
         </w:tc>
@@ -1827,7 +1827,7 @@
                 <w:sz w:val="22"/>
                 <w:szCs w:val="22"/>
               </w:rPr>
-              <w:t xml:space="preserve">24</w:t>
+              <w:t xml:space="preserve">25</w:t>
             </w:r>
           </w:p>
         </w:tc>
@@ -1903,7 +1903,7 @@
                 <w:sz w:val="22"/>
                 <w:szCs w:val="22"/>
               </w:rPr>
-              <w:t xml:space="preserve">25</w:t>
+              <w:t xml:space="preserve">26</w:t>
             </w:r>
           </w:p>
         </w:tc>
@@ -8675,6 +8675,197 @@
     </w:p>
     <w:p>
       <w:pPr>
+        <w:pStyle w:val="Heading2"/>
+        <w:keepNext/>
+        <w:spacing w:after="120" w:before="240"/>
+      </w:pPr>
+      <w:r>
+        <w:rPr>
+          <w:rFonts w:ascii="Times New Roman" w:cs="Times New Roman" w:eastAsia="Times New Roman" w:hAnsi="Times New Roman"/>
+          <w:b/>
+          <w:bCs/>
+          <w:color w:val="1B4F72"/>
+          <w:sz w:val="26"/>
+          <w:szCs w:val="26"/>
+        </w:rPr>
+        <w:t xml:space="preserve">6.7  The databases in their own consoles</w:t>
+      </w:r>
+    </w:p>
+    <w:p>
+      <w:pPr>
+        <w:spacing w:after="160" w:line="340"/>
+        <w:jc w:val="both"/>
+      </w:pPr>
+      <w:r>
+        <w:rPr>
+          <w:rFonts w:ascii="Times New Roman" w:cs="Times New Roman" w:eastAsia="Times New Roman" w:hAnsi="Times New Roman"/>
+          <w:sz w:val="24"/>
+          <w:szCs w:val="24"/>
+        </w:rPr>
+        <w:t xml:space="preserve">Each store can also be inspected directly in its native tool, independently of the platform (Figure 7): Neo4j Browser runs Cypher against the live graph — </w:t>
+      </w:r>
+      <w:r>
+        <w:rPr>
+          <w:rFonts w:ascii="Courier New" w:cs="Courier New" w:eastAsia="Courier New" w:hAnsi="Courier New"/>
+          <w:sz w:val="20"/>
+          <w:szCs w:val="20"/>
+        </w:rPr>
+        <w:t xml:space="preserve">CALL db.schema.visualization()</w:t>
+      </w:r>
+      <w:r>
+        <w:rPr>
+          <w:rFonts w:ascii="Times New Roman" w:cs="Times New Roman" w:eastAsia="Times New Roman" w:hAnsi="Times New Roman"/>
+          <w:sz w:val="24"/>
+          <w:szCs w:val="24"/>
+        </w:rPr>
+        <w:t xml:space="preserve"> draws the schema of 8 labels and 16 relationship patterns; mongo-express shows the </w:t>
+      </w:r>
+      <w:r>
+        <w:rPr>
+          <w:rFonts w:ascii="Courier New" w:cs="Courier New" w:eastAsia="Courier New" w:hAnsi="Courier New"/>
+          <w:sz w:val="20"/>
+          <w:szCs w:val="20"/>
+        </w:rPr>
+        <w:t xml:space="preserve">cti</w:t>
+      </w:r>
+      <w:r>
+        <w:rPr>
+          <w:rFonts w:ascii="Times New Roman" w:cs="Times New Roman" w:eastAsia="Times New Roman" w:hAnsi="Times New Roman"/>
+          <w:sz w:val="24"/>
+          <w:szCs w:val="24"/>
+        </w:rPr>
+        <w:t xml:space="preserve"> database's six collections and each report with its own nested fields; Redis Commander shows every </w:t>
+      </w:r>
+      <w:r>
+        <w:rPr>
+          <w:rFonts w:ascii="Courier New" w:cs="Courier New" w:eastAsia="Courier New" w:hAnsi="Courier New"/>
+          <w:sz w:val="20"/>
+          <w:szCs w:val="20"/>
+        </w:rPr>
+        <w:t xml:space="preserve">ioc:{type}:{value}</w:t>
+      </w:r>
+      <w:r>
+        <w:rPr>
+          <w:rFonts w:ascii="Times New Roman" w:cs="Times New Roman" w:eastAsia="Times New Roman" w:hAnsi="Times New Roman"/>
+          <w:sz w:val="24"/>
+          <w:szCs w:val="24"/>
+        </w:rPr>
+        <w:t xml:space="preserve"> key with its value and a TTL that counts down; and the Qdrant dashboard lists the 25 vector points of </w:t>
+      </w:r>
+      <w:r>
+        <w:rPr>
+          <w:rFonts w:ascii="Courier New" w:cs="Courier New" w:eastAsia="Courier New" w:hAnsi="Courier New"/>
+          <w:sz w:val="20"/>
+          <w:szCs w:val="20"/>
+        </w:rPr>
+        <w:t xml:space="preserve">threat_chunks</w:t>
+      </w:r>
+      <w:r>
+        <w:rPr>
+          <w:rFonts w:ascii="Times New Roman" w:cs="Times New Roman" w:eastAsia="Times New Roman" w:hAnsi="Times New Roman"/>
+          <w:sz w:val="24"/>
+          <w:szCs w:val="24"/>
+        </w:rPr>
+        <w:t xml:space="preserve"> with their payloads and HNSW settings. </w:t>
+      </w:r>
+      <w:r>
+        <w:rPr>
+          <w:rFonts w:ascii="Courier New" w:cs="Courier New" w:eastAsia="Courier New" w:hAnsi="Courier New"/>
+          <w:sz w:val="20"/>
+          <w:szCs w:val="20"/>
+        </w:rPr>
+        <w:t xml:space="preserve">make dbui</w:t>
+      </w:r>
+      <w:r>
+        <w:rPr>
+          <w:rFonts w:ascii="Times New Roman" w:cs="Times New Roman" w:eastAsia="Times New Roman" w:hAnsi="Times New Roman"/>
+          <w:sz w:val="24"/>
+          <w:szCs w:val="24"/>
+        </w:rPr>
+        <w:t xml:space="preserve"> starts the two consoles that are not built in, read-only and bound to the local machine; </w:t>
+      </w:r>
+      <w:r>
+        <w:rPr>
+          <w:rFonts w:ascii="Courier New" w:cs="Courier New" w:eastAsia="Courier New" w:hAnsi="Courier New"/>
+          <w:sz w:val="20"/>
+          <w:szCs w:val="20"/>
+        </w:rPr>
+        <w:t xml:space="preserve">review3/DATABASE_TOUR.md</w:t>
+      </w:r>
+      <w:r>
+        <w:rPr>
+          <w:rFonts w:ascii="Times New Roman" w:cs="Times New Roman" w:eastAsia="Times New Roman" w:hAnsi="Times New Roman"/>
+          <w:sz w:val="24"/>
+          <w:szCs w:val="24"/>
+        </w:rPr>
+        <w:t xml:space="preserve"> gives the queries used in the demonstration.</w:t>
+      </w:r>
+    </w:p>
+    <w:p>
+      <w:pPr>
+        <w:keepNext/>
+        <w:spacing w:after="40" w:before="120"/>
+        <w:jc w:val="center"/>
+      </w:pPr>
+      <w:r>
+        <w:drawing>
+          <wp:inline distT="0" distB="0" distL="0" distR="0">
+            <wp:extent cx="6096000" cy="4133850"/>
+            <wp:effectExtent t="0" r="0" b="0" l="0"/>
+            <wp:docPr id="1" name="The four NoSQL databases in their own consoles: Neo4j Browser, mongo-express, Redis Commander and the Qdrant dashboard." descr="The four NoSQL databases in their own consoles: Neo4j Browser, mongo-express, Redis Commander and the Qdrant dashboard." title="The four NoSQL databases in their own consoles: Neo4j Browser, mongo-express, Redis Commander and the Qdrant dashboard."/>
+            <wp:cNvGraphicFramePr>
+              <a:graphicFrameLocks xmlns:a="http://schemas.openxmlformats.org/drawingml/2006/main" noChangeAspect="1"/>
+            </wp:cNvGraphicFramePr>
+            <a:graphic xmlns:a="http://schemas.openxmlformats.org/drawingml/2006/main">
+              <a:graphicData uri="http://schemas.openxmlformats.org/drawingml/2006/picture">
+                <pic:pic xmlns:pic="http://schemas.openxmlformats.org/drawingml/2006/picture">
+                  <pic:nvPicPr>
+                    <pic:cNvPr id="0" name="" descr=""/>
+                    <pic:cNvPicPr>
+                      <a:picLocks noChangeAspect="1" noChangeArrowheads="1"/>
+                    </pic:cNvPicPr>
+                  </pic:nvPicPr>
+                  <pic:blipFill>
+                    <a:blip r:embed="rId17" cstate="none"/>
+                    <a:srcRect/>
+                    <a:stretch>
+                      <a:fillRect/>
+                    </a:stretch>
+                  </pic:blipFill>
+                  <pic:spPr bwMode="auto">
+                    <a:xfrm>
+                      <a:off x="0" y="0"/>
+                      <a:ext cx="6096000" cy="4133850"/>
+                    </a:xfrm>
+                    <a:prstGeom prst="rect">
+                      <a:avLst/>
+                    </a:prstGeom>
+                  </pic:spPr>
+                </pic:pic>
+              </a:graphicData>
+            </a:graphic>
+          </wp:inline>
+        </w:drawing>
+      </w:r>
+    </w:p>
+    <w:p>
+      <w:pPr>
+        <w:spacing w:after="240" w:before="60"/>
+        <w:jc w:val="center"/>
+      </w:pPr>
+      <w:r>
+        <w:rPr>
+          <w:rFonts w:ascii="Times New Roman" w:cs="Times New Roman" w:eastAsia="Times New Roman" w:hAnsi="Times New Roman"/>
+          <w:i/>
+          <w:iCs/>
+          <w:sz w:val="20"/>
+          <w:szCs w:val="20"/>
+        </w:rPr>
+        <w:t xml:space="preserve">Figure 7.  The four NoSQL databases in their own consoles: Neo4j Browser, mongo-express, Redis Commander and the Qdrant dashboard.</w:t>
+      </w:r>
+    </w:p>
+    <w:p>
+      <w:pPr>
         <w:pStyle w:val="Heading1"/>
         <w:pageBreakBefore/>
         <w:pBdr>
@@ -14816,7 +15007,7 @@
                     </pic:cNvPicPr>
                   </pic:nvPicPr>
                   <pic:blipFill>
-                    <a:blip r:embed="rId17" cstate="none"/>
+                    <a:blip r:embed="rId18" cstate="none"/>
                     <a:srcRect/>
                     <a:stretch>
                       <a:fillRect/>
@@ -14851,7 +15042,7 @@
           <w:sz w:val="20"/>
           <w:szCs w:val="20"/>
         </w:rPr>
-        <w:t xml:space="preserve">Figure 7.  p95 latency of each store's GraphRAG query as the corpus grows 200× (after the fixes of Section 9.4).</w:t>
+        <w:t xml:space="preserve">Figure 8.  p95 latency of each store's GraphRAG query as the corpus grows 200× (after the fixes of Section 9.4).</w:t>
       </w:r>
     </w:p>
     <w:p>
@@ -14897,7 +15088,7 @@
           <w:sz w:val="24"/>
           <w:szCs w:val="24"/>
         </w:rPr>
-        <w:t xml:space="preserve">The first scaling run did not look like Figure 7. GraphRAG retrieval grew roughly linearly with corpus size — median 26.8 ms at 1× to 675 ms at 200×, p95 14.7 s — and ingest throughput fell from 20.4 to 1.5 reports per second. Per-channel timing and Neo4j PROFILE output traced this to four defects, none visible on the 87-node seed corpus:</w:t>
+        <w:t xml:space="preserve">The first scaling run did not look like Figure 8. GraphRAG retrieval grew roughly linearly with corpus size — median 26.8 ms at 1× to 675 ms at 200×, p95 14.7 s — and ingest throughput fell from 20.4 to 1.5 reports per second. Per-channel timing and Neo4j PROFILE output traced this to four defects, none visible on the 87-node seed corpus:</w:t>
       </w:r>
     </w:p>
     <w:tbl>
@@ -15514,7 +15705,7 @@
                     </pic:cNvPicPr>
                   </pic:nvPicPr>
                   <pic:blipFill>
-                    <a:blip r:embed="rId18" cstate="none"/>
+                    <a:blip r:embed="rId19" cstate="none"/>
                     <a:srcRect/>
                     <a:stretch>
                       <a:fillRect/>
@@ -15549,7 +15740,7 @@
           <w:sz w:val="20"/>
           <w:szCs w:val="20"/>
         </w:rPr>
-        <w:t xml:space="preserve">Figure 8.  Entity linking and GraphRAG retrieval latency before and after the fixes, 1× to 200×.</w:t>
+        <w:t xml:space="preserve">Figure 9.  Entity linking and GraphRAG retrieval latency before and after the fixes, 1× to 200×.</w:t>
       </w:r>
     </w:p>
     <w:p>
@@ -15563,7 +15754,7 @@
           <w:sz w:val="24"/>
           <w:szCs w:val="24"/>
         </w:rPr>
-        <w:t xml:space="preserve">At 200× the fixes reduce entity linking from 379 ms to 0.06 ms (median), GraphRAG retrieval from 675 ms to 65.4 ms (median) and from 14.7 s to 185 ms (p95), and raise ingest throughput from 1.5 to 31.6 reports per second (Figure 9). The full scale experiment now runs in 123.4 s instead of 331.8 s.</w:t>
+        <w:t xml:space="preserve">At 200× the fixes reduce entity linking from 379 ms to 0.06 ms (median), GraphRAG retrieval from 675 ms to 65.4 ms (median) and from 14.7 s to 185 ms (p95), and raise ingest throughput from 1.5 to 31.6 reports per second (Figure 10). The full scale experiment now runs in 123.4 s instead of 331.8 s.</w:t>
       </w:r>
     </w:p>
     <w:p>
@@ -15578,133 +15769,6 @@
             <wp:extent cx="6096000" cy="2447925"/>
             <wp:effectExtent t="0" r="0" b="0" l="0"/>
             <wp:docPr id="1" name="Ingest throughput through the full four-store fan-out, before and after the fixes." descr="Ingest throughput through the full four-store fan-out, before and after the fixes." title="Ingest throughput through the full four-store fan-out, before and after the fixes."/>
-            <wp:cNvGraphicFramePr>
-              <a:graphicFrameLocks xmlns:a="http://schemas.openxmlformats.org/drawingml/2006/main" noChangeAspect="1"/>
-            </wp:cNvGraphicFramePr>
-            <a:graphic xmlns:a="http://schemas.openxmlformats.org/drawingml/2006/main">
-              <a:graphicData uri="http://schemas.openxmlformats.org/drawingml/2006/picture">
-                <pic:pic xmlns:pic="http://schemas.openxmlformats.org/drawingml/2006/picture">
-                  <pic:nvPicPr>
-                    <pic:cNvPr id="0" name="" descr=""/>
-                    <pic:cNvPicPr>
-                      <a:picLocks noChangeAspect="1" noChangeArrowheads="1"/>
-                    </pic:cNvPicPr>
-                  </pic:nvPicPr>
-                  <pic:blipFill>
-                    <a:blip r:embed="rId19" cstate="none"/>
-                    <a:srcRect/>
-                    <a:stretch>
-                      <a:fillRect/>
-                    </a:stretch>
-                  </pic:blipFill>
-                  <pic:spPr bwMode="auto">
-                    <a:xfrm>
-                      <a:off x="0" y="0"/>
-                      <a:ext cx="6096000" cy="2447925"/>
-                    </a:xfrm>
-                    <a:prstGeom prst="rect">
-                      <a:avLst/>
-                    </a:prstGeom>
-                  </pic:spPr>
-                </pic:pic>
-              </a:graphicData>
-            </a:graphic>
-          </wp:inline>
-        </w:drawing>
-      </w:r>
-    </w:p>
-    <w:p>
-      <w:pPr>
-        <w:spacing w:after="240" w:before="60"/>
-        <w:jc w:val="center"/>
-      </w:pPr>
-      <w:r>
-        <w:rPr>
-          <w:rFonts w:ascii="Times New Roman" w:cs="Times New Roman" w:eastAsia="Times New Roman" w:hAnsi="Times New Roman"/>
-          <w:i/>
-          <w:iCs/>
-          <w:sz w:val="20"/>
-          <w:szCs w:val="20"/>
-        </w:rPr>
-        <w:t xml:space="preserve">Figure 9.  Ingest throughput through the full four-store fan-out, before and after the fixes.</w:t>
-      </w:r>
-    </w:p>
-    <w:p>
-      <w:pPr>
-        <w:pStyle w:val="Heading2"/>
-        <w:keepNext/>
-        <w:spacing w:after="120" w:before="240"/>
-      </w:pPr>
-      <w:r>
-        <w:rPr>
-          <w:rFonts w:ascii="Times New Roman" w:cs="Times New Roman" w:eastAsia="Times New Roman" w:hAnsi="Times New Roman"/>
-          <w:b/>
-          <w:bCs/>
-          <w:color w:val="1B4F72"/>
-          <w:sz w:val="26"/>
-          <w:szCs w:val="26"/>
-        </w:rPr>
-        <w:t xml:space="preserve">9.5  Indexing</w:t>
-      </w:r>
-    </w:p>
-    <w:p>
-      <w:pPr>
-        <w:spacing w:after="160" w:line="340"/>
-        <w:jc w:val="both"/>
-      </w:pPr>
-      <w:r>
-        <w:rPr>
-          <w:rFonts w:ascii="Times New Roman" w:cs="Times New Roman" w:eastAsia="Times New Roman" w:hAnsi="Times New Roman"/>
-          <w:sz w:val="24"/>
-          <w:szCs w:val="24"/>
-        </w:rPr>
-        <w:t xml:space="preserve">Each store's indexes were ablated on dedicated data: 200,000 synthetic reports in MongoDB and 100,000 hosts in Neo4j. Figure 10 and Table 14 show latency together with the work the engine reports — documents and keys examined from MongoDB </w:t>
-      </w:r>
-      <w:r>
-        <w:rPr>
-          <w:rFonts w:ascii="Courier New" w:cs="Courier New" w:eastAsia="Courier New" w:hAnsi="Courier New"/>
-          <w:sz w:val="20"/>
-          <w:szCs w:val="20"/>
-        </w:rPr>
-        <w:t xml:space="preserve">explain()</w:t>
-      </w:r>
-      <w:r>
-        <w:rPr>
-          <w:rFonts w:ascii="Times New Roman" w:cs="Times New Roman" w:eastAsia="Times New Roman" w:hAnsi="Times New Roman"/>
-          <w:sz w:val="24"/>
-          <w:szCs w:val="24"/>
-        </w:rPr>
-        <w:t xml:space="preserve">, database hits from Neo4j </w:t>
-      </w:r>
-      <w:r>
-        <w:rPr>
-          <w:rFonts w:ascii="Courier New" w:cs="Courier New" w:eastAsia="Courier New" w:hAnsi="Courier New"/>
-          <w:sz w:val="20"/>
-          <w:szCs w:val="20"/>
-        </w:rPr>
-        <w:t xml:space="preserve">PROFILE</w:t>
-      </w:r>
-      <w:r>
-        <w:rPr>
-          <w:rFonts w:ascii="Times New Roman" w:cs="Times New Roman" w:eastAsia="Times New Roman" w:hAnsi="Times New Roman"/>
-          <w:sz w:val="24"/>
-          <w:szCs w:val="24"/>
-        </w:rPr>
-        <w:t xml:space="preserve">.</w:t>
-      </w:r>
-    </w:p>
-    <w:p>
-      <w:pPr>
-        <w:keepNext/>
-        <w:spacing w:after="40" w:before="120"/>
-        <w:jc w:val="center"/>
-      </w:pPr>
-      <w:r>
-        <w:drawing>
-          <wp:inline distT="0" distB="0" distL="0" distR="0">
-            <wp:extent cx="6096000" cy="2314575"/>
-            <wp:effectExtent t="0" r="0" b="0" l="0"/>
-            <wp:docPr id="1" name="Index ablation: MongoDB report queries and Neo4j property lookup, without and with indexes (median latency)." descr="Index ablation: MongoDB report queries and Neo4j property lookup, without and with indexes (median latency)." title="Index ablation: MongoDB report queries and Neo4j property lookup, without and with indexes (median latency)."/>
             <wp:cNvGraphicFramePr>
               <a:graphicFrameLocks xmlns:a="http://schemas.openxmlformats.org/drawingml/2006/main" noChangeAspect="1"/>
             </wp:cNvGraphicFramePr>
@@ -15727,7 +15791,7 @@
                   <pic:spPr bwMode="auto">
                     <a:xfrm>
                       <a:off x="0" y="0"/>
-                      <a:ext cx="6096000" cy="2314575"/>
+                      <a:ext cx="6096000" cy="2447925"/>
                     </a:xfrm>
                     <a:prstGeom prst="rect">
                       <a:avLst/>
@@ -15753,962 +15817,7 @@
           <w:sz w:val="20"/>
           <w:szCs w:val="20"/>
         </w:rPr>
-        <w:t xml:space="preserve">Figure 10.  Index ablation: MongoDB report queries and Neo4j property lookup, without and with indexes (median latency).</w:t>
-      </w:r>
-    </w:p>
-    <w:tbl>
-      <w:tblPr>
-        <w:tblW w:type="dxa" w:w="9638"/>
-        <w:tblBorders>
-          <w:top w:val="single" w:color="auto" w:sz="4"/>
-          <w:left w:val="single" w:color="auto" w:sz="4"/>
-          <w:bottom w:val="single" w:color="auto" w:sz="4"/>
-          <w:right w:val="single" w:color="auto" w:sz="4"/>
-          <w:insideH w:val="single" w:color="auto" w:sz="4"/>
-          <w:insideV w:val="single" w:color="auto" w:sz="4"/>
-        </w:tblBorders>
-      </w:tblPr>
-      <w:tblGrid>
-        <w:gridCol w:w="2900"/>
-        <w:gridCol w:w="1700"/>
-        <w:gridCol w:w="1700"/>
-        <w:gridCol w:w="1700"/>
-        <w:gridCol w:w="1638"/>
-      </w:tblGrid>
-      <w:tr>
-        <w:trPr>
-          <w:cantSplit/>
-          <w:tblHeader/>
-        </w:trPr>
-        <w:tc>
-          <w:tcPr>
-            <w:tcW w:type="dxa" w:w="2900"/>
-            <w:tcBorders>
-              <w:top w:val="single" w:color="A0A7B0" w:sz="4"/>
-              <w:left w:val="single" w:color="A0A7B0" w:sz="4"/>
-              <w:bottom w:val="single" w:color="A0A7B0" w:sz="4"/>
-              <w:right w:val="single" w:color="A0A7B0" w:sz="4"/>
-            </w:tcBorders>
-            <w:shd w:fill="E8EEF4" w:val="clear"/>
-            <w:tcMar>
-              <w:top w:type="dxa" w:w="50"/>
-              <w:left w:type="dxa" w:w="80"/>
-              <w:bottom w:type="dxa" w:w="50"/>
-              <w:right w:type="dxa" w:w="80"/>
-            </w:tcMar>
-            <w:vAlign w:val="center"/>
-          </w:tcPr>
-          <w:p>
-            <w:pPr>
-              <w:spacing w:after="0" w:line="260"/>
-              <w:jc w:val="center"/>
-            </w:pPr>
-            <w:r>
-              <w:rPr>
-                <w:rFonts w:ascii="Times New Roman" w:cs="Times New Roman" w:eastAsia="Times New Roman" w:hAnsi="Times New Roman"/>
-                <w:b/>
-                <w:bCs/>
-                <w:sz w:val="18"/>
-                <w:szCs w:val="18"/>
-              </w:rPr>
-              <w:t xml:space="preserve">Query</w:t>
-            </w:r>
-          </w:p>
-        </w:tc>
-        <w:tc>
-          <w:tcPr>
-            <w:tcW w:type="dxa" w:w="1700"/>
-            <w:tcBorders>
-              <w:top w:val="single" w:color="A0A7B0" w:sz="4"/>
-              <w:left w:val="single" w:color="A0A7B0" w:sz="4"/>
-              <w:bottom w:val="single" w:color="A0A7B0" w:sz="4"/>
-              <w:right w:val="single" w:color="A0A7B0" w:sz="4"/>
-            </w:tcBorders>
-            <w:shd w:fill="E8EEF4" w:val="clear"/>
-            <w:tcMar>
-              <w:top w:type="dxa" w:w="50"/>
-              <w:left w:type="dxa" w:w="80"/>
-              <w:bottom w:type="dxa" w:w="50"/>
-              <w:right w:type="dxa" w:w="80"/>
-            </w:tcMar>
-            <w:vAlign w:val="center"/>
-          </w:tcPr>
-          <w:p>
-            <w:pPr>
-              <w:spacing w:after="0" w:line="260"/>
-              <w:jc w:val="center"/>
-            </w:pPr>
-            <w:r>
-              <w:rPr>
-                <w:rFonts w:ascii="Times New Roman" w:cs="Times New Roman" w:eastAsia="Times New Roman" w:hAnsi="Times New Roman"/>
-                <w:b/>
-                <w:bCs/>
-                <w:sz w:val="18"/>
-                <w:szCs w:val="18"/>
-              </w:rPr>
-              <w:t xml:space="preserve">Plan without → with</w:t>
-            </w:r>
-          </w:p>
-        </w:tc>
-        <w:tc>
-          <w:tcPr>
-            <w:tcW w:type="dxa" w:w="1700"/>
-            <w:tcBorders>
-              <w:top w:val="single" w:color="A0A7B0" w:sz="4"/>
-              <w:left w:val="single" w:color="A0A7B0" w:sz="4"/>
-              <w:bottom w:val="single" w:color="A0A7B0" w:sz="4"/>
-              <w:right w:val="single" w:color="A0A7B0" w:sz="4"/>
-            </w:tcBorders>
-            <w:shd w:fill="E8EEF4" w:val="clear"/>
-            <w:tcMar>
-              <w:top w:type="dxa" w:w="50"/>
-              <w:left w:type="dxa" w:w="80"/>
-              <w:bottom w:type="dxa" w:w="50"/>
-              <w:right w:type="dxa" w:w="80"/>
-            </w:tcMar>
-            <w:vAlign w:val="center"/>
-          </w:tcPr>
-          <w:p>
-            <w:pPr>
-              <w:spacing w:after="0" w:line="260"/>
-              <w:jc w:val="center"/>
-            </w:pPr>
-            <w:r>
-              <w:rPr>
-                <w:rFonts w:ascii="Times New Roman" w:cs="Times New Roman" w:eastAsia="Times New Roman" w:hAnsi="Times New Roman"/>
-                <w:b/>
-                <w:bCs/>
-                <w:sz w:val="18"/>
-                <w:szCs w:val="18"/>
-              </w:rPr>
-              <w:t xml:space="preserve">Docs examined</w:t>
-            </w:r>
-          </w:p>
-        </w:tc>
-        <w:tc>
-          <w:tcPr>
-            <w:tcW w:type="dxa" w:w="1700"/>
-            <w:tcBorders>
-              <w:top w:val="single" w:color="A0A7B0" w:sz="4"/>
-              <w:left w:val="single" w:color="A0A7B0" w:sz="4"/>
-              <w:bottom w:val="single" w:color="A0A7B0" w:sz="4"/>
-              <w:right w:val="single" w:color="A0A7B0" w:sz="4"/>
-            </w:tcBorders>
-            <w:shd w:fill="E8EEF4" w:val="clear"/>
-            <w:tcMar>
-              <w:top w:type="dxa" w:w="50"/>
-              <w:left w:type="dxa" w:w="80"/>
-              <w:bottom w:type="dxa" w:w="50"/>
-              <w:right w:type="dxa" w:w="80"/>
-            </w:tcMar>
-            <w:vAlign w:val="center"/>
-          </w:tcPr>
-          <w:p>
-            <w:pPr>
-              <w:spacing w:after="0" w:line="260"/>
-              <w:jc w:val="center"/>
-            </w:pPr>
-            <w:r>
-              <w:rPr>
-                <w:rFonts w:ascii="Times New Roman" w:cs="Times New Roman" w:eastAsia="Times New Roman" w:hAnsi="Times New Roman"/>
-                <w:b/>
-                <w:bCs/>
-                <w:sz w:val="18"/>
-                <w:szCs w:val="18"/>
-              </w:rPr>
-              <w:t xml:space="preserve">Median latency</w:t>
-            </w:r>
-          </w:p>
-        </w:tc>
-        <w:tc>
-          <w:tcPr>
-            <w:tcW w:type="dxa" w:w="1638"/>
-            <w:tcBorders>
-              <w:top w:val="single" w:color="A0A7B0" w:sz="4"/>
-              <w:left w:val="single" w:color="A0A7B0" w:sz="4"/>
-              <w:bottom w:val="single" w:color="A0A7B0" w:sz="4"/>
-              <w:right w:val="single" w:color="A0A7B0" w:sz="4"/>
-            </w:tcBorders>
-            <w:shd w:fill="E8EEF4" w:val="clear"/>
-            <w:tcMar>
-              <w:top w:type="dxa" w:w="50"/>
-              <w:left w:type="dxa" w:w="80"/>
-              <w:bottom w:type="dxa" w:w="50"/>
-              <w:right w:type="dxa" w:w="80"/>
-            </w:tcMar>
-            <w:vAlign w:val="center"/>
-          </w:tcPr>
-          <w:p>
-            <w:pPr>
-              <w:spacing w:after="0" w:line="260"/>
-              <w:jc w:val="center"/>
-            </w:pPr>
-            <w:r>
-              <w:rPr>
-                <w:rFonts w:ascii="Times New Roman" w:cs="Times New Roman" w:eastAsia="Times New Roman" w:hAnsi="Times New Roman"/>
-                <w:b/>
-                <w:bCs/>
-                <w:sz w:val="18"/>
-                <w:szCs w:val="18"/>
-              </w:rPr>
-              <w:t xml:space="preserve">Speed-up</w:t>
-            </w:r>
-          </w:p>
-        </w:tc>
-      </w:tr>
-      <w:tr>
-        <w:trPr>
-          <w:cantSplit/>
-          <w:tblHeader w:val="false"/>
-        </w:trPr>
-        <w:tc>
-          <w:tcPr>
-            <w:tcW w:type="dxa" w:w="2900"/>
-            <w:tcBorders>
-              <w:top w:val="single" w:color="A0A7B0" w:sz="4"/>
-              <w:left w:val="single" w:color="A0A7B0" w:sz="4"/>
-              <w:bottom w:val="single" w:color="A0A7B0" w:sz="4"/>
-              <w:right w:val="single" w:color="A0A7B0" w:sz="4"/>
-            </w:tcBorders>
-            <w:shd w:fill="FFFFFF" w:val="clear"/>
-            <w:tcMar>
-              <w:top w:type="dxa" w:w="50"/>
-              <w:left w:type="dxa" w:w="80"/>
-              <w:bottom w:type="dxa" w:w="50"/>
-              <w:right w:type="dxa" w:w="80"/>
-            </w:tcMar>
-            <w:vAlign w:val="center"/>
-          </w:tcPr>
-          <w:p>
-            <w:pPr>
-              <w:spacing w:after="0" w:line="260"/>
-              <w:jc w:val="left"/>
-            </w:pPr>
-            <w:r>
-              <w:rPr>
-                <w:rFonts w:ascii="Times New Roman" w:cs="Times New Roman" w:eastAsia="Times New Roman" w:hAnsi="Times New Roman"/>
-                <w:b w:val="false"/>
-                <w:bCs w:val="false"/>
-                <w:sz w:val="18"/>
-                <w:szCs w:val="18"/>
-              </w:rPr>
-              <w:t xml:space="preserve">reports by actor (limit 100)</w:t>
-            </w:r>
-          </w:p>
-        </w:tc>
-        <w:tc>
-          <w:tcPr>
-            <w:tcW w:type="dxa" w:w="1700"/>
-            <w:tcBorders>
-              <w:top w:val="single" w:color="A0A7B0" w:sz="4"/>
-              <w:left w:val="single" w:color="A0A7B0" w:sz="4"/>
-              <w:bottom w:val="single" w:color="A0A7B0" w:sz="4"/>
-              <w:right w:val="single" w:color="A0A7B0" w:sz="4"/>
-            </w:tcBorders>
-            <w:shd w:fill="FFFFFF" w:val="clear"/>
-            <w:tcMar>
-              <w:top w:type="dxa" w:w="50"/>
-              <w:left w:type="dxa" w:w="80"/>
-              <w:bottom w:type="dxa" w:w="50"/>
-              <w:right w:type="dxa" w:w="80"/>
-            </w:tcMar>
-            <w:vAlign w:val="center"/>
-          </w:tcPr>
-          <w:p>
-            <w:pPr>
-              <w:spacing w:after="0" w:line="260"/>
-              <w:jc w:val="left"/>
-            </w:pPr>
-            <w:r>
-              <w:rPr>
-                <w:rFonts w:ascii="Times New Roman" w:cs="Times New Roman" w:eastAsia="Times New Roman" w:hAnsi="Times New Roman"/>
-                <w:b w:val="false"/>
-                <w:bCs w:val="false"/>
-                <w:sz w:val="18"/>
-                <w:szCs w:val="18"/>
-              </w:rPr>
-              <w:t xml:space="preserve">COLLSCAN → IXSCAN</w:t>
-            </w:r>
-          </w:p>
-        </w:tc>
-        <w:tc>
-          <w:tcPr>
-            <w:tcW w:type="dxa" w:w="1700"/>
-            <w:tcBorders>
-              <w:top w:val="single" w:color="A0A7B0" w:sz="4"/>
-              <w:left w:val="single" w:color="A0A7B0" w:sz="4"/>
-              <w:bottom w:val="single" w:color="A0A7B0" w:sz="4"/>
-              <w:right w:val="single" w:color="A0A7B0" w:sz="4"/>
-            </w:tcBorders>
-            <w:shd w:fill="FFFFFF" w:val="clear"/>
-            <w:tcMar>
-              <w:top w:type="dxa" w:w="50"/>
-              <w:left w:type="dxa" w:w="80"/>
-              <w:bottom w:type="dxa" w:w="50"/>
-              <w:right w:type="dxa" w:w="80"/>
-            </w:tcMar>
-            <w:vAlign w:val="center"/>
-          </w:tcPr>
-          <w:p>
-            <w:pPr>
-              <w:spacing w:after="0" w:line="260"/>
-              <w:jc w:val="center"/>
-            </w:pPr>
-            <w:r>
-              <w:rPr>
-                <w:rFonts w:ascii="Times New Roman" w:cs="Times New Roman" w:eastAsia="Times New Roman" w:hAnsi="Times New Roman"/>
-                <w:b w:val="false"/>
-                <w:bCs w:val="false"/>
-                <w:sz w:val="18"/>
-                <w:szCs w:val="18"/>
-              </w:rPr>
-              <w:t xml:space="preserve">37,181 → 100</w:t>
-            </w:r>
-          </w:p>
-        </w:tc>
-        <w:tc>
-          <w:tcPr>
-            <w:tcW w:type="dxa" w:w="1700"/>
-            <w:tcBorders>
-              <w:top w:val="single" w:color="A0A7B0" w:sz="4"/>
-              <w:left w:val="single" w:color="A0A7B0" w:sz="4"/>
-              <w:bottom w:val="single" w:color="A0A7B0" w:sz="4"/>
-              <w:right w:val="single" w:color="A0A7B0" w:sz="4"/>
-            </w:tcBorders>
-            <w:shd w:fill="FFFFFF" w:val="clear"/>
-            <w:tcMar>
-              <w:top w:type="dxa" w:w="50"/>
-              <w:left w:type="dxa" w:w="80"/>
-              <w:bottom w:type="dxa" w:w="50"/>
-              <w:right w:type="dxa" w:w="80"/>
-            </w:tcMar>
-            <w:vAlign w:val="center"/>
-          </w:tcPr>
-          <w:p>
-            <w:pPr>
-              <w:spacing w:after="0" w:line="260"/>
-              <w:jc w:val="center"/>
-            </w:pPr>
-            <w:r>
-              <w:rPr>
-                <w:rFonts w:ascii="Times New Roman" w:cs="Times New Roman" w:eastAsia="Times New Roman" w:hAnsi="Times New Roman"/>
-                <w:b w:val="false"/>
-                <w:bCs w:val="false"/>
-                <w:sz w:val="18"/>
-                <w:szCs w:val="18"/>
-              </w:rPr>
-              <w:t xml:space="preserve">9.96 ms → 0.77 ms</w:t>
-            </w:r>
-          </w:p>
-        </w:tc>
-        <w:tc>
-          <w:tcPr>
-            <w:tcW w:type="dxa" w:w="1638"/>
-            <w:tcBorders>
-              <w:top w:val="single" w:color="A0A7B0" w:sz="4"/>
-              <w:left w:val="single" w:color="A0A7B0" w:sz="4"/>
-              <w:bottom w:val="single" w:color="A0A7B0" w:sz="4"/>
-              <w:right w:val="single" w:color="A0A7B0" w:sz="4"/>
-            </w:tcBorders>
-            <w:shd w:fill="FFFFFF" w:val="clear"/>
-            <w:tcMar>
-              <w:top w:type="dxa" w:w="50"/>
-              <w:left w:type="dxa" w:w="80"/>
-              <w:bottom w:type="dxa" w:w="50"/>
-              <w:right w:type="dxa" w:w="80"/>
-            </w:tcMar>
-            <w:vAlign w:val="center"/>
-          </w:tcPr>
-          <w:p>
-            <w:pPr>
-              <w:spacing w:after="0" w:line="260"/>
-              <w:jc w:val="center"/>
-            </w:pPr>
-            <w:r>
-              <w:rPr>
-                <w:rFonts w:ascii="Times New Roman" w:cs="Times New Roman" w:eastAsia="Times New Roman" w:hAnsi="Times New Roman"/>
-                <w:b w:val="false"/>
-                <w:bCs w:val="false"/>
-                <w:sz w:val="18"/>
-                <w:szCs w:val="18"/>
-              </w:rPr>
-              <w:t xml:space="preserve">13×</w:t>
-            </w:r>
-          </w:p>
-        </w:tc>
-      </w:tr>
-      <w:tr>
-        <w:trPr>
-          <w:cantSplit/>
-          <w:tblHeader w:val="false"/>
-        </w:trPr>
-        <w:tc>
-          <w:tcPr>
-            <w:tcW w:type="dxa" w:w="2900"/>
-            <w:tcBorders>
-              <w:top w:val="single" w:color="A0A7B0" w:sz="4"/>
-              <w:left w:val="single" w:color="A0A7B0" w:sz="4"/>
-              <w:bottom w:val="single" w:color="A0A7B0" w:sz="4"/>
-              <w:right w:val="single" w:color="A0A7B0" w:sz="4"/>
-            </w:tcBorders>
-            <w:shd w:fill="F7F5F1" w:val="clear"/>
-            <w:tcMar>
-              <w:top w:type="dxa" w:w="50"/>
-              <w:left w:type="dxa" w:w="80"/>
-              <w:bottom w:type="dxa" w:w="50"/>
-              <w:right w:type="dxa" w:w="80"/>
-            </w:tcMar>
-            <w:vAlign w:val="center"/>
-          </w:tcPr>
-          <w:p>
-            <w:pPr>
-              <w:spacing w:after="0" w:line="260"/>
-              <w:jc w:val="left"/>
-            </w:pPr>
-            <w:r>
-              <w:rPr>
-                <w:rFonts w:ascii="Times New Roman" w:cs="Times New Roman" w:eastAsia="Times New Roman" w:hAnsi="Times New Roman"/>
-                <w:b w:val="false"/>
-                <w:bCs w:val="false"/>
-                <w:sz w:val="18"/>
-                <w:szCs w:val="18"/>
-              </w:rPr>
-              <w:t xml:space="preserve">reports citing an IOC</w:t>
-            </w:r>
-          </w:p>
-        </w:tc>
-        <w:tc>
-          <w:tcPr>
-            <w:tcW w:type="dxa" w:w="1700"/>
-            <w:tcBorders>
-              <w:top w:val="single" w:color="A0A7B0" w:sz="4"/>
-              <w:left w:val="single" w:color="A0A7B0" w:sz="4"/>
-              <w:bottom w:val="single" w:color="A0A7B0" w:sz="4"/>
-              <w:right w:val="single" w:color="A0A7B0" w:sz="4"/>
-            </w:tcBorders>
-            <w:shd w:fill="F7F5F1" w:val="clear"/>
-            <w:tcMar>
-              <w:top w:type="dxa" w:w="50"/>
-              <w:left w:type="dxa" w:w="80"/>
-              <w:bottom w:type="dxa" w:w="50"/>
-              <w:right w:type="dxa" w:w="80"/>
-            </w:tcMar>
-            <w:vAlign w:val="center"/>
-          </w:tcPr>
-          <w:p>
-            <w:pPr>
-              <w:spacing w:after="0" w:line="260"/>
-              <w:jc w:val="left"/>
-            </w:pPr>
-            <w:r>
-              <w:rPr>
-                <w:rFonts w:ascii="Times New Roman" w:cs="Times New Roman" w:eastAsia="Times New Roman" w:hAnsi="Times New Roman"/>
-                <w:b w:val="false"/>
-                <w:bCs w:val="false"/>
-                <w:sz w:val="18"/>
-                <w:szCs w:val="18"/>
-              </w:rPr>
-              <w:t xml:space="preserve">COLLSCAN → IXSCAN</w:t>
-            </w:r>
-          </w:p>
-        </w:tc>
-        <w:tc>
-          <w:tcPr>
-            <w:tcW w:type="dxa" w:w="1700"/>
-            <w:tcBorders>
-              <w:top w:val="single" w:color="A0A7B0" w:sz="4"/>
-              <w:left w:val="single" w:color="A0A7B0" w:sz="4"/>
-              <w:bottom w:val="single" w:color="A0A7B0" w:sz="4"/>
-              <w:right w:val="single" w:color="A0A7B0" w:sz="4"/>
-            </w:tcBorders>
-            <w:shd w:fill="F7F5F1" w:val="clear"/>
-            <w:tcMar>
-              <w:top w:type="dxa" w:w="50"/>
-              <w:left w:type="dxa" w:w="80"/>
-              <w:bottom w:type="dxa" w:w="50"/>
-              <w:right w:type="dxa" w:w="80"/>
-            </w:tcMar>
-            <w:vAlign w:val="center"/>
-          </w:tcPr>
-          <w:p>
-            <w:pPr>
-              <w:spacing w:after="0" w:line="260"/>
-              <w:jc w:val="center"/>
-            </w:pPr>
-            <w:r>
-              <w:rPr>
-                <w:rFonts w:ascii="Times New Roman" w:cs="Times New Roman" w:eastAsia="Times New Roman" w:hAnsi="Times New Roman"/>
-                <w:b w:val="false"/>
-                <w:bCs w:val="false"/>
-                <w:sz w:val="18"/>
-                <w:szCs w:val="18"/>
-              </w:rPr>
-              <w:t xml:space="preserve">200,000 → 3</w:t>
-            </w:r>
-          </w:p>
-        </w:tc>
-        <w:tc>
-          <w:tcPr>
-            <w:tcW w:type="dxa" w:w="1700"/>
-            <w:tcBorders>
-              <w:top w:val="single" w:color="A0A7B0" w:sz="4"/>
-              <w:left w:val="single" w:color="A0A7B0" w:sz="4"/>
-              <w:bottom w:val="single" w:color="A0A7B0" w:sz="4"/>
-              <w:right w:val="single" w:color="A0A7B0" w:sz="4"/>
-            </w:tcBorders>
-            <w:shd w:fill="F7F5F1" w:val="clear"/>
-            <w:tcMar>
-              <w:top w:type="dxa" w:w="50"/>
-              <w:left w:type="dxa" w:w="80"/>
-              <w:bottom w:type="dxa" w:w="50"/>
-              <w:right w:type="dxa" w:w="80"/>
-            </w:tcMar>
-            <w:vAlign w:val="center"/>
-          </w:tcPr>
-          <w:p>
-            <w:pPr>
-              <w:spacing w:after="0" w:line="260"/>
-              <w:jc w:val="center"/>
-            </w:pPr>
-            <w:r>
-              <w:rPr>
-                <w:rFonts w:ascii="Times New Roman" w:cs="Times New Roman" w:eastAsia="Times New Roman" w:hAnsi="Times New Roman"/>
-                <w:b w:val="false"/>
-                <w:bCs w:val="false"/>
-                <w:sz w:val="18"/>
-                <w:szCs w:val="18"/>
-              </w:rPr>
-              <w:t xml:space="preserve">54.7 ms → 0.53 ms</w:t>
-            </w:r>
-          </w:p>
-        </w:tc>
-        <w:tc>
-          <w:tcPr>
-            <w:tcW w:type="dxa" w:w="1638"/>
-            <w:tcBorders>
-              <w:top w:val="single" w:color="A0A7B0" w:sz="4"/>
-              <w:left w:val="single" w:color="A0A7B0" w:sz="4"/>
-              <w:bottom w:val="single" w:color="A0A7B0" w:sz="4"/>
-              <w:right w:val="single" w:color="A0A7B0" w:sz="4"/>
-            </w:tcBorders>
-            <w:shd w:fill="F7F5F1" w:val="clear"/>
-            <w:tcMar>
-              <w:top w:type="dxa" w:w="50"/>
-              <w:left w:type="dxa" w:w="80"/>
-              <w:bottom w:type="dxa" w:w="50"/>
-              <w:right w:type="dxa" w:w="80"/>
-            </w:tcMar>
-            <w:vAlign w:val="center"/>
-          </w:tcPr>
-          <w:p>
-            <w:pPr>
-              <w:spacing w:after="0" w:line="260"/>
-              <w:jc w:val="center"/>
-            </w:pPr>
-            <w:r>
-              <w:rPr>
-                <w:rFonts w:ascii="Times New Roman" w:cs="Times New Roman" w:eastAsia="Times New Roman" w:hAnsi="Times New Roman"/>
-                <w:b w:val="false"/>
-                <w:bCs w:val="false"/>
-                <w:sz w:val="18"/>
-                <w:szCs w:val="18"/>
-              </w:rPr>
-              <w:t xml:space="preserve">103×</w:t>
-            </w:r>
-          </w:p>
-        </w:tc>
-      </w:tr>
-      <w:tr>
-        <w:trPr>
-          <w:cantSplit/>
-          <w:tblHeader w:val="false"/>
-        </w:trPr>
-        <w:tc>
-          <w:tcPr>
-            <w:tcW w:type="dxa" w:w="2900"/>
-            <w:tcBorders>
-              <w:top w:val="single" w:color="A0A7B0" w:sz="4"/>
-              <w:left w:val="single" w:color="A0A7B0" w:sz="4"/>
-              <w:bottom w:val="single" w:color="A0A7B0" w:sz="4"/>
-              <w:right w:val="single" w:color="A0A7B0" w:sz="4"/>
-            </w:tcBorders>
-            <w:shd w:fill="FFFFFF" w:val="clear"/>
-            <w:tcMar>
-              <w:top w:type="dxa" w:w="50"/>
-              <w:left w:type="dxa" w:w="80"/>
-              <w:bottom w:type="dxa" w:w="50"/>
-              <w:right w:type="dxa" w:w="80"/>
-            </w:tcMar>
-            <w:vAlign w:val="center"/>
-          </w:tcPr>
-          <w:p>
-            <w:pPr>
-              <w:spacing w:after="0" w:line="260"/>
-              <w:jc w:val="left"/>
-            </w:pPr>
-            <w:r>
-              <w:rPr>
-                <w:rFonts w:ascii="Times New Roman" w:cs="Times New Roman" w:eastAsia="Times New Roman" w:hAnsi="Times New Roman"/>
-                <w:b w:val="false"/>
-                <w:bCs w:val="false"/>
-                <w:sz w:val="18"/>
-                <w:szCs w:val="18"/>
-              </w:rPr>
-              <w:t xml:space="preserve">50 newest at TLP ≤ GREEN</w:t>
-            </w:r>
-          </w:p>
-        </w:tc>
-        <w:tc>
-          <w:tcPr>
-            <w:tcW w:type="dxa" w:w="1700"/>
-            <w:tcBorders>
-              <w:top w:val="single" w:color="A0A7B0" w:sz="4"/>
-              <w:left w:val="single" w:color="A0A7B0" w:sz="4"/>
-              <w:bottom w:val="single" w:color="A0A7B0" w:sz="4"/>
-              <w:right w:val="single" w:color="A0A7B0" w:sz="4"/>
-            </w:tcBorders>
-            <w:shd w:fill="FFFFFF" w:val="clear"/>
-            <w:tcMar>
-              <w:top w:type="dxa" w:w="50"/>
-              <w:left w:type="dxa" w:w="80"/>
-              <w:bottom w:type="dxa" w:w="50"/>
-              <w:right w:type="dxa" w:w="80"/>
-            </w:tcMar>
-            <w:vAlign w:val="center"/>
-          </w:tcPr>
-          <w:p>
-            <w:pPr>
-              <w:spacing w:after="0" w:line="260"/>
-              <w:jc w:val="left"/>
-            </w:pPr>
-            <w:r>
-              <w:rPr>
-                <w:rFonts w:ascii="Times New Roman" w:cs="Times New Roman" w:eastAsia="Times New Roman" w:hAnsi="Times New Roman"/>
-                <w:b w:val="false"/>
-                <w:bCs w:val="false"/>
-                <w:sz w:val="18"/>
-                <w:szCs w:val="18"/>
-              </w:rPr>
-              <w:t xml:space="preserve">COLLSCAN → IXSCAN</w:t>
-            </w:r>
-          </w:p>
-        </w:tc>
-        <w:tc>
-          <w:tcPr>
-            <w:tcW w:type="dxa" w:w="1700"/>
-            <w:tcBorders>
-              <w:top w:val="single" w:color="A0A7B0" w:sz="4"/>
-              <w:left w:val="single" w:color="A0A7B0" w:sz="4"/>
-              <w:bottom w:val="single" w:color="A0A7B0" w:sz="4"/>
-              <w:right w:val="single" w:color="A0A7B0" w:sz="4"/>
-            </w:tcBorders>
-            <w:shd w:fill="FFFFFF" w:val="clear"/>
-            <w:tcMar>
-              <w:top w:type="dxa" w:w="50"/>
-              <w:left w:type="dxa" w:w="80"/>
-              <w:bottom w:type="dxa" w:w="50"/>
-              <w:right w:type="dxa" w:w="80"/>
-            </w:tcMar>
-            <w:vAlign w:val="center"/>
-          </w:tcPr>
-          <w:p>
-            <w:pPr>
-              <w:spacing w:after="0" w:line="260"/>
-              <w:jc w:val="center"/>
-            </w:pPr>
-            <w:r>
-              <w:rPr>
-                <w:rFonts w:ascii="Times New Roman" w:cs="Times New Roman" w:eastAsia="Times New Roman" w:hAnsi="Times New Roman"/>
-                <w:b w:val="false"/>
-                <w:bCs w:val="false"/>
-                <w:sz w:val="18"/>
-                <w:szCs w:val="18"/>
-              </w:rPr>
-              <w:t xml:space="preserve">200,000 → 69</w:t>
-            </w:r>
-          </w:p>
-        </w:tc>
-        <w:tc>
-          <w:tcPr>
-            <w:tcW w:type="dxa" w:w="1700"/>
-            <w:tcBorders>
-              <w:top w:val="single" w:color="A0A7B0" w:sz="4"/>
-              <w:left w:val="single" w:color="A0A7B0" w:sz="4"/>
-              <w:bottom w:val="single" w:color="A0A7B0" w:sz="4"/>
-              <w:right w:val="single" w:color="A0A7B0" w:sz="4"/>
-            </w:tcBorders>
-            <w:shd w:fill="FFFFFF" w:val="clear"/>
-            <w:tcMar>
-              <w:top w:type="dxa" w:w="50"/>
-              <w:left w:type="dxa" w:w="80"/>
-              <w:bottom w:type="dxa" w:w="50"/>
-              <w:right w:type="dxa" w:w="80"/>
-            </w:tcMar>
-            <w:vAlign w:val="center"/>
-          </w:tcPr>
-          <w:p>
-            <w:pPr>
-              <w:spacing w:after="0" w:line="260"/>
-              <w:jc w:val="center"/>
-            </w:pPr>
-            <w:r>
-              <w:rPr>
-                <w:rFonts w:ascii="Times New Roman" w:cs="Times New Roman" w:eastAsia="Times New Roman" w:hAnsi="Times New Roman"/>
-                <w:b w:val="false"/>
-                <w:bCs w:val="false"/>
-                <w:sz w:val="18"/>
-                <w:szCs w:val="18"/>
-              </w:rPr>
-              <w:t xml:space="preserve">49.9 ms → 0.53 ms</w:t>
-            </w:r>
-          </w:p>
-        </w:tc>
-        <w:tc>
-          <w:tcPr>
-            <w:tcW w:type="dxa" w:w="1638"/>
-            <w:tcBorders>
-              <w:top w:val="single" w:color="A0A7B0" w:sz="4"/>
-              <w:left w:val="single" w:color="A0A7B0" w:sz="4"/>
-              <w:bottom w:val="single" w:color="A0A7B0" w:sz="4"/>
-              <w:right w:val="single" w:color="A0A7B0" w:sz="4"/>
-            </w:tcBorders>
-            <w:shd w:fill="FFFFFF" w:val="clear"/>
-            <w:tcMar>
-              <w:top w:type="dxa" w:w="50"/>
-              <w:left w:type="dxa" w:w="80"/>
-              <w:bottom w:type="dxa" w:w="50"/>
-              <w:right w:type="dxa" w:w="80"/>
-            </w:tcMar>
-            <w:vAlign w:val="center"/>
-          </w:tcPr>
-          <w:p>
-            <w:pPr>
-              <w:spacing w:after="0" w:line="260"/>
-              <w:jc w:val="center"/>
-            </w:pPr>
-            <w:r>
-              <w:rPr>
-                <w:rFonts w:ascii="Times New Roman" w:cs="Times New Roman" w:eastAsia="Times New Roman" w:hAnsi="Times New Roman"/>
-                <w:b w:val="false"/>
-                <w:bCs w:val="false"/>
-                <w:sz w:val="18"/>
-                <w:szCs w:val="18"/>
-              </w:rPr>
-              <w:t xml:space="preserve">94×</w:t>
-            </w:r>
-          </w:p>
-        </w:tc>
-      </w:tr>
-      <w:tr>
-        <w:trPr>
-          <w:cantSplit/>
-          <w:tblHeader w:val="false"/>
-        </w:trPr>
-        <w:tc>
-          <w:tcPr>
-            <w:tcW w:type="dxa" w:w="2900"/>
-            <w:tcBorders>
-              <w:top w:val="single" w:color="A0A7B0" w:sz="4"/>
-              <w:left w:val="single" w:color="A0A7B0" w:sz="4"/>
-              <w:bottom w:val="single" w:color="A0A7B0" w:sz="4"/>
-              <w:right w:val="single" w:color="A0A7B0" w:sz="4"/>
-            </w:tcBorders>
-            <w:shd w:fill="F7F5F1" w:val="clear"/>
-            <w:tcMar>
-              <w:top w:type="dxa" w:w="50"/>
-              <w:left w:type="dxa" w:w="80"/>
-              <w:bottom w:type="dxa" w:w="50"/>
-              <w:right w:type="dxa" w:w="80"/>
-            </w:tcMar>
-            <w:vAlign w:val="center"/>
-          </w:tcPr>
-          <w:p>
-            <w:pPr>
-              <w:spacing w:after="0" w:line="260"/>
-              <w:jc w:val="left"/>
-            </w:pPr>
-            <w:r>
-              <w:rPr>
-                <w:rFonts w:ascii="Times New Roman" w:cs="Times New Roman" w:eastAsia="Times New Roman" w:hAnsi="Times New Roman"/>
-                <w:b w:val="false"/>
-                <w:bCs w:val="false"/>
-                <w:sz w:val="18"/>
-                <w:szCs w:val="18"/>
-              </w:rPr>
-              <w:t xml:space="preserve">Neo4j host by value</w:t>
-            </w:r>
-          </w:p>
-        </w:tc>
-        <w:tc>
-          <w:tcPr>
-            <w:tcW w:type="dxa" w:w="1700"/>
-            <w:tcBorders>
-              <w:top w:val="single" w:color="A0A7B0" w:sz="4"/>
-              <w:left w:val="single" w:color="A0A7B0" w:sz="4"/>
-              <w:bottom w:val="single" w:color="A0A7B0" w:sz="4"/>
-              <w:right w:val="single" w:color="A0A7B0" w:sz="4"/>
-            </w:tcBorders>
-            <w:shd w:fill="F7F5F1" w:val="clear"/>
-            <w:tcMar>
-              <w:top w:type="dxa" w:w="50"/>
-              <w:left w:type="dxa" w:w="80"/>
-              <w:bottom w:type="dxa" w:w="50"/>
-              <w:right w:type="dxa" w:w="80"/>
-            </w:tcMar>
-            <w:vAlign w:val="center"/>
-          </w:tcPr>
-          <w:p>
-            <w:pPr>
-              <w:spacing w:after="0" w:line="260"/>
-              <w:jc w:val="left"/>
-            </w:pPr>
-            <w:r>
-              <w:rPr>
-                <w:rFonts w:ascii="Times New Roman" w:cs="Times New Roman" w:eastAsia="Times New Roman" w:hAnsi="Times New Roman"/>
-                <w:b w:val="false"/>
-                <w:bCs w:val="false"/>
-                <w:sz w:val="18"/>
-                <w:szCs w:val="18"/>
-              </w:rPr>
-              <w:t xml:space="preserve">NodeByLabelScan → NodeIndexSeek</w:t>
-            </w:r>
-          </w:p>
-        </w:tc>
-        <w:tc>
-          <w:tcPr>
-            <w:tcW w:type="dxa" w:w="1700"/>
-            <w:tcBorders>
-              <w:top w:val="single" w:color="A0A7B0" w:sz="4"/>
-              <w:left w:val="single" w:color="A0A7B0" w:sz="4"/>
-              <w:bottom w:val="single" w:color="A0A7B0" w:sz="4"/>
-              <w:right w:val="single" w:color="A0A7B0" w:sz="4"/>
-            </w:tcBorders>
-            <w:shd w:fill="F7F5F1" w:val="clear"/>
-            <w:tcMar>
-              <w:top w:type="dxa" w:w="50"/>
-              <w:left w:type="dxa" w:w="80"/>
-              <w:bottom w:type="dxa" w:w="50"/>
-              <w:right w:type="dxa" w:w="80"/>
-            </w:tcMar>
-            <w:vAlign w:val="center"/>
-          </w:tcPr>
-          <w:p>
-            <w:pPr>
-              <w:spacing w:after="0" w:line="260"/>
-              <w:jc w:val="center"/>
-            </w:pPr>
-            <w:r>
-              <w:rPr>
-                <w:rFonts w:ascii="Times New Roman" w:cs="Times New Roman" w:eastAsia="Times New Roman" w:hAnsi="Times New Roman"/>
-                <w:b w:val="false"/>
-                <w:bCs w:val="false"/>
-                <w:sz w:val="18"/>
-                <w:szCs w:val="18"/>
-              </w:rPr>
-              <w:t xml:space="preserve">200,002 → 3 db hits</w:t>
-            </w:r>
-          </w:p>
-        </w:tc>
-        <w:tc>
-          <w:tcPr>
-            <w:tcW w:type="dxa" w:w="1700"/>
-            <w:tcBorders>
-              <w:top w:val="single" w:color="A0A7B0" w:sz="4"/>
-              <w:left w:val="single" w:color="A0A7B0" w:sz="4"/>
-              <w:bottom w:val="single" w:color="A0A7B0" w:sz="4"/>
-              <w:right w:val="single" w:color="A0A7B0" w:sz="4"/>
-            </w:tcBorders>
-            <w:shd w:fill="F7F5F1" w:val="clear"/>
-            <w:tcMar>
-              <w:top w:type="dxa" w:w="50"/>
-              <w:left w:type="dxa" w:w="80"/>
-              <w:bottom w:type="dxa" w:w="50"/>
-              <w:right w:type="dxa" w:w="80"/>
-            </w:tcMar>
-            <w:vAlign w:val="center"/>
-          </w:tcPr>
-          <w:p>
-            <w:pPr>
-              <w:spacing w:after="0" w:line="260"/>
-              <w:jc w:val="center"/>
-            </w:pPr>
-            <w:r>
-              <w:rPr>
-                <w:rFonts w:ascii="Times New Roman" w:cs="Times New Roman" w:eastAsia="Times New Roman" w:hAnsi="Times New Roman"/>
-                <w:b w:val="false"/>
-                <w:bCs w:val="false"/>
-                <w:sz w:val="18"/>
-                <w:szCs w:val="18"/>
-              </w:rPr>
-              <w:t xml:space="preserve">18.6 ms → 0.66 ms</w:t>
-            </w:r>
-          </w:p>
-        </w:tc>
-        <w:tc>
-          <w:tcPr>
-            <w:tcW w:type="dxa" w:w="1638"/>
-            <w:tcBorders>
-              <w:top w:val="single" w:color="A0A7B0" w:sz="4"/>
-              <w:left w:val="single" w:color="A0A7B0" w:sz="4"/>
-              <w:bottom w:val="single" w:color="A0A7B0" w:sz="4"/>
-              <w:right w:val="single" w:color="A0A7B0" w:sz="4"/>
-            </w:tcBorders>
-            <w:shd w:fill="F7F5F1" w:val="clear"/>
-            <w:tcMar>
-              <w:top w:type="dxa" w:w="50"/>
-              <w:left w:type="dxa" w:w="80"/>
-              <w:bottom w:type="dxa" w:w="50"/>
-              <w:right w:type="dxa" w:w="80"/>
-            </w:tcMar>
-            <w:vAlign w:val="center"/>
-          </w:tcPr>
-          <w:p>
-            <w:pPr>
-              <w:spacing w:after="0" w:line="260"/>
-              <w:jc w:val="center"/>
-            </w:pPr>
-            <w:r>
-              <w:rPr>
-                <w:rFonts w:ascii="Times New Roman" w:cs="Times New Roman" w:eastAsia="Times New Roman" w:hAnsi="Times New Roman"/>
-                <w:b w:val="false"/>
-                <w:bCs w:val="false"/>
-                <w:sz w:val="18"/>
-                <w:szCs w:val="18"/>
-              </w:rPr>
-              <w:t xml:space="preserve">28×</w:t>
-            </w:r>
-          </w:p>
-        </w:tc>
-      </w:tr>
-    </w:tbl>
-    <w:p>
-      <w:pPr>
-        <w:spacing w:after="240" w:before="60"/>
-        <w:jc w:val="center"/>
-      </w:pPr>
-      <w:r>
-        <w:rPr>
-          <w:rFonts w:ascii="Times New Roman" w:cs="Times New Roman" w:eastAsia="Times New Roman" w:hAnsi="Times New Roman"/>
-          <w:i/>
-          <w:iCs/>
-          <w:sz w:val="20"/>
-          <w:szCs w:val="20"/>
-        </w:rPr>
-        <w:t xml:space="preserve">Table 14.  Index ablation results.</w:t>
-      </w:r>
-    </w:p>
-    <w:p>
-      <w:pPr>
-        <w:spacing w:after="160" w:line="340"/>
-        <w:jc w:val="both"/>
-      </w:pPr>
-      <w:r>
-        <w:rPr>
-          <w:rFonts w:ascii="Times New Roman" w:cs="Times New Roman" w:eastAsia="Times New Roman" w:hAnsi="Times New Roman"/>
-          <w:sz w:val="24"/>
-          <w:szCs w:val="24"/>
-        </w:rPr>
-        <w:t xml:space="preserve">Without secondary indexes MongoDB scans the collection (COLLSCAN) and reads up to every document; the multikey indexes reduce this to the matching documents. The newest-first TLP query reads 69 documents through the date index and 50 with a compound (tlp, date) index — a small further gain we record but do not need at this scale. The production indexes cost 14.0 MB for 44 MB of data and build in 0.95 s. In Neo4j, a label scan touches every node; the range index turns the lookup into a seek with 3 database hits.</w:t>
+        <w:t xml:space="preserve">Figure 10.  Ingest throughput through the full four-store fan-out, before and after the fixes.</w:t>
       </w:r>
     </w:p>
     <w:p>
@@ -16726,7 +15835,53 @@
           <w:sz w:val="26"/>
           <w:szCs w:val="26"/>
         </w:rPr>
-        <w:t xml:space="preserve">9.6  Key–value enforcement plane</w:t>
+        <w:t xml:space="preserve">9.5  Indexing</w:t>
+      </w:r>
+    </w:p>
+    <w:p>
+      <w:pPr>
+        <w:spacing w:after="160" w:line="340"/>
+        <w:jc w:val="both"/>
+      </w:pPr>
+      <w:r>
+        <w:rPr>
+          <w:rFonts w:ascii="Times New Roman" w:cs="Times New Roman" w:eastAsia="Times New Roman" w:hAnsi="Times New Roman"/>
+          <w:sz w:val="24"/>
+          <w:szCs w:val="24"/>
+        </w:rPr>
+        <w:t xml:space="preserve">Each store's indexes were ablated on dedicated data: 200,000 synthetic reports in MongoDB and 100,000 hosts in Neo4j. Figure 11 and Table 14 show latency together with the work the engine reports — documents and keys examined from MongoDB </w:t>
+      </w:r>
+      <w:r>
+        <w:rPr>
+          <w:rFonts w:ascii="Courier New" w:cs="Courier New" w:eastAsia="Courier New" w:hAnsi="Courier New"/>
+          <w:sz w:val="20"/>
+          <w:szCs w:val="20"/>
+        </w:rPr>
+        <w:t xml:space="preserve">explain()</w:t>
+      </w:r>
+      <w:r>
+        <w:rPr>
+          <w:rFonts w:ascii="Times New Roman" w:cs="Times New Roman" w:eastAsia="Times New Roman" w:hAnsi="Times New Roman"/>
+          <w:sz w:val="24"/>
+          <w:szCs w:val="24"/>
+        </w:rPr>
+        <w:t xml:space="preserve">, database hits from Neo4j </w:t>
+      </w:r>
+      <w:r>
+        <w:rPr>
+          <w:rFonts w:ascii="Courier New" w:cs="Courier New" w:eastAsia="Courier New" w:hAnsi="Courier New"/>
+          <w:sz w:val="20"/>
+          <w:szCs w:val="20"/>
+        </w:rPr>
+        <w:t xml:space="preserve">PROFILE</w:t>
+      </w:r>
+      <w:r>
+        <w:rPr>
+          <w:rFonts w:ascii="Times New Roman" w:cs="Times New Roman" w:eastAsia="Times New Roman" w:hAnsi="Times New Roman"/>
+          <w:sz w:val="24"/>
+          <w:szCs w:val="24"/>
+        </w:rPr>
+        <w:t xml:space="preserve">.</w:t>
       </w:r>
     </w:p>
     <w:p>
@@ -16740,7 +15895,7 @@
           <wp:inline distT="0" distB="0" distL="0" distR="0">
             <wp:extent cx="6096000" cy="2314575"/>
             <wp:effectExtent t="0" r="0" b="0" l="0"/>
-            <wp:docPr id="1" name="Redis: blocklist lookup p99 against a full keyspace scan as the number of IOC keys grows to 500,000." descr="Redis: blocklist lookup p99 against a full keyspace scan as the number of IOC keys grows to 500,000." title="Redis: blocklist lookup p99 against a full keyspace scan as the number of IOC keys grows to 500,000."/>
+            <wp:docPr id="1" name="Index ablation: MongoDB report queries and Neo4j property lookup, without and with indexes (median latency)." descr="Index ablation: MongoDB report queries and Neo4j property lookup, without and with indexes (median latency)." title="Index ablation: MongoDB report queries and Neo4j property lookup, without and with indexes (median latency)."/>
             <wp:cNvGraphicFramePr>
               <a:graphicFrameLocks xmlns:a="http://schemas.openxmlformats.org/drawingml/2006/main" noChangeAspect="1"/>
             </wp:cNvGraphicFramePr>
@@ -16789,7 +15944,948 @@
           <w:sz w:val="20"/>
           <w:szCs w:val="20"/>
         </w:rPr>
-        <w:t xml:space="preserve">Figure 11.  Redis: blocklist lookup p99 against a full keyspace scan as the number of IOC keys grows to 500,000.</w:t>
+        <w:t xml:space="preserve">Figure 11.  Index ablation: MongoDB report queries and Neo4j property lookup, without and with indexes (median latency).</w:t>
+      </w:r>
+    </w:p>
+    <w:tbl>
+      <w:tblPr>
+        <w:tblW w:type="dxa" w:w="9638"/>
+        <w:tblBorders>
+          <w:top w:val="single" w:color="auto" w:sz="4"/>
+          <w:left w:val="single" w:color="auto" w:sz="4"/>
+          <w:bottom w:val="single" w:color="auto" w:sz="4"/>
+          <w:right w:val="single" w:color="auto" w:sz="4"/>
+          <w:insideH w:val="single" w:color="auto" w:sz="4"/>
+          <w:insideV w:val="single" w:color="auto" w:sz="4"/>
+        </w:tblBorders>
+      </w:tblPr>
+      <w:tblGrid>
+        <w:gridCol w:w="2900"/>
+        <w:gridCol w:w="1700"/>
+        <w:gridCol w:w="1700"/>
+        <w:gridCol w:w="1700"/>
+        <w:gridCol w:w="1638"/>
+      </w:tblGrid>
+      <w:tr>
+        <w:trPr>
+          <w:cantSplit/>
+          <w:tblHeader/>
+        </w:trPr>
+        <w:tc>
+          <w:tcPr>
+            <w:tcW w:type="dxa" w:w="2900"/>
+            <w:tcBorders>
+              <w:top w:val="single" w:color="A0A7B0" w:sz="4"/>
+              <w:left w:val="single" w:color="A0A7B0" w:sz="4"/>
+              <w:bottom w:val="single" w:color="A0A7B0" w:sz="4"/>
+              <w:right w:val="single" w:color="A0A7B0" w:sz="4"/>
+            </w:tcBorders>
+            <w:shd w:fill="E8EEF4" w:val="clear"/>
+            <w:tcMar>
+              <w:top w:type="dxa" w:w="50"/>
+              <w:left w:type="dxa" w:w="80"/>
+              <w:bottom w:type="dxa" w:w="50"/>
+              <w:right w:type="dxa" w:w="80"/>
+            </w:tcMar>
+            <w:vAlign w:val="center"/>
+          </w:tcPr>
+          <w:p>
+            <w:pPr>
+              <w:spacing w:after="0" w:line="260"/>
+              <w:jc w:val="center"/>
+            </w:pPr>
+            <w:r>
+              <w:rPr>
+                <w:rFonts w:ascii="Times New Roman" w:cs="Times New Roman" w:eastAsia="Times New Roman" w:hAnsi="Times New Roman"/>
+                <w:b/>
+                <w:bCs/>
+                <w:sz w:val="18"/>
+                <w:szCs w:val="18"/>
+              </w:rPr>
+              <w:t xml:space="preserve">Query</w:t>
+            </w:r>
+          </w:p>
+        </w:tc>
+        <w:tc>
+          <w:tcPr>
+            <w:tcW w:type="dxa" w:w="1700"/>
+            <w:tcBorders>
+              <w:top w:val="single" w:color="A0A7B0" w:sz="4"/>
+              <w:left w:val="single" w:color="A0A7B0" w:sz="4"/>
+              <w:bottom w:val="single" w:color="A0A7B0" w:sz="4"/>
+              <w:right w:val="single" w:color="A0A7B0" w:sz="4"/>
+            </w:tcBorders>
+            <w:shd w:fill="E8EEF4" w:val="clear"/>
+            <w:tcMar>
+              <w:top w:type="dxa" w:w="50"/>
+              <w:left w:type="dxa" w:w="80"/>
+              <w:bottom w:type="dxa" w:w="50"/>
+              <w:right w:type="dxa" w:w="80"/>
+            </w:tcMar>
+            <w:vAlign w:val="center"/>
+          </w:tcPr>
+          <w:p>
+            <w:pPr>
+              <w:spacing w:after="0" w:line="260"/>
+              <w:jc w:val="center"/>
+            </w:pPr>
+            <w:r>
+              <w:rPr>
+                <w:rFonts w:ascii="Times New Roman" w:cs="Times New Roman" w:eastAsia="Times New Roman" w:hAnsi="Times New Roman"/>
+                <w:b/>
+                <w:bCs/>
+                <w:sz w:val="18"/>
+                <w:szCs w:val="18"/>
+              </w:rPr>
+              <w:t xml:space="preserve">Plan without → with</w:t>
+            </w:r>
+          </w:p>
+        </w:tc>
+        <w:tc>
+          <w:tcPr>
+            <w:tcW w:type="dxa" w:w="1700"/>
+            <w:tcBorders>
+              <w:top w:val="single" w:color="A0A7B0" w:sz="4"/>
+              <w:left w:val="single" w:color="A0A7B0" w:sz="4"/>
+              <w:bottom w:val="single" w:color="A0A7B0" w:sz="4"/>
+              <w:right w:val="single" w:color="A0A7B0" w:sz="4"/>
+            </w:tcBorders>
+            <w:shd w:fill="E8EEF4" w:val="clear"/>
+            <w:tcMar>
+              <w:top w:type="dxa" w:w="50"/>
+              <w:left w:type="dxa" w:w="80"/>
+              <w:bottom w:type="dxa" w:w="50"/>
+              <w:right w:type="dxa" w:w="80"/>
+            </w:tcMar>
+            <w:vAlign w:val="center"/>
+          </w:tcPr>
+          <w:p>
+            <w:pPr>
+              <w:spacing w:after="0" w:line="260"/>
+              <w:jc w:val="center"/>
+            </w:pPr>
+            <w:r>
+              <w:rPr>
+                <w:rFonts w:ascii="Times New Roman" w:cs="Times New Roman" w:eastAsia="Times New Roman" w:hAnsi="Times New Roman"/>
+                <w:b/>
+                <w:bCs/>
+                <w:sz w:val="18"/>
+                <w:szCs w:val="18"/>
+              </w:rPr>
+              <w:t xml:space="preserve">Docs examined</w:t>
+            </w:r>
+          </w:p>
+        </w:tc>
+        <w:tc>
+          <w:tcPr>
+            <w:tcW w:type="dxa" w:w="1700"/>
+            <w:tcBorders>
+              <w:top w:val="single" w:color="A0A7B0" w:sz="4"/>
+              <w:left w:val="single" w:color="A0A7B0" w:sz="4"/>
+              <w:bottom w:val="single" w:color="A0A7B0" w:sz="4"/>
+              <w:right w:val="single" w:color="A0A7B0" w:sz="4"/>
+            </w:tcBorders>
+            <w:shd w:fill="E8EEF4" w:val="clear"/>
+            <w:tcMar>
+              <w:top w:type="dxa" w:w="50"/>
+              <w:left w:type="dxa" w:w="80"/>
+              <w:bottom w:type="dxa" w:w="50"/>
+              <w:right w:type="dxa" w:w="80"/>
+            </w:tcMar>
+            <w:vAlign w:val="center"/>
+          </w:tcPr>
+          <w:p>
+            <w:pPr>
+              <w:spacing w:after="0" w:line="260"/>
+              <w:jc w:val="center"/>
+            </w:pPr>
+            <w:r>
+              <w:rPr>
+                <w:rFonts w:ascii="Times New Roman" w:cs="Times New Roman" w:eastAsia="Times New Roman" w:hAnsi="Times New Roman"/>
+                <w:b/>
+                <w:bCs/>
+                <w:sz w:val="18"/>
+                <w:szCs w:val="18"/>
+              </w:rPr>
+              <w:t xml:space="preserve">Median latency</w:t>
+            </w:r>
+          </w:p>
+        </w:tc>
+        <w:tc>
+          <w:tcPr>
+            <w:tcW w:type="dxa" w:w="1638"/>
+            <w:tcBorders>
+              <w:top w:val="single" w:color="A0A7B0" w:sz="4"/>
+              <w:left w:val="single" w:color="A0A7B0" w:sz="4"/>
+              <w:bottom w:val="single" w:color="A0A7B0" w:sz="4"/>
+              <w:right w:val="single" w:color="A0A7B0" w:sz="4"/>
+            </w:tcBorders>
+            <w:shd w:fill="E8EEF4" w:val="clear"/>
+            <w:tcMar>
+              <w:top w:type="dxa" w:w="50"/>
+              <w:left w:type="dxa" w:w="80"/>
+              <w:bottom w:type="dxa" w:w="50"/>
+              <w:right w:type="dxa" w:w="80"/>
+            </w:tcMar>
+            <w:vAlign w:val="center"/>
+          </w:tcPr>
+          <w:p>
+            <w:pPr>
+              <w:spacing w:after="0" w:line="260"/>
+              <w:jc w:val="center"/>
+            </w:pPr>
+            <w:r>
+              <w:rPr>
+                <w:rFonts w:ascii="Times New Roman" w:cs="Times New Roman" w:eastAsia="Times New Roman" w:hAnsi="Times New Roman"/>
+                <w:b/>
+                <w:bCs/>
+                <w:sz w:val="18"/>
+                <w:szCs w:val="18"/>
+              </w:rPr>
+              <w:t xml:space="preserve">Speed-up</w:t>
+            </w:r>
+          </w:p>
+        </w:tc>
+      </w:tr>
+      <w:tr>
+        <w:trPr>
+          <w:cantSplit/>
+          <w:tblHeader w:val="false"/>
+        </w:trPr>
+        <w:tc>
+          <w:tcPr>
+            <w:tcW w:type="dxa" w:w="2900"/>
+            <w:tcBorders>
+              <w:top w:val="single" w:color="A0A7B0" w:sz="4"/>
+              <w:left w:val="single" w:color="A0A7B0" w:sz="4"/>
+              <w:bottom w:val="single" w:color="A0A7B0" w:sz="4"/>
+              <w:right w:val="single" w:color="A0A7B0" w:sz="4"/>
+            </w:tcBorders>
+            <w:shd w:fill="FFFFFF" w:val="clear"/>
+            <w:tcMar>
+              <w:top w:type="dxa" w:w="50"/>
+              <w:left w:type="dxa" w:w="80"/>
+              <w:bottom w:type="dxa" w:w="50"/>
+              <w:right w:type="dxa" w:w="80"/>
+            </w:tcMar>
+            <w:vAlign w:val="center"/>
+          </w:tcPr>
+          <w:p>
+            <w:pPr>
+              <w:spacing w:after="0" w:line="260"/>
+              <w:jc w:val="left"/>
+            </w:pPr>
+            <w:r>
+              <w:rPr>
+                <w:rFonts w:ascii="Times New Roman" w:cs="Times New Roman" w:eastAsia="Times New Roman" w:hAnsi="Times New Roman"/>
+                <w:b w:val="false"/>
+                <w:bCs w:val="false"/>
+                <w:sz w:val="18"/>
+                <w:szCs w:val="18"/>
+              </w:rPr>
+              <w:t xml:space="preserve">reports by actor (limit 100)</w:t>
+            </w:r>
+          </w:p>
+        </w:tc>
+        <w:tc>
+          <w:tcPr>
+            <w:tcW w:type="dxa" w:w="1700"/>
+            <w:tcBorders>
+              <w:top w:val="single" w:color="A0A7B0" w:sz="4"/>
+              <w:left w:val="single" w:color="A0A7B0" w:sz="4"/>
+              <w:bottom w:val="single" w:color="A0A7B0" w:sz="4"/>
+              <w:right w:val="single" w:color="A0A7B0" w:sz="4"/>
+            </w:tcBorders>
+            <w:shd w:fill="FFFFFF" w:val="clear"/>
+            <w:tcMar>
+              <w:top w:type="dxa" w:w="50"/>
+              <w:left w:type="dxa" w:w="80"/>
+              <w:bottom w:type="dxa" w:w="50"/>
+              <w:right w:type="dxa" w:w="80"/>
+            </w:tcMar>
+            <w:vAlign w:val="center"/>
+          </w:tcPr>
+          <w:p>
+            <w:pPr>
+              <w:spacing w:after="0" w:line="260"/>
+              <w:jc w:val="left"/>
+            </w:pPr>
+            <w:r>
+              <w:rPr>
+                <w:rFonts w:ascii="Times New Roman" w:cs="Times New Roman" w:eastAsia="Times New Roman" w:hAnsi="Times New Roman"/>
+                <w:b w:val="false"/>
+                <w:bCs w:val="false"/>
+                <w:sz w:val="18"/>
+                <w:szCs w:val="18"/>
+              </w:rPr>
+              <w:t xml:space="preserve">COLLSCAN → IXSCAN</w:t>
+            </w:r>
+          </w:p>
+        </w:tc>
+        <w:tc>
+          <w:tcPr>
+            <w:tcW w:type="dxa" w:w="1700"/>
+            <w:tcBorders>
+              <w:top w:val="single" w:color="A0A7B0" w:sz="4"/>
+              <w:left w:val="single" w:color="A0A7B0" w:sz="4"/>
+              <w:bottom w:val="single" w:color="A0A7B0" w:sz="4"/>
+              <w:right w:val="single" w:color="A0A7B0" w:sz="4"/>
+            </w:tcBorders>
+            <w:shd w:fill="FFFFFF" w:val="clear"/>
+            <w:tcMar>
+              <w:top w:type="dxa" w:w="50"/>
+              <w:left w:type="dxa" w:w="80"/>
+              <w:bottom w:type="dxa" w:w="50"/>
+              <w:right w:type="dxa" w:w="80"/>
+            </w:tcMar>
+            <w:vAlign w:val="center"/>
+          </w:tcPr>
+          <w:p>
+            <w:pPr>
+              <w:spacing w:after="0" w:line="260"/>
+              <w:jc w:val="center"/>
+            </w:pPr>
+            <w:r>
+              <w:rPr>
+                <w:rFonts w:ascii="Times New Roman" w:cs="Times New Roman" w:eastAsia="Times New Roman" w:hAnsi="Times New Roman"/>
+                <w:b w:val="false"/>
+                <w:bCs w:val="false"/>
+                <w:sz w:val="18"/>
+                <w:szCs w:val="18"/>
+              </w:rPr>
+              <w:t xml:space="preserve">37,181 → 100</w:t>
+            </w:r>
+          </w:p>
+        </w:tc>
+        <w:tc>
+          <w:tcPr>
+            <w:tcW w:type="dxa" w:w="1700"/>
+            <w:tcBorders>
+              <w:top w:val="single" w:color="A0A7B0" w:sz="4"/>
+              <w:left w:val="single" w:color="A0A7B0" w:sz="4"/>
+              <w:bottom w:val="single" w:color="A0A7B0" w:sz="4"/>
+              <w:right w:val="single" w:color="A0A7B0" w:sz="4"/>
+            </w:tcBorders>
+            <w:shd w:fill="FFFFFF" w:val="clear"/>
+            <w:tcMar>
+              <w:top w:type="dxa" w:w="50"/>
+              <w:left w:type="dxa" w:w="80"/>
+              <w:bottom w:type="dxa" w:w="50"/>
+              <w:right w:type="dxa" w:w="80"/>
+            </w:tcMar>
+            <w:vAlign w:val="center"/>
+          </w:tcPr>
+          <w:p>
+            <w:pPr>
+              <w:spacing w:after="0" w:line="260"/>
+              <w:jc w:val="center"/>
+            </w:pPr>
+            <w:r>
+              <w:rPr>
+                <w:rFonts w:ascii="Times New Roman" w:cs="Times New Roman" w:eastAsia="Times New Roman" w:hAnsi="Times New Roman"/>
+                <w:b w:val="false"/>
+                <w:bCs w:val="false"/>
+                <w:sz w:val="18"/>
+                <w:szCs w:val="18"/>
+              </w:rPr>
+              <w:t xml:space="preserve">9.96 ms → 0.77 ms</w:t>
+            </w:r>
+          </w:p>
+        </w:tc>
+        <w:tc>
+          <w:tcPr>
+            <w:tcW w:type="dxa" w:w="1638"/>
+            <w:tcBorders>
+              <w:top w:val="single" w:color="A0A7B0" w:sz="4"/>
+              <w:left w:val="single" w:color="A0A7B0" w:sz="4"/>
+              <w:bottom w:val="single" w:color="A0A7B0" w:sz="4"/>
+              <w:right w:val="single" w:color="A0A7B0" w:sz="4"/>
+            </w:tcBorders>
+            <w:shd w:fill="FFFFFF" w:val="clear"/>
+            <w:tcMar>
+              <w:top w:type="dxa" w:w="50"/>
+              <w:left w:type="dxa" w:w="80"/>
+              <w:bottom w:type="dxa" w:w="50"/>
+              <w:right w:type="dxa" w:w="80"/>
+            </w:tcMar>
+            <w:vAlign w:val="center"/>
+          </w:tcPr>
+          <w:p>
+            <w:pPr>
+              <w:spacing w:after="0" w:line="260"/>
+              <w:jc w:val="center"/>
+            </w:pPr>
+            <w:r>
+              <w:rPr>
+                <w:rFonts w:ascii="Times New Roman" w:cs="Times New Roman" w:eastAsia="Times New Roman" w:hAnsi="Times New Roman"/>
+                <w:b w:val="false"/>
+                <w:bCs w:val="false"/>
+                <w:sz w:val="18"/>
+                <w:szCs w:val="18"/>
+              </w:rPr>
+              <w:t xml:space="preserve">13×</w:t>
+            </w:r>
+          </w:p>
+        </w:tc>
+      </w:tr>
+      <w:tr>
+        <w:trPr>
+          <w:cantSplit/>
+          <w:tblHeader w:val="false"/>
+        </w:trPr>
+        <w:tc>
+          <w:tcPr>
+            <w:tcW w:type="dxa" w:w="2900"/>
+            <w:tcBorders>
+              <w:top w:val="single" w:color="A0A7B0" w:sz="4"/>
+              <w:left w:val="single" w:color="A0A7B0" w:sz="4"/>
+              <w:bottom w:val="single" w:color="A0A7B0" w:sz="4"/>
+              <w:right w:val="single" w:color="A0A7B0" w:sz="4"/>
+            </w:tcBorders>
+            <w:shd w:fill="F7F5F1" w:val="clear"/>
+            <w:tcMar>
+              <w:top w:type="dxa" w:w="50"/>
+              <w:left w:type="dxa" w:w="80"/>
+              <w:bottom w:type="dxa" w:w="50"/>
+              <w:right w:type="dxa" w:w="80"/>
+            </w:tcMar>
+            <w:vAlign w:val="center"/>
+          </w:tcPr>
+          <w:p>
+            <w:pPr>
+              <w:spacing w:after="0" w:line="260"/>
+              <w:jc w:val="left"/>
+            </w:pPr>
+            <w:r>
+              <w:rPr>
+                <w:rFonts w:ascii="Times New Roman" w:cs="Times New Roman" w:eastAsia="Times New Roman" w:hAnsi="Times New Roman"/>
+                <w:b w:val="false"/>
+                <w:bCs w:val="false"/>
+                <w:sz w:val="18"/>
+                <w:szCs w:val="18"/>
+              </w:rPr>
+              <w:t xml:space="preserve">reports citing an IOC</w:t>
+            </w:r>
+          </w:p>
+        </w:tc>
+        <w:tc>
+          <w:tcPr>
+            <w:tcW w:type="dxa" w:w="1700"/>
+            <w:tcBorders>
+              <w:top w:val="single" w:color="A0A7B0" w:sz="4"/>
+              <w:left w:val="single" w:color="A0A7B0" w:sz="4"/>
+              <w:bottom w:val="single" w:color="A0A7B0" w:sz="4"/>
+              <w:right w:val="single" w:color="A0A7B0" w:sz="4"/>
+            </w:tcBorders>
+            <w:shd w:fill="F7F5F1" w:val="clear"/>
+            <w:tcMar>
+              <w:top w:type="dxa" w:w="50"/>
+              <w:left w:type="dxa" w:w="80"/>
+              <w:bottom w:type="dxa" w:w="50"/>
+              <w:right w:type="dxa" w:w="80"/>
+            </w:tcMar>
+            <w:vAlign w:val="center"/>
+          </w:tcPr>
+          <w:p>
+            <w:pPr>
+              <w:spacing w:after="0" w:line="260"/>
+              <w:jc w:val="left"/>
+            </w:pPr>
+            <w:r>
+              <w:rPr>
+                <w:rFonts w:ascii="Times New Roman" w:cs="Times New Roman" w:eastAsia="Times New Roman" w:hAnsi="Times New Roman"/>
+                <w:b w:val="false"/>
+                <w:bCs w:val="false"/>
+                <w:sz w:val="18"/>
+                <w:szCs w:val="18"/>
+              </w:rPr>
+              <w:t xml:space="preserve">COLLSCAN → IXSCAN</w:t>
+            </w:r>
+          </w:p>
+        </w:tc>
+        <w:tc>
+          <w:tcPr>
+            <w:tcW w:type="dxa" w:w="1700"/>
+            <w:tcBorders>
+              <w:top w:val="single" w:color="A0A7B0" w:sz="4"/>
+              <w:left w:val="single" w:color="A0A7B0" w:sz="4"/>
+              <w:bottom w:val="single" w:color="A0A7B0" w:sz="4"/>
+              <w:right w:val="single" w:color="A0A7B0" w:sz="4"/>
+            </w:tcBorders>
+            <w:shd w:fill="F7F5F1" w:val="clear"/>
+            <w:tcMar>
+              <w:top w:type="dxa" w:w="50"/>
+              <w:left w:type="dxa" w:w="80"/>
+              <w:bottom w:type="dxa" w:w="50"/>
+              <w:right w:type="dxa" w:w="80"/>
+            </w:tcMar>
+            <w:vAlign w:val="center"/>
+          </w:tcPr>
+          <w:p>
+            <w:pPr>
+              <w:spacing w:after="0" w:line="260"/>
+              <w:jc w:val="center"/>
+            </w:pPr>
+            <w:r>
+              <w:rPr>
+                <w:rFonts w:ascii="Times New Roman" w:cs="Times New Roman" w:eastAsia="Times New Roman" w:hAnsi="Times New Roman"/>
+                <w:b w:val="false"/>
+                <w:bCs w:val="false"/>
+                <w:sz w:val="18"/>
+                <w:szCs w:val="18"/>
+              </w:rPr>
+              <w:t xml:space="preserve">200,000 → 3</w:t>
+            </w:r>
+          </w:p>
+        </w:tc>
+        <w:tc>
+          <w:tcPr>
+            <w:tcW w:type="dxa" w:w="1700"/>
+            <w:tcBorders>
+              <w:top w:val="single" w:color="A0A7B0" w:sz="4"/>
+              <w:left w:val="single" w:color="A0A7B0" w:sz="4"/>
+              <w:bottom w:val="single" w:color="A0A7B0" w:sz="4"/>
+              <w:right w:val="single" w:color="A0A7B0" w:sz="4"/>
+            </w:tcBorders>
+            <w:shd w:fill="F7F5F1" w:val="clear"/>
+            <w:tcMar>
+              <w:top w:type="dxa" w:w="50"/>
+              <w:left w:type="dxa" w:w="80"/>
+              <w:bottom w:type="dxa" w:w="50"/>
+              <w:right w:type="dxa" w:w="80"/>
+            </w:tcMar>
+            <w:vAlign w:val="center"/>
+          </w:tcPr>
+          <w:p>
+            <w:pPr>
+              <w:spacing w:after="0" w:line="260"/>
+              <w:jc w:val="center"/>
+            </w:pPr>
+            <w:r>
+              <w:rPr>
+                <w:rFonts w:ascii="Times New Roman" w:cs="Times New Roman" w:eastAsia="Times New Roman" w:hAnsi="Times New Roman"/>
+                <w:b w:val="false"/>
+                <w:bCs w:val="false"/>
+                <w:sz w:val="18"/>
+                <w:szCs w:val="18"/>
+              </w:rPr>
+              <w:t xml:space="preserve">54.7 ms → 0.53 ms</w:t>
+            </w:r>
+          </w:p>
+        </w:tc>
+        <w:tc>
+          <w:tcPr>
+            <w:tcW w:type="dxa" w:w="1638"/>
+            <w:tcBorders>
+              <w:top w:val="single" w:color="A0A7B0" w:sz="4"/>
+              <w:left w:val="single" w:color="A0A7B0" w:sz="4"/>
+              <w:bottom w:val="single" w:color="A0A7B0" w:sz="4"/>
+              <w:right w:val="single" w:color="A0A7B0" w:sz="4"/>
+            </w:tcBorders>
+            <w:shd w:fill="F7F5F1" w:val="clear"/>
+            <w:tcMar>
+              <w:top w:type="dxa" w:w="50"/>
+              <w:left w:type="dxa" w:w="80"/>
+              <w:bottom w:type="dxa" w:w="50"/>
+              <w:right w:type="dxa" w:w="80"/>
+            </w:tcMar>
+            <w:vAlign w:val="center"/>
+          </w:tcPr>
+          <w:p>
+            <w:pPr>
+              <w:spacing w:after="0" w:line="260"/>
+              <w:jc w:val="center"/>
+            </w:pPr>
+            <w:r>
+              <w:rPr>
+                <w:rFonts w:ascii="Times New Roman" w:cs="Times New Roman" w:eastAsia="Times New Roman" w:hAnsi="Times New Roman"/>
+                <w:b w:val="false"/>
+                <w:bCs w:val="false"/>
+                <w:sz w:val="18"/>
+                <w:szCs w:val="18"/>
+              </w:rPr>
+              <w:t xml:space="preserve">103×</w:t>
+            </w:r>
+          </w:p>
+        </w:tc>
+      </w:tr>
+      <w:tr>
+        <w:trPr>
+          <w:cantSplit/>
+          <w:tblHeader w:val="false"/>
+        </w:trPr>
+        <w:tc>
+          <w:tcPr>
+            <w:tcW w:type="dxa" w:w="2900"/>
+            <w:tcBorders>
+              <w:top w:val="single" w:color="A0A7B0" w:sz="4"/>
+              <w:left w:val="single" w:color="A0A7B0" w:sz="4"/>
+              <w:bottom w:val="single" w:color="A0A7B0" w:sz="4"/>
+              <w:right w:val="single" w:color="A0A7B0" w:sz="4"/>
+            </w:tcBorders>
+            <w:shd w:fill="FFFFFF" w:val="clear"/>
+            <w:tcMar>
+              <w:top w:type="dxa" w:w="50"/>
+              <w:left w:type="dxa" w:w="80"/>
+              <w:bottom w:type="dxa" w:w="50"/>
+              <w:right w:type="dxa" w:w="80"/>
+            </w:tcMar>
+            <w:vAlign w:val="center"/>
+          </w:tcPr>
+          <w:p>
+            <w:pPr>
+              <w:spacing w:after="0" w:line="260"/>
+              <w:jc w:val="left"/>
+            </w:pPr>
+            <w:r>
+              <w:rPr>
+                <w:rFonts w:ascii="Times New Roman" w:cs="Times New Roman" w:eastAsia="Times New Roman" w:hAnsi="Times New Roman"/>
+                <w:b w:val="false"/>
+                <w:bCs w:val="false"/>
+                <w:sz w:val="18"/>
+                <w:szCs w:val="18"/>
+              </w:rPr>
+              <w:t xml:space="preserve">50 newest at TLP ≤ GREEN</w:t>
+            </w:r>
+          </w:p>
+        </w:tc>
+        <w:tc>
+          <w:tcPr>
+            <w:tcW w:type="dxa" w:w="1700"/>
+            <w:tcBorders>
+              <w:top w:val="single" w:color="A0A7B0" w:sz="4"/>
+              <w:left w:val="single" w:color="A0A7B0" w:sz="4"/>
+              <w:bottom w:val="single" w:color="A0A7B0" w:sz="4"/>
+              <w:right w:val="single" w:color="A0A7B0" w:sz="4"/>
+            </w:tcBorders>
+            <w:shd w:fill="FFFFFF" w:val="clear"/>
+            <w:tcMar>
+              <w:top w:type="dxa" w:w="50"/>
+              <w:left w:type="dxa" w:w="80"/>
+              <w:bottom w:type="dxa" w:w="50"/>
+              <w:right w:type="dxa" w:w="80"/>
+            </w:tcMar>
+            <w:vAlign w:val="center"/>
+          </w:tcPr>
+          <w:p>
+            <w:pPr>
+              <w:spacing w:after="0" w:line="260"/>
+              <w:jc w:val="left"/>
+            </w:pPr>
+            <w:r>
+              <w:rPr>
+                <w:rFonts w:ascii="Times New Roman" w:cs="Times New Roman" w:eastAsia="Times New Roman" w:hAnsi="Times New Roman"/>
+                <w:b w:val="false"/>
+                <w:bCs w:val="false"/>
+                <w:sz w:val="18"/>
+                <w:szCs w:val="18"/>
+              </w:rPr>
+              <w:t xml:space="preserve">COLLSCAN → IXSCAN</w:t>
+            </w:r>
+          </w:p>
+        </w:tc>
+        <w:tc>
+          <w:tcPr>
+            <w:tcW w:type="dxa" w:w="1700"/>
+            <w:tcBorders>
+              <w:top w:val="single" w:color="A0A7B0" w:sz="4"/>
+              <w:left w:val="single" w:color="A0A7B0" w:sz="4"/>
+              <w:bottom w:val="single" w:color="A0A7B0" w:sz="4"/>
+              <w:right w:val="single" w:color="A0A7B0" w:sz="4"/>
+            </w:tcBorders>
+            <w:shd w:fill="FFFFFF" w:val="clear"/>
+            <w:tcMar>
+              <w:top w:type="dxa" w:w="50"/>
+              <w:left w:type="dxa" w:w="80"/>
+              <w:bottom w:type="dxa" w:w="50"/>
+              <w:right w:type="dxa" w:w="80"/>
+            </w:tcMar>
+            <w:vAlign w:val="center"/>
+          </w:tcPr>
+          <w:p>
+            <w:pPr>
+              <w:spacing w:after="0" w:line="260"/>
+              <w:jc w:val="center"/>
+            </w:pPr>
+            <w:r>
+              <w:rPr>
+                <w:rFonts w:ascii="Times New Roman" w:cs="Times New Roman" w:eastAsia="Times New Roman" w:hAnsi="Times New Roman"/>
+                <w:b w:val="false"/>
+                <w:bCs w:val="false"/>
+                <w:sz w:val="18"/>
+                <w:szCs w:val="18"/>
+              </w:rPr>
+              <w:t xml:space="preserve">200,000 → 69</w:t>
+            </w:r>
+          </w:p>
+        </w:tc>
+        <w:tc>
+          <w:tcPr>
+            <w:tcW w:type="dxa" w:w="1700"/>
+            <w:tcBorders>
+              <w:top w:val="single" w:color="A0A7B0" w:sz="4"/>
+              <w:left w:val="single" w:color="A0A7B0" w:sz="4"/>
+              <w:bottom w:val="single" w:color="A0A7B0" w:sz="4"/>
+              <w:right w:val="single" w:color="A0A7B0" w:sz="4"/>
+            </w:tcBorders>
+            <w:shd w:fill="FFFFFF" w:val="clear"/>
+            <w:tcMar>
+              <w:top w:type="dxa" w:w="50"/>
+              <w:left w:type="dxa" w:w="80"/>
+              <w:bottom w:type="dxa" w:w="50"/>
+              <w:right w:type="dxa" w:w="80"/>
+            </w:tcMar>
+            <w:vAlign w:val="center"/>
+          </w:tcPr>
+          <w:p>
+            <w:pPr>
+              <w:spacing w:after="0" w:line="260"/>
+              <w:jc w:val="center"/>
+            </w:pPr>
+            <w:r>
+              <w:rPr>
+                <w:rFonts w:ascii="Times New Roman" w:cs="Times New Roman" w:eastAsia="Times New Roman" w:hAnsi="Times New Roman"/>
+                <w:b w:val="false"/>
+                <w:bCs w:val="false"/>
+                <w:sz w:val="18"/>
+                <w:szCs w:val="18"/>
+              </w:rPr>
+              <w:t xml:space="preserve">49.9 ms → 0.53 ms</w:t>
+            </w:r>
+          </w:p>
+        </w:tc>
+        <w:tc>
+          <w:tcPr>
+            <w:tcW w:type="dxa" w:w="1638"/>
+            <w:tcBorders>
+              <w:top w:val="single" w:color="A0A7B0" w:sz="4"/>
+              <w:left w:val="single" w:color="A0A7B0" w:sz="4"/>
+              <w:bottom w:val="single" w:color="A0A7B0" w:sz="4"/>
+              <w:right w:val="single" w:color="A0A7B0" w:sz="4"/>
+            </w:tcBorders>
+            <w:shd w:fill="FFFFFF" w:val="clear"/>
+            <w:tcMar>
+              <w:top w:type="dxa" w:w="50"/>
+              <w:left w:type="dxa" w:w="80"/>
+              <w:bottom w:type="dxa" w:w="50"/>
+              <w:right w:type="dxa" w:w="80"/>
+            </w:tcMar>
+            <w:vAlign w:val="center"/>
+          </w:tcPr>
+          <w:p>
+            <w:pPr>
+              <w:spacing w:after="0" w:line="260"/>
+              <w:jc w:val="center"/>
+            </w:pPr>
+            <w:r>
+              <w:rPr>
+                <w:rFonts w:ascii="Times New Roman" w:cs="Times New Roman" w:eastAsia="Times New Roman" w:hAnsi="Times New Roman"/>
+                <w:b w:val="false"/>
+                <w:bCs w:val="false"/>
+                <w:sz w:val="18"/>
+                <w:szCs w:val="18"/>
+              </w:rPr>
+              <w:t xml:space="preserve">94×</w:t>
+            </w:r>
+          </w:p>
+        </w:tc>
+      </w:tr>
+      <w:tr>
+        <w:trPr>
+          <w:cantSplit/>
+          <w:tblHeader w:val="false"/>
+        </w:trPr>
+        <w:tc>
+          <w:tcPr>
+            <w:tcW w:type="dxa" w:w="2900"/>
+            <w:tcBorders>
+              <w:top w:val="single" w:color="A0A7B0" w:sz="4"/>
+              <w:left w:val="single" w:color="A0A7B0" w:sz="4"/>
+              <w:bottom w:val="single" w:color="A0A7B0" w:sz="4"/>
+              <w:right w:val="single" w:color="A0A7B0" w:sz="4"/>
+            </w:tcBorders>
+            <w:shd w:fill="F7F5F1" w:val="clear"/>
+            <w:tcMar>
+              <w:top w:type="dxa" w:w="50"/>
+              <w:left w:type="dxa" w:w="80"/>
+              <w:bottom w:type="dxa" w:w="50"/>
+              <w:right w:type="dxa" w:w="80"/>
+            </w:tcMar>
+            <w:vAlign w:val="center"/>
+          </w:tcPr>
+          <w:p>
+            <w:pPr>
+              <w:spacing w:after="0" w:line="260"/>
+              <w:jc w:val="left"/>
+            </w:pPr>
+            <w:r>
+              <w:rPr>
+                <w:rFonts w:ascii="Times New Roman" w:cs="Times New Roman" w:eastAsia="Times New Roman" w:hAnsi="Times New Roman"/>
+                <w:b w:val="false"/>
+                <w:bCs w:val="false"/>
+                <w:sz w:val="18"/>
+                <w:szCs w:val="18"/>
+              </w:rPr>
+              <w:t xml:space="preserve">Neo4j host by value</w:t>
+            </w:r>
+          </w:p>
+        </w:tc>
+        <w:tc>
+          <w:tcPr>
+            <w:tcW w:type="dxa" w:w="1700"/>
+            <w:tcBorders>
+              <w:top w:val="single" w:color="A0A7B0" w:sz="4"/>
+              <w:left w:val="single" w:color="A0A7B0" w:sz="4"/>
+              <w:bottom w:val="single" w:color="A0A7B0" w:sz="4"/>
+              <w:right w:val="single" w:color="A0A7B0" w:sz="4"/>
+            </w:tcBorders>
+            <w:shd w:fill="F7F5F1" w:val="clear"/>
+            <w:tcMar>
+              <w:top w:type="dxa" w:w="50"/>
+              <w:left w:type="dxa" w:w="80"/>
+              <w:bottom w:type="dxa" w:w="50"/>
+              <w:right w:type="dxa" w:w="80"/>
+            </w:tcMar>
+            <w:vAlign w:val="center"/>
+          </w:tcPr>
+          <w:p>
+            <w:pPr>
+              <w:spacing w:after="0" w:line="260"/>
+              <w:jc w:val="left"/>
+            </w:pPr>
+            <w:r>
+              <w:rPr>
+                <w:rFonts w:ascii="Times New Roman" w:cs="Times New Roman" w:eastAsia="Times New Roman" w:hAnsi="Times New Roman"/>
+                <w:b w:val="false"/>
+                <w:bCs w:val="false"/>
+                <w:sz w:val="18"/>
+                <w:szCs w:val="18"/>
+              </w:rPr>
+              <w:t xml:space="preserve">NodeByLabelScan → NodeIndexSeek</w:t>
+            </w:r>
+          </w:p>
+        </w:tc>
+        <w:tc>
+          <w:tcPr>
+            <w:tcW w:type="dxa" w:w="1700"/>
+            <w:tcBorders>
+              <w:top w:val="single" w:color="A0A7B0" w:sz="4"/>
+              <w:left w:val="single" w:color="A0A7B0" w:sz="4"/>
+              <w:bottom w:val="single" w:color="A0A7B0" w:sz="4"/>
+              <w:right w:val="single" w:color="A0A7B0" w:sz="4"/>
+            </w:tcBorders>
+            <w:shd w:fill="F7F5F1" w:val="clear"/>
+            <w:tcMar>
+              <w:top w:type="dxa" w:w="50"/>
+              <w:left w:type="dxa" w:w="80"/>
+              <w:bottom w:type="dxa" w:w="50"/>
+              <w:right w:type="dxa" w:w="80"/>
+            </w:tcMar>
+            <w:vAlign w:val="center"/>
+          </w:tcPr>
+          <w:p>
+            <w:pPr>
+              <w:spacing w:after="0" w:line="260"/>
+              <w:jc w:val="center"/>
+            </w:pPr>
+            <w:r>
+              <w:rPr>
+                <w:rFonts w:ascii="Times New Roman" w:cs="Times New Roman" w:eastAsia="Times New Roman" w:hAnsi="Times New Roman"/>
+                <w:b w:val="false"/>
+                <w:bCs w:val="false"/>
+                <w:sz w:val="18"/>
+                <w:szCs w:val="18"/>
+              </w:rPr>
+              <w:t xml:space="preserve">200,002 → 3 db hits</w:t>
+            </w:r>
+          </w:p>
+        </w:tc>
+        <w:tc>
+          <w:tcPr>
+            <w:tcW w:type="dxa" w:w="1700"/>
+            <w:tcBorders>
+              <w:top w:val="single" w:color="A0A7B0" w:sz="4"/>
+              <w:left w:val="single" w:color="A0A7B0" w:sz="4"/>
+              <w:bottom w:val="single" w:color="A0A7B0" w:sz="4"/>
+              <w:right w:val="single" w:color="A0A7B0" w:sz="4"/>
+            </w:tcBorders>
+            <w:shd w:fill="F7F5F1" w:val="clear"/>
+            <w:tcMar>
+              <w:top w:type="dxa" w:w="50"/>
+              <w:left w:type="dxa" w:w="80"/>
+              <w:bottom w:type="dxa" w:w="50"/>
+              <w:right w:type="dxa" w:w="80"/>
+            </w:tcMar>
+            <w:vAlign w:val="center"/>
+          </w:tcPr>
+          <w:p>
+            <w:pPr>
+              <w:spacing w:after="0" w:line="260"/>
+              <w:jc w:val="center"/>
+            </w:pPr>
+            <w:r>
+              <w:rPr>
+                <w:rFonts w:ascii="Times New Roman" w:cs="Times New Roman" w:eastAsia="Times New Roman" w:hAnsi="Times New Roman"/>
+                <w:b w:val="false"/>
+                <w:bCs w:val="false"/>
+                <w:sz w:val="18"/>
+                <w:szCs w:val="18"/>
+              </w:rPr>
+              <w:t xml:space="preserve">18.6 ms → 0.66 ms</w:t>
+            </w:r>
+          </w:p>
+        </w:tc>
+        <w:tc>
+          <w:tcPr>
+            <w:tcW w:type="dxa" w:w="1638"/>
+            <w:tcBorders>
+              <w:top w:val="single" w:color="A0A7B0" w:sz="4"/>
+              <w:left w:val="single" w:color="A0A7B0" w:sz="4"/>
+              <w:bottom w:val="single" w:color="A0A7B0" w:sz="4"/>
+              <w:right w:val="single" w:color="A0A7B0" w:sz="4"/>
+            </w:tcBorders>
+            <w:shd w:fill="F7F5F1" w:val="clear"/>
+            <w:tcMar>
+              <w:top w:type="dxa" w:w="50"/>
+              <w:left w:type="dxa" w:w="80"/>
+              <w:bottom w:type="dxa" w:w="50"/>
+              <w:right w:type="dxa" w:w="80"/>
+            </w:tcMar>
+            <w:vAlign w:val="center"/>
+          </w:tcPr>
+          <w:p>
+            <w:pPr>
+              <w:spacing w:after="0" w:line="260"/>
+              <w:jc w:val="center"/>
+            </w:pPr>
+            <w:r>
+              <w:rPr>
+                <w:rFonts w:ascii="Times New Roman" w:cs="Times New Roman" w:eastAsia="Times New Roman" w:hAnsi="Times New Roman"/>
+                <w:b w:val="false"/>
+                <w:bCs w:val="false"/>
+                <w:sz w:val="18"/>
+                <w:szCs w:val="18"/>
+              </w:rPr>
+              <w:t xml:space="preserve">28×</w:t>
+            </w:r>
+          </w:p>
+        </w:tc>
+      </w:tr>
+    </w:tbl>
+    <w:p>
+      <w:pPr>
+        <w:spacing w:after="240" w:before="60"/>
+        <w:jc w:val="center"/>
+      </w:pPr>
+      <w:r>
+        <w:rPr>
+          <w:rFonts w:ascii="Times New Roman" w:cs="Times New Roman" w:eastAsia="Times New Roman" w:hAnsi="Times New Roman"/>
+          <w:i/>
+          <w:iCs/>
+          <w:sz w:val="20"/>
+          <w:szCs w:val="20"/>
+        </w:rPr>
+        <w:t xml:space="preserve">Table 14.  Index ablation results.</w:t>
       </w:r>
     </w:p>
     <w:p>
@@ -16803,7 +16899,7 @@
           <w:sz w:val="24"/>
           <w:szCs w:val="24"/>
         </w:rPr>
-        <w:t xml:space="preserve">The enforcement lookup (pipelined GET + TTL) stays at 0.29 ms median and 0.53 ms p99 at 500,000 keys, while any lookup that is not by key — such as finding IOCs by actor — needs a full SCAN that grows linearly to 1.0 s. This is why the design never queries Redis by attribute (NFR3) and keeps attribute queries in MongoDB and Neo4j. Memory grows to 191.6 MB at 500,000 keys (about 402 bytes per IOC including the expiry index).</w:t>
+        <w:t xml:space="preserve">Without secondary indexes MongoDB scans the collection (COLLSCAN) and reads up to every document; the multikey indexes reduce this to the matching documents. The newest-first TLP query reads 69 documents through the date index and 50 with a compound (tlp, date) index — a small further gain we record but do not need at this scale. The production indexes cost 14.0 MB for 44 MB of data and build in 0.95 s. In Neo4j, a label scan touches every node; the range index turns the lookup into a seek with 3 database hits.</w:t>
       </w:r>
     </w:p>
     <w:p>
@@ -16821,7 +16917,7 @@
           <w:sz w:val="26"/>
           <w:szCs w:val="26"/>
         </w:rPr>
-        <w:t xml:space="preserve">9.7  Vector search: HNSW against exact search</w:t>
+        <w:t xml:space="preserve">9.6  Key–value enforcement plane</w:t>
       </w:r>
     </w:p>
     <w:p>
@@ -16833,9 +16929,9 @@
       <w:r>
         <w:drawing>
           <wp:inline distT="0" distB="0" distL="0" distR="0">
-            <wp:extent cx="6096000" cy="2266950"/>
+            <wp:extent cx="6096000" cy="2314575"/>
             <wp:effectExtent t="0" r="0" b="0" l="0"/>
-            <wp:docPr id="1" name="Qdrant: recall@10 of HNSW as search breadth grows, and median latency of HNSW and exact search as the collection grows." descr="Qdrant: recall@10 of HNSW as search breadth grows, and median latency of HNSW and exact search as the collection grows." title="Qdrant: recall@10 of HNSW as search breadth grows, and median latency of HNSW and exact search as the collection grows."/>
+            <wp:docPr id="1" name="Redis: blocklist lookup p99 against a full keyspace scan as the number of IOC keys grows to 500,000." descr="Redis: blocklist lookup p99 against a full keyspace scan as the number of IOC keys grows to 500,000." title="Redis: blocklist lookup p99 against a full keyspace scan as the number of IOC keys grows to 500,000."/>
             <wp:cNvGraphicFramePr>
               <a:graphicFrameLocks xmlns:a="http://schemas.openxmlformats.org/drawingml/2006/main" noChangeAspect="1"/>
             </wp:cNvGraphicFramePr>
@@ -16858,6 +16954,101 @@
                   <pic:spPr bwMode="auto">
                     <a:xfrm>
                       <a:off x="0" y="0"/>
+                      <a:ext cx="6096000" cy="2314575"/>
+                    </a:xfrm>
+                    <a:prstGeom prst="rect">
+                      <a:avLst/>
+                    </a:prstGeom>
+                  </pic:spPr>
+                </pic:pic>
+              </a:graphicData>
+            </a:graphic>
+          </wp:inline>
+        </w:drawing>
+      </w:r>
+    </w:p>
+    <w:p>
+      <w:pPr>
+        <w:spacing w:after="240" w:before="60"/>
+        <w:jc w:val="center"/>
+      </w:pPr>
+      <w:r>
+        <w:rPr>
+          <w:rFonts w:ascii="Times New Roman" w:cs="Times New Roman" w:eastAsia="Times New Roman" w:hAnsi="Times New Roman"/>
+          <w:i/>
+          <w:iCs/>
+          <w:sz w:val="20"/>
+          <w:szCs w:val="20"/>
+        </w:rPr>
+        <w:t xml:space="preserve">Figure 12.  Redis: blocklist lookup p99 against a full keyspace scan as the number of IOC keys grows to 500,000.</w:t>
+      </w:r>
+    </w:p>
+    <w:p>
+      <w:pPr>
+        <w:spacing w:after="160" w:line="340"/>
+        <w:jc w:val="both"/>
+      </w:pPr>
+      <w:r>
+        <w:rPr>
+          <w:rFonts w:ascii="Times New Roman" w:cs="Times New Roman" w:eastAsia="Times New Roman" w:hAnsi="Times New Roman"/>
+          <w:sz w:val="24"/>
+          <w:szCs w:val="24"/>
+        </w:rPr>
+        <w:t xml:space="preserve">The enforcement lookup (pipelined GET + TTL) stays at 0.29 ms median and 0.53 ms p99 at 500,000 keys, while any lookup that is not by key — such as finding IOCs by actor — needs a full SCAN that grows linearly to 1.0 s. This is why the design never queries Redis by attribute (NFR3) and keeps attribute queries in MongoDB and Neo4j. Memory grows to 191.6 MB at 500,000 keys (about 402 bytes per IOC including the expiry index).</w:t>
+      </w:r>
+    </w:p>
+    <w:p>
+      <w:pPr>
+        <w:pStyle w:val="Heading2"/>
+        <w:keepNext/>
+        <w:spacing w:after="120" w:before="240"/>
+      </w:pPr>
+      <w:r>
+        <w:rPr>
+          <w:rFonts w:ascii="Times New Roman" w:cs="Times New Roman" w:eastAsia="Times New Roman" w:hAnsi="Times New Roman"/>
+          <w:b/>
+          <w:bCs/>
+          <w:color w:val="1B4F72"/>
+          <w:sz w:val="26"/>
+          <w:szCs w:val="26"/>
+        </w:rPr>
+        <w:t xml:space="preserve">9.7  Vector search: HNSW against exact search</w:t>
+      </w:r>
+    </w:p>
+    <w:p>
+      <w:pPr>
+        <w:keepNext/>
+        <w:spacing w:after="40" w:before="120"/>
+        <w:jc w:val="center"/>
+      </w:pPr>
+      <w:r>
+        <w:drawing>
+          <wp:inline distT="0" distB="0" distL="0" distR="0">
+            <wp:extent cx="6096000" cy="2266950"/>
+            <wp:effectExtent t="0" r="0" b="0" l="0"/>
+            <wp:docPr id="1" name="Qdrant: recall@10 of HNSW as search breadth grows, and median latency of HNSW and exact search as the collection grows." descr="Qdrant: recall@10 of HNSW as search breadth grows, and median latency of HNSW and exact search as the collection grows." title="Qdrant: recall@10 of HNSW as search breadth grows, and median latency of HNSW and exact search as the collection grows."/>
+            <wp:cNvGraphicFramePr>
+              <a:graphicFrameLocks xmlns:a="http://schemas.openxmlformats.org/drawingml/2006/main" noChangeAspect="1"/>
+            </wp:cNvGraphicFramePr>
+            <a:graphic xmlns:a="http://schemas.openxmlformats.org/drawingml/2006/main">
+              <a:graphicData uri="http://schemas.openxmlformats.org/drawingml/2006/picture">
+                <pic:pic xmlns:pic="http://schemas.openxmlformats.org/drawingml/2006/picture">
+                  <pic:nvPicPr>
+                    <pic:cNvPr id="0" name="" descr=""/>
+                    <pic:cNvPicPr>
+                      <a:picLocks noChangeAspect="1" noChangeArrowheads="1"/>
+                    </pic:cNvPicPr>
+                  </pic:nvPicPr>
+                  <pic:blipFill>
+                    <a:blip r:embed="rId23" cstate="none"/>
+                    <a:srcRect/>
+                    <a:stretch>
+                      <a:fillRect/>
+                    </a:stretch>
+                  </pic:blipFill>
+                  <pic:spPr bwMode="auto">
+                    <a:xfrm>
+                      <a:off x="0" y="0"/>
                       <a:ext cx="6096000" cy="2266950"/>
                     </a:xfrm>
                     <a:prstGeom prst="rect">
@@ -16884,7 +17075,7 @@
           <w:sz w:val="20"/>
           <w:szCs w:val="20"/>
         </w:rPr>
-        <w:t xml:space="preserve">Figure 12.  Qdrant: recall@10 of HNSW as search breadth grows, and median latency of HNSW and exact search as the collection grows.</w:t>
+        <w:t xml:space="preserve">Figure 13.  Qdrant: recall@10 of HNSW as search breadth grows, and median latency of HNSW and exact search as the collection grows.</w:t>
       </w:r>
     </w:p>
     <w:tbl>
@@ -17704,7 +17895,7 @@
                     </pic:cNvPicPr>
                   </pic:nvPicPr>
                   <pic:blipFill>
-                    <a:blip r:embed="rId23" cstate="none"/>
+                    <a:blip r:embed="rId24" cstate="none"/>
                     <a:srcRect/>
                     <a:stretch>
                       <a:fillRect/>
@@ -17739,7 +17930,7 @@
           <w:sz w:val="20"/>
           <w:szCs w:val="20"/>
         </w:rPr>
-        <w:t xml:space="preserve">Figure 13.  API throughput and p95 latency from 1 to 64 concurrent clients (200× corpus, one Uvicorn worker).</w:t>
+        <w:t xml:space="preserve">Figure 14.  API throughput and p95 latency from 1 to 64 concurrent clients (200× corpus, one Uvicorn worker).</w:t>
       </w:r>
     </w:p>
     <w:p>
@@ -17833,7 +18024,7 @@
           <w:sz w:val="24"/>
           <w:szCs w:val="24"/>
         </w:rPr>
-        <w:t xml:space="preserve"> to 9.5 s p95 (Figure 14). Keeping the most relevant evidence also follows the observation that models use long contexts poorly [36].</w:t>
+        <w:t xml:space="preserve"> to 9.5 s p95 (Figure 15). Keeping the most relevant evidence also follows the observation that models use long contexts poorly [36].</w:t>
       </w:r>
     </w:p>
     <w:p>
@@ -17861,7 +18052,7 @@
                     </pic:cNvPicPr>
                   </pic:nvPicPr>
                   <pic:blipFill>
-                    <a:blip r:embed="rId24" cstate="none"/>
+                    <a:blip r:embed="rId25" cstate="none"/>
                     <a:srcRect/>
                     <a:stretch>
                       <a:fillRect/>
@@ -17896,7 +18087,7 @@
           <w:sz w:val="20"/>
           <w:szCs w:val="20"/>
         </w:rPr>
-        <w:t xml:space="preserve">Figure 14.  GraphRAG end-to-end p95 across measured configurations, with mean citation coverage (six acceptance questions).</w:t>
+        <w:t xml:space="preserve">Figure 15.  GraphRAG end-to-end p95 across measured configurations, with mean citation coverage (six acceptance questions).</w:t>
       </w:r>
     </w:p>
     <w:p>
@@ -23385,7 +23576,7 @@
           <w:sz w:val="24"/>
           <w:szCs w:val="24"/>
         </w:rPr>
-        <w:t xml:space="preserve">, which records the provenance of every LLM measurement in Figure 14.</w:t>
+        <w:t xml:space="preserve">, which records the provenance of every LLM measurement in Figure 15.</w:t>
       </w:r>
     </w:p>
     <w:sectPr>

</xml_diff>

<commit_message>
Update Review III documents with hosted databases and real data
Report, manual, slides and runbook cover the AuraDB/Atlas/Redis Cloud/Qdrant
Cloud deployment, the imported feeds and the IP gate, with screenshots and
verification results from the hosted databases.

Co-Authored-By: Claude Opus 5.5 <noreply@anthropic.com>
</commit_message>
<xml_diff>
--- a/review3/Final_Report_GraphRAG_CTI_Platform.docx
+++ b/review3/Final_Report_GraphRAG_CTI_Platform.docx
@@ -1371,7 +1371,7 @@
                 <w:sz w:val="22"/>
                 <w:szCs w:val="22"/>
               </w:rPr>
-              <w:t xml:space="preserve">13</w:t>
+              <w:t xml:space="preserve">15</w:t>
             </w:r>
           </w:p>
         </w:tc>
@@ -1447,7 +1447,7 @@
                 <w:sz w:val="22"/>
                 <w:szCs w:val="22"/>
               </w:rPr>
-              <w:t xml:space="preserve">14</w:t>
+              <w:t xml:space="preserve">16</w:t>
             </w:r>
           </w:p>
         </w:tc>
@@ -1523,7 +1523,7 @@
                 <w:sz w:val="22"/>
                 <w:szCs w:val="22"/>
               </w:rPr>
-              <w:t xml:space="preserve">16</w:t>
+              <w:t xml:space="preserve">19</w:t>
             </w:r>
           </w:p>
         </w:tc>
@@ -1599,7 +1599,7 @@
                 <w:sz w:val="22"/>
                 <w:szCs w:val="22"/>
               </w:rPr>
-              <w:t xml:space="preserve">23</w:t>
+              <w:t xml:space="preserve">26</w:t>
             </w:r>
           </w:p>
         </w:tc>
@@ -1675,7 +1675,7 @@
                 <w:sz w:val="22"/>
                 <w:szCs w:val="22"/>
               </w:rPr>
-              <w:t xml:space="preserve">23</w:t>
+              <w:t xml:space="preserve">26</w:t>
             </w:r>
           </w:p>
         </w:tc>
@@ -1751,7 +1751,7 @@
                 <w:sz w:val="22"/>
                 <w:szCs w:val="22"/>
               </w:rPr>
-              <w:t xml:space="preserve">24</w:t>
+              <w:t xml:space="preserve">27</w:t>
             </w:r>
           </w:p>
         </w:tc>
@@ -1827,7 +1827,7 @@
                 <w:sz w:val="22"/>
                 <w:szCs w:val="22"/>
               </w:rPr>
-              <w:t xml:space="preserve">25</w:t>
+              <w:t xml:space="preserve">28</w:t>
             </w:r>
           </w:p>
         </w:tc>
@@ -1903,7 +1903,7 @@
                 <w:sz w:val="22"/>
                 <w:szCs w:val="22"/>
               </w:rPr>
-              <w:t xml:space="preserve">26</w:t>
+              <w:t xml:space="preserve">29</w:t>
             </w:r>
           </w:p>
         </w:tc>
@@ -2120,7 +2120,7 @@
           <w:sz w:val="24"/>
           <w:szCs w:val="24"/>
         </w:rPr>
-        <w:t xml:space="preserve"> and keep every store-level query within its service level.</w:t>
+        <w:t xml:space="preserve"> and keep every store-level query within its service level. Finally, the four databases were moved to their vendors' own cloud services — Neo4j AuraDB, MongoDB Atlas, Redis Cloud and Qdrant Cloud — and loaded with real public threat intelligence (MITRE ATT&amp;CK v20.0, abuse.ch Feodo Tracker and Emerging Threats): 2,118 graph nodes, 18,478 relationships, 249 reports and 515 live blocked IPs. On the hosted databases all 16 integration tests pass, GraphRAG still recalls 100% of the gold evidence, and an API request from a real botnet C2 address is refused and logged with an automatic expiry.</w:t>
       </w:r>
     </w:p>
     <w:p>
@@ -2414,7 +2414,7 @@
           <w:sz w:val="24"/>
           <w:szCs w:val="24"/>
         </w:rPr>
-        <w:t xml:space="preserve">Review I fixed the design and Review II delivered the first working build. This review closes the remaining gaps recorded in the progress report and evaluates the system as the rubric asks: a complete system with an analyst console of eight pages and 35 API endpoints; a performance evaluation covering query latency, scalability, indexing and benchmarking; and the documentation set (this report, a user manual, slides and a demo runbook). The main engineering contributions of this review are:</w:t>
+        <w:t xml:space="preserve">Review I fixed the design and Review II delivered the first working build. This review closes the remaining gaps recorded in the progress report and evaluates the system as the rubric asks: a complete system with an analyst console of eight pages and 36 API endpoints; a performance evaluation covering query latency, scalability, indexing and benchmarking; and the documentation set (this report, a user manual, slides and a demo runbook). The main engineering contributions of this review are:</w:t>
       </w:r>
     </w:p>
     <w:p>
@@ -2576,7 +2576,7 @@
           <w:sz w:val="24"/>
           <w:szCs w:val="24"/>
         </w:rPr>
-        <w:t xml:space="preserve">15 integration tests</w:t>
+        <w:t xml:space="preserve">16 integration tests</w:t>
       </w:r>
       <w:r>
         <w:rPr>
@@ -2602,7 +2602,79 @@
           <w:sz w:val="24"/>
           <w:szCs w:val="24"/>
         </w:rPr>
-        <w:t xml:space="preserve"> that run the whole stack on every push.</w:t>
+        <w:t xml:space="preserve"> that run the whole stack on every push;</w:t>
+      </w:r>
+    </w:p>
+    <w:p>
+      <w:pPr>
+        <w:pStyle w:val="ListParagraph"/>
+        <w:numPr>
+          <w:ilvl w:val="0"/>
+          <w:numId w:val="2"/>
+        </w:numPr>
+        <w:spacing w:after="70" w:line="300"/>
+      </w:pPr>
+      <w:r>
+        <w:rPr>
+          <w:rFonts w:ascii="Times New Roman" w:cs="Times New Roman" w:eastAsia="Times New Roman" w:hAnsi="Times New Roman"/>
+          <w:sz w:val="24"/>
+          <w:szCs w:val="24"/>
+        </w:rPr>
+        <w:t xml:space="preserve">a </w:t>
+      </w:r>
+      <w:r>
+        <w:rPr>
+          <w:rFonts w:ascii="Times New Roman" w:cs="Times New Roman" w:eastAsia="Times New Roman" w:hAnsi="Times New Roman"/>
+          <w:b/>
+          <w:bCs/>
+          <w:sz w:val="24"/>
+          <w:szCs w:val="24"/>
+        </w:rPr>
+        <w:t xml:space="preserve">hosted deployment</w:t>
+      </w:r>
+      <w:r>
+        <w:rPr>
+          <w:rFonts w:ascii="Times New Roman" w:cs="Times New Roman" w:eastAsia="Times New Roman" w:hAnsi="Times New Roman"/>
+          <w:sz w:val="24"/>
+          <w:szCs w:val="24"/>
+        </w:rPr>
+        <w:t xml:space="preserve"> on the four vendors' cloud services, loaded with </w:t>
+      </w:r>
+      <w:r>
+        <w:rPr>
+          <w:rFonts w:ascii="Times New Roman" w:cs="Times New Roman" w:eastAsia="Times New Roman" w:hAnsi="Times New Roman"/>
+          <w:b/>
+          <w:bCs/>
+          <w:sz w:val="24"/>
+          <w:szCs w:val="24"/>
+        </w:rPr>
+        <w:t xml:space="preserve">real public threat intelligence</w:t>
+      </w:r>
+      <w:r>
+        <w:rPr>
+          <w:rFonts w:ascii="Times New Roman" w:cs="Times New Roman" w:eastAsia="Times New Roman" w:hAnsi="Times New Roman"/>
+          <w:sz w:val="24"/>
+          <w:szCs w:val="24"/>
+        </w:rPr>
+        <w:t xml:space="preserve">, and an </w:t>
+      </w:r>
+      <w:r>
+        <w:rPr>
+          <w:rFonts w:ascii="Times New Roman" w:cs="Times New Roman" w:eastAsia="Times New Roman" w:hAnsi="Times New Roman"/>
+          <w:b/>
+          <w:bCs/>
+          <w:sz w:val="24"/>
+          <w:szCs w:val="24"/>
+        </w:rPr>
+        <w:t xml:space="preserve">IP gate</w:t>
+      </w:r>
+      <w:r>
+        <w:rPr>
+          <w:rFonts w:ascii="Times New Roman" w:cs="Times New Roman" w:eastAsia="Times New Roman" w:hAnsi="Times New Roman"/>
+          <w:sz w:val="24"/>
+          <w:szCs w:val="24"/>
+        </w:rPr>
+        <w:t xml:space="preserve"> that refuses API requests from blocklisted addresses and logs each refusal with a TTL.</w:t>
       </w:r>
     </w:p>
     <w:p>
@@ -7045,7 +7117,7 @@
                 <w:sz w:val="19"/>
                 <w:szCs w:val="19"/>
               </w:rPr>
-              <w:t xml:space="preserve">3,520 lines of Python</w:t>
+              <w:t xml:space="preserve">3,643 lines of Python</w:t>
             </w:r>
           </w:p>
         </w:tc>
@@ -7156,7 +7228,7 @@
                 <w:sz w:val="19"/>
                 <w:szCs w:val="19"/>
               </w:rPr>
-              <w:t xml:space="preserve">696 lines</w:t>
+              <w:t xml:space="preserve">1,227 lines</w:t>
             </w:r>
           </w:p>
         </w:tc>
@@ -7232,7 +7304,7 @@
                 <w:sz w:val="19"/>
                 <w:szCs w:val="19"/>
               </w:rPr>
-              <w:t xml:space="preserve">16 unit tests and 15 integration tests</w:t>
+              <w:t xml:space="preserve">18 unit tests and 16 integration tests</w:t>
             </w:r>
           </w:p>
         </w:tc>
@@ -7267,7 +7339,7 @@
                 <w:sz w:val="19"/>
                 <w:szCs w:val="19"/>
               </w:rPr>
-              <w:t xml:space="preserve">381 lines</w:t>
+              <w:t xml:space="preserve">425 lines</w:t>
             </w:r>
           </w:p>
         </w:tc>
@@ -7378,7 +7450,7 @@
                 <w:sz w:val="19"/>
                 <w:szCs w:val="19"/>
               </w:rPr>
-              <w:t xml:space="preserve">2,003 lines</w:t>
+              <w:t xml:space="preserve">2,045 lines</w:t>
             </w:r>
           </w:p>
         </w:tc>
@@ -8373,7 +8445,7 @@
                 <w:sz w:val="19"/>
                 <w:szCs w:val="19"/>
               </w:rPr>
-              <w:t xml:space="preserve">Audit</w:t>
+              <w:t xml:space="preserve">IP gate</w:t>
             </w:r>
           </w:p>
         </w:tc>
@@ -8408,7 +8480,7 @@
                 <w:sz w:val="19"/>
                 <w:szCs w:val="19"/>
               </w:rPr>
-              <w:t xml:space="preserve">every answer stores its hops, chunks, documents and IOC states; replay re-verifies each against the live stores</w:t>
+              <w:t xml:space="preserve">every API request from an address live on the Redis blocklist gets HTTP 403 (health checks excepted); each refusal is logged to MongoDB blocked_requests with expires_at, and a TTL index deletes it after 7 days; X-Forwarded-For is honoured only behind a trusted proxy; a Redis outage lets requests through (fail open) while /api/enforce/* stays fail closed</w:t>
             </w:r>
           </w:p>
         </w:tc>
@@ -8449,7 +8521,7 @@
                 <w:sz w:val="19"/>
                 <w:szCs w:val="19"/>
               </w:rPr>
-              <w:t xml:space="preserve">Data residency</w:t>
+              <w:t xml:space="preserve">Audit</w:t>
             </w:r>
           </w:p>
         </w:tc>
@@ -8484,7 +8556,83 @@
                 <w:sz w:val="19"/>
                 <w:szCs w:val="19"/>
               </w:rPr>
-              <w:t xml:space="preserve">local LLM through Ollama and local embeddings; no cloud API is called (NFR1)</w:t>
+              <w:t xml:space="preserve">every answer stores its hops, chunks, documents and IOC states; replay re-verifies each against the live stores</w:t>
+            </w:r>
+          </w:p>
+        </w:tc>
+      </w:tr>
+      <w:tr>
+        <w:trPr>
+          <w:cantSplit/>
+          <w:tblHeader w:val="false"/>
+        </w:trPr>
+        <w:tc>
+          <w:tcPr>
+            <w:tcW w:type="dxa" w:w="3000"/>
+            <w:tcBorders>
+              <w:top w:val="single" w:color="A0A7B0" w:sz="4"/>
+              <w:left w:val="single" w:color="A0A7B0" w:sz="4"/>
+              <w:bottom w:val="single" w:color="A0A7B0" w:sz="4"/>
+              <w:right w:val="single" w:color="A0A7B0" w:sz="4"/>
+            </w:tcBorders>
+            <w:shd w:fill="FFFFFF" w:val="clear"/>
+            <w:tcMar>
+              <w:top w:type="dxa" w:w="50"/>
+              <w:left w:type="dxa" w:w="80"/>
+              <w:bottom w:type="dxa" w:w="50"/>
+              <w:right w:type="dxa" w:w="80"/>
+            </w:tcMar>
+            <w:vAlign w:val="center"/>
+          </w:tcPr>
+          <w:p>
+            <w:pPr>
+              <w:spacing w:after="0" w:line="260"/>
+              <w:jc w:val="left"/>
+            </w:pPr>
+            <w:r>
+              <w:rPr>
+                <w:rFonts w:ascii="Times New Roman" w:cs="Times New Roman" w:eastAsia="Times New Roman" w:hAnsi="Times New Roman"/>
+                <w:b w:val="false"/>
+                <w:bCs w:val="false"/>
+                <w:sz w:val="19"/>
+                <w:szCs w:val="19"/>
+              </w:rPr>
+              <w:t xml:space="preserve">Data residency</w:t>
+            </w:r>
+          </w:p>
+        </w:tc>
+        <w:tc>
+          <w:tcPr>
+            <w:tcW w:type="dxa" w:w="6638"/>
+            <w:tcBorders>
+              <w:top w:val="single" w:color="A0A7B0" w:sz="4"/>
+              <w:left w:val="single" w:color="A0A7B0" w:sz="4"/>
+              <w:bottom w:val="single" w:color="A0A7B0" w:sz="4"/>
+              <w:right w:val="single" w:color="A0A7B0" w:sz="4"/>
+            </w:tcBorders>
+            <w:shd w:fill="FFFFFF" w:val="clear"/>
+            <w:tcMar>
+              <w:top w:type="dxa" w:w="50"/>
+              <w:left w:type="dxa" w:w="80"/>
+              <w:bottom w:type="dxa" w:w="50"/>
+              <w:right w:type="dxa" w:w="80"/>
+            </w:tcMar>
+            <w:vAlign w:val="center"/>
+          </w:tcPr>
+          <w:p>
+            <w:pPr>
+              <w:spacing w:after="0" w:line="260"/>
+              <w:jc w:val="left"/>
+            </w:pPr>
+            <w:r>
+              <w:rPr>
+                <w:rFonts w:ascii="Times New Roman" w:cs="Times New Roman" w:eastAsia="Times New Roman" w:hAnsi="Times New Roman"/>
+                <w:b w:val="false"/>
+                <w:bCs w:val="false"/>
+                <w:sz w:val="19"/>
+                <w:szCs w:val="19"/>
+              </w:rPr>
+              <w:t xml:space="preserve">local LLM through Ollama and local embeddings; no LLM or embedding API is called (NFR1). The databases may be local containers or the vendors' hosted services (Section 6.8)</w:t>
             </w:r>
           </w:p>
         </w:tc>
@@ -8702,7 +8850,7 @@
           <w:sz w:val="24"/>
           <w:szCs w:val="24"/>
         </w:rPr>
-        <w:t xml:space="preserve">Each store can also be inspected directly in its native tool, independently of the platform (Figure 7): Neo4j Browser runs Cypher against the live graph — </w:t>
+        <w:t xml:space="preserve">Each store can also be inspected directly in its native tool, independently of the platform (Figure 7, local stack with the seed corpus): Neo4j Browser runs Cypher against the live graph — </w:t>
       </w:r>
       <w:r>
         <w:rPr>
@@ -8866,6 +9014,1670 @@
     </w:p>
     <w:p>
       <w:pPr>
+        <w:pStyle w:val="Heading2"/>
+        <w:keepNext/>
+        <w:spacing w:after="120" w:before="240"/>
+      </w:pPr>
+      <w:r>
+        <w:rPr>
+          <w:rFonts w:ascii="Times New Roman" w:cs="Times New Roman" w:eastAsia="Times New Roman" w:hAnsi="Times New Roman"/>
+          <w:b/>
+          <w:bCs/>
+          <w:color w:val="1B4F72"/>
+          <w:sz w:val="26"/>
+          <w:szCs w:val="26"/>
+        </w:rPr>
+        <w:t xml:space="preserve">6.8  Hosted deployment on the vendors' cloud services</w:t>
+      </w:r>
+    </w:p>
+    <w:p>
+      <w:pPr>
+        <w:spacing w:after="160" w:line="340"/>
+        <w:jc w:val="both"/>
+      </w:pPr>
+      <w:r>
+        <w:rPr>
+          <w:rFonts w:ascii="Times New Roman" w:cs="Times New Roman" w:eastAsia="Times New Roman" w:hAnsi="Times New Roman"/>
+          <w:sz w:val="24"/>
+          <w:szCs w:val="24"/>
+        </w:rPr>
+        <w:t xml:space="preserve">The same code runs unchanged against each database vendor's own hosted service. </w:t>
+      </w:r>
+      <w:r>
+        <w:rPr>
+          <w:rFonts w:ascii="Courier New" w:cs="Courier New" w:eastAsia="Courier New" w:hAnsi="Courier New"/>
+          <w:sz w:val="20"/>
+          <w:szCs w:val="20"/>
+        </w:rPr>
+        <w:t xml:space="preserve">.env.cloud</w:t>
+      </w:r>
+      <w:r>
+        <w:rPr>
+          <w:rFonts w:ascii="Times New Roman" w:cs="Times New Roman" w:eastAsia="Times New Roman" w:hAnsi="Times New Roman"/>
+          <w:sz w:val="24"/>
+          <w:szCs w:val="24"/>
+        </w:rPr>
+        <w:t xml:space="preserve"> (git-ignored) holds the four connection strings; </w:t>
+      </w:r>
+      <w:r>
+        <w:rPr>
+          <w:rFonts w:ascii="Courier New" w:cs="Courier New" w:eastAsia="Courier New" w:hAnsi="Courier New"/>
+          <w:sz w:val="20"/>
+          <w:szCs w:val="20"/>
+        </w:rPr>
+        <w:t xml:space="preserve">make cloud-check</w:t>
+      </w:r>
+      <w:r>
+        <w:rPr>
+          <w:rFonts w:ascii="Times New Roman" w:cs="Times New Roman" w:eastAsia="Times New Roman" w:hAnsi="Times New Roman"/>
+          <w:sz w:val="24"/>
+          <w:szCs w:val="24"/>
+        </w:rPr>
+        <w:t xml:space="preserve"> connects read-only and prints each server's hostname and version, </w:t>
+      </w:r>
+      <w:r>
+        <w:rPr>
+          <w:rFonts w:ascii="Courier New" w:cs="Courier New" w:eastAsia="Courier New" w:hAnsi="Courier New"/>
+          <w:sz w:val="20"/>
+          <w:szCs w:val="20"/>
+        </w:rPr>
+        <w:t xml:space="preserve">make cloud-seed</w:t>
+      </w:r>
+      <w:r>
+        <w:rPr>
+          <w:rFonts w:ascii="Times New Roman" w:cs="Times New Roman" w:eastAsia="Times New Roman" w:hAnsi="Times New Roman"/>
+          <w:sz w:val="24"/>
+          <w:szCs w:val="24"/>
+        </w:rPr>
+        <w:t xml:space="preserve"> and </w:t>
+      </w:r>
+      <w:r>
+        <w:rPr>
+          <w:rFonts w:ascii="Courier New" w:cs="Courier New" w:eastAsia="Courier New" w:hAnsi="Courier New"/>
+          <w:sz w:val="20"/>
+          <w:szCs w:val="20"/>
+        </w:rPr>
+        <w:t xml:space="preserve">make cloud-import-feeds</w:t>
+      </w:r>
+      <w:r>
+        <w:rPr>
+          <w:rFonts w:ascii="Times New Roman" w:cs="Times New Roman" w:eastAsia="Times New Roman" w:hAnsi="Times New Roman"/>
+          <w:sz w:val="24"/>
+          <w:szCs w:val="24"/>
+        </w:rPr>
+        <w:t xml:space="preserve"> load the data, and </w:t>
+      </w:r>
+      <w:r>
+        <w:rPr>
+          <w:rFonts w:ascii="Courier New" w:cs="Courier New" w:eastAsia="Courier New" w:hAnsi="Courier New"/>
+          <w:sz w:val="20"/>
+          <w:szCs w:val="20"/>
+        </w:rPr>
+        <w:t xml:space="preserve">make cloud-api</w:t>
+      </w:r>
+      <w:r>
+        <w:rPr>
+          <w:rFonts w:ascii="Times New Roman" w:cs="Times New Roman" w:eastAsia="Times New Roman" w:hAnsi="Times New Roman"/>
+          <w:sz w:val="24"/>
+          <w:szCs w:val="24"/>
+        </w:rPr>
+        <w:t xml:space="preserve"> serves the console from them. Only the databases are hosted: the API, the console and the LLM stay on the analyst's machine, and timeouts are longer for remote stores. Table 7 lists the deployment as verified on 2026-10-27; Figure 8 shows the Operations page reporting each hosted store.</w:t>
+      </w:r>
+    </w:p>
+    <w:tbl>
+      <w:tblPr>
+        <w:tblW w:type="dxa" w:w="9638"/>
+        <w:tblBorders>
+          <w:top w:val="single" w:color="auto" w:sz="4"/>
+          <w:left w:val="single" w:color="auto" w:sz="4"/>
+          <w:bottom w:val="single" w:color="auto" w:sz="4"/>
+          <w:right w:val="single" w:color="auto" w:sz="4"/>
+          <w:insideH w:val="single" w:color="auto" w:sz="4"/>
+          <w:insideV w:val="single" w:color="auto" w:sz="4"/>
+        </w:tblBorders>
+      </w:tblPr>
+      <w:tblGrid>
+        <w:gridCol w:w="1500"/>
+        <w:gridCol w:w="2500"/>
+        <w:gridCol w:w="3400"/>
+        <w:gridCol w:w="2238"/>
+      </w:tblGrid>
+      <w:tr>
+        <w:trPr>
+          <w:cantSplit/>
+          <w:tblHeader/>
+        </w:trPr>
+        <w:tc>
+          <w:tcPr>
+            <w:tcW w:type="dxa" w:w="1500"/>
+            <w:tcBorders>
+              <w:top w:val="single" w:color="A0A7B0" w:sz="4"/>
+              <w:left w:val="single" w:color="A0A7B0" w:sz="4"/>
+              <w:bottom w:val="single" w:color="A0A7B0" w:sz="4"/>
+              <w:right w:val="single" w:color="A0A7B0" w:sz="4"/>
+            </w:tcBorders>
+            <w:shd w:fill="E8EEF4" w:val="clear"/>
+            <w:tcMar>
+              <w:top w:type="dxa" w:w="50"/>
+              <w:left w:type="dxa" w:w="80"/>
+              <w:bottom w:type="dxa" w:w="50"/>
+              <w:right w:type="dxa" w:w="80"/>
+            </w:tcMar>
+            <w:vAlign w:val="center"/>
+          </w:tcPr>
+          <w:p>
+            <w:pPr>
+              <w:spacing w:after="0" w:line="260"/>
+              <w:jc w:val="center"/>
+            </w:pPr>
+            <w:r>
+              <w:rPr>
+                <w:rFonts w:ascii="Times New Roman" w:cs="Times New Roman" w:eastAsia="Times New Roman" w:hAnsi="Times New Roman"/>
+                <w:b/>
+                <w:bCs/>
+                <w:sz w:val="18"/>
+                <w:szCs w:val="18"/>
+              </w:rPr>
+              <w:t xml:space="preserve">Store</w:t>
+            </w:r>
+          </w:p>
+        </w:tc>
+        <w:tc>
+          <w:tcPr>
+            <w:tcW w:type="dxa" w:w="2500"/>
+            <w:tcBorders>
+              <w:top w:val="single" w:color="A0A7B0" w:sz="4"/>
+              <w:left w:val="single" w:color="A0A7B0" w:sz="4"/>
+              <w:bottom w:val="single" w:color="A0A7B0" w:sz="4"/>
+              <w:right w:val="single" w:color="A0A7B0" w:sz="4"/>
+            </w:tcBorders>
+            <w:shd w:fill="E8EEF4" w:val="clear"/>
+            <w:tcMar>
+              <w:top w:type="dxa" w:w="50"/>
+              <w:left w:type="dxa" w:w="80"/>
+              <w:bottom w:type="dxa" w:w="50"/>
+              <w:right w:type="dxa" w:w="80"/>
+            </w:tcMar>
+            <w:vAlign w:val="center"/>
+          </w:tcPr>
+          <w:p>
+            <w:pPr>
+              <w:spacing w:after="0" w:line="260"/>
+              <w:jc w:val="center"/>
+            </w:pPr>
+            <w:r>
+              <w:rPr>
+                <w:rFonts w:ascii="Times New Roman" w:cs="Times New Roman" w:eastAsia="Times New Roman" w:hAnsi="Times New Roman"/>
+                <w:b/>
+                <w:bCs/>
+                <w:sz w:val="18"/>
+                <w:szCs w:val="18"/>
+              </w:rPr>
+              <w:t xml:space="preserve">Service and version</w:t>
+            </w:r>
+          </w:p>
+        </w:tc>
+        <w:tc>
+          <w:tcPr>
+            <w:tcW w:type="dxa" w:w="3400"/>
+            <w:tcBorders>
+              <w:top w:val="single" w:color="A0A7B0" w:sz="4"/>
+              <w:left w:val="single" w:color="A0A7B0" w:sz="4"/>
+              <w:bottom w:val="single" w:color="A0A7B0" w:sz="4"/>
+              <w:right w:val="single" w:color="A0A7B0" w:sz="4"/>
+            </w:tcBorders>
+            <w:shd w:fill="E8EEF4" w:val="clear"/>
+            <w:tcMar>
+              <w:top w:type="dxa" w:w="50"/>
+              <w:left w:type="dxa" w:w="80"/>
+              <w:bottom w:type="dxa" w:w="50"/>
+              <w:right w:type="dxa" w:w="80"/>
+            </w:tcMar>
+            <w:vAlign w:val="center"/>
+          </w:tcPr>
+          <w:p>
+            <w:pPr>
+              <w:spacing w:after="0" w:line="260"/>
+              <w:jc w:val="center"/>
+            </w:pPr>
+            <w:r>
+              <w:rPr>
+                <w:rFonts w:ascii="Times New Roman" w:cs="Times New Roman" w:eastAsia="Times New Roman" w:hAnsi="Times New Roman"/>
+                <w:b/>
+                <w:bCs/>
+                <w:sz w:val="18"/>
+                <w:szCs w:val="18"/>
+              </w:rPr>
+              <w:t xml:space="preserve">Host</w:t>
+            </w:r>
+          </w:p>
+        </w:tc>
+        <w:tc>
+          <w:tcPr>
+            <w:tcW w:type="dxa" w:w="2238"/>
+            <w:tcBorders>
+              <w:top w:val="single" w:color="A0A7B0" w:sz="4"/>
+              <w:left w:val="single" w:color="A0A7B0" w:sz="4"/>
+              <w:bottom w:val="single" w:color="A0A7B0" w:sz="4"/>
+              <w:right w:val="single" w:color="A0A7B0" w:sz="4"/>
+            </w:tcBorders>
+            <w:shd w:fill="E8EEF4" w:val="clear"/>
+            <w:tcMar>
+              <w:top w:type="dxa" w:w="50"/>
+              <w:left w:type="dxa" w:w="80"/>
+              <w:bottom w:type="dxa" w:w="50"/>
+              <w:right w:type="dxa" w:w="80"/>
+            </w:tcMar>
+            <w:vAlign w:val="center"/>
+          </w:tcPr>
+          <w:p>
+            <w:pPr>
+              <w:spacing w:after="0" w:line="260"/>
+              <w:jc w:val="center"/>
+            </w:pPr>
+            <w:r>
+              <w:rPr>
+                <w:rFonts w:ascii="Times New Roman" w:cs="Times New Roman" w:eastAsia="Times New Roman" w:hAnsi="Times New Roman"/>
+                <w:b/>
+                <w:bCs/>
+                <w:sz w:val="18"/>
+                <w:szCs w:val="18"/>
+              </w:rPr>
+              <w:t xml:space="preserve">Contents (ping)</w:t>
+            </w:r>
+          </w:p>
+        </w:tc>
+      </w:tr>
+      <w:tr>
+        <w:trPr>
+          <w:cantSplit/>
+          <w:tblHeader w:val="false"/>
+        </w:trPr>
+        <w:tc>
+          <w:tcPr>
+            <w:tcW w:type="dxa" w:w="1500"/>
+            <w:tcBorders>
+              <w:top w:val="single" w:color="A0A7B0" w:sz="4"/>
+              <w:left w:val="single" w:color="A0A7B0" w:sz="4"/>
+              <w:bottom w:val="single" w:color="A0A7B0" w:sz="4"/>
+              <w:right w:val="single" w:color="A0A7B0" w:sz="4"/>
+            </w:tcBorders>
+            <w:shd w:fill="FFFFFF" w:val="clear"/>
+            <w:tcMar>
+              <w:top w:type="dxa" w:w="50"/>
+              <w:left w:type="dxa" w:w="80"/>
+              <w:bottom w:type="dxa" w:w="50"/>
+              <w:right w:type="dxa" w:w="80"/>
+            </w:tcMar>
+            <w:vAlign w:val="center"/>
+          </w:tcPr>
+          <w:p>
+            <w:pPr>
+              <w:spacing w:after="0" w:line="260"/>
+              <w:jc w:val="left"/>
+            </w:pPr>
+            <w:r>
+              <w:rPr>
+                <w:rFonts w:ascii="Times New Roman" w:cs="Times New Roman" w:eastAsia="Times New Roman" w:hAnsi="Times New Roman"/>
+                <w:b w:val="false"/>
+                <w:bCs w:val="false"/>
+                <w:sz w:val="18"/>
+                <w:szCs w:val="18"/>
+              </w:rPr>
+              <w:t xml:space="preserve">Neo4j</w:t>
+            </w:r>
+          </w:p>
+        </w:tc>
+        <w:tc>
+          <w:tcPr>
+            <w:tcW w:type="dxa" w:w="2500"/>
+            <w:tcBorders>
+              <w:top w:val="single" w:color="A0A7B0" w:sz="4"/>
+              <w:left w:val="single" w:color="A0A7B0" w:sz="4"/>
+              <w:bottom w:val="single" w:color="A0A7B0" w:sz="4"/>
+              <w:right w:val="single" w:color="A0A7B0" w:sz="4"/>
+            </w:tcBorders>
+            <w:shd w:fill="FFFFFF" w:val="clear"/>
+            <w:tcMar>
+              <w:top w:type="dxa" w:w="50"/>
+              <w:left w:type="dxa" w:w="80"/>
+              <w:bottom w:type="dxa" w:w="50"/>
+              <w:right w:type="dxa" w:w="80"/>
+            </w:tcMar>
+            <w:vAlign w:val="center"/>
+          </w:tcPr>
+          <w:p>
+            <w:pPr>
+              <w:spacing w:after="0" w:line="260"/>
+              <w:jc w:val="left"/>
+            </w:pPr>
+            <w:r>
+              <w:rPr>
+                <w:rFonts w:ascii="Times New Roman" w:cs="Times New Roman" w:eastAsia="Times New Roman" w:hAnsi="Times New Roman"/>
+                <w:b w:val="false"/>
+                <w:bCs w:val="false"/>
+                <w:sz w:val="18"/>
+                <w:szCs w:val="18"/>
+              </w:rPr>
+              <w:t xml:space="preserve">Neo4j AuraDB Free, 5.27-aura (enterprise)</w:t>
+            </w:r>
+          </w:p>
+        </w:tc>
+        <w:tc>
+          <w:tcPr>
+            <w:tcW w:type="dxa" w:w="3400"/>
+            <w:tcBorders>
+              <w:top w:val="single" w:color="A0A7B0" w:sz="4"/>
+              <w:left w:val="single" w:color="A0A7B0" w:sz="4"/>
+              <w:bottom w:val="single" w:color="A0A7B0" w:sz="4"/>
+              <w:right w:val="single" w:color="A0A7B0" w:sz="4"/>
+            </w:tcBorders>
+            <w:shd w:fill="FFFFFF" w:val="clear"/>
+            <w:tcMar>
+              <w:top w:type="dxa" w:w="50"/>
+              <w:left w:type="dxa" w:w="80"/>
+              <w:bottom w:type="dxa" w:w="50"/>
+              <w:right w:type="dxa" w:w="80"/>
+            </w:tcMar>
+            <w:vAlign w:val="center"/>
+          </w:tcPr>
+          <w:p>
+            <w:pPr>
+              <w:spacing w:after="0" w:line="260"/>
+              <w:jc w:val="left"/>
+            </w:pPr>
+            <w:r>
+              <w:rPr>
+                <w:rFonts w:ascii="Times New Roman" w:cs="Times New Roman" w:eastAsia="Times New Roman" w:hAnsi="Times New Roman"/>
+                <w:b w:val="false"/>
+                <w:bCs w:val="false"/>
+                <w:sz w:val="18"/>
+                <w:szCs w:val="18"/>
+              </w:rPr>
+              <w:t xml:space="preserve">9cde3461.databases.neo4j.io</w:t>
+            </w:r>
+          </w:p>
+        </w:tc>
+        <w:tc>
+          <w:tcPr>
+            <w:tcW w:type="dxa" w:w="2238"/>
+            <w:tcBorders>
+              <w:top w:val="single" w:color="A0A7B0" w:sz="4"/>
+              <w:left w:val="single" w:color="A0A7B0" w:sz="4"/>
+              <w:bottom w:val="single" w:color="A0A7B0" w:sz="4"/>
+              <w:right w:val="single" w:color="A0A7B0" w:sz="4"/>
+            </w:tcBorders>
+            <w:shd w:fill="FFFFFF" w:val="clear"/>
+            <w:tcMar>
+              <w:top w:type="dxa" w:w="50"/>
+              <w:left w:type="dxa" w:w="80"/>
+              <w:bottom w:type="dxa" w:w="50"/>
+              <w:right w:type="dxa" w:w="80"/>
+            </w:tcMar>
+            <w:vAlign w:val="center"/>
+          </w:tcPr>
+          <w:p>
+            <w:pPr>
+              <w:spacing w:after="0" w:line="260"/>
+              <w:jc w:val="left"/>
+            </w:pPr>
+            <w:r>
+              <w:rPr>
+                <w:rFonts w:ascii="Times New Roman" w:cs="Times New Roman" w:eastAsia="Times New Roman" w:hAnsi="Times New Roman"/>
+                <w:b w:val="false"/>
+                <w:bCs w:val="false"/>
+                <w:sz w:val="18"/>
+                <w:szCs w:val="18"/>
+              </w:rPr>
+              <w:t xml:space="preserve">2118 nodes (783 ms)</w:t>
+            </w:r>
+          </w:p>
+        </w:tc>
+      </w:tr>
+      <w:tr>
+        <w:trPr>
+          <w:cantSplit/>
+          <w:tblHeader w:val="false"/>
+        </w:trPr>
+        <w:tc>
+          <w:tcPr>
+            <w:tcW w:type="dxa" w:w="1500"/>
+            <w:tcBorders>
+              <w:top w:val="single" w:color="A0A7B0" w:sz="4"/>
+              <w:left w:val="single" w:color="A0A7B0" w:sz="4"/>
+              <w:bottom w:val="single" w:color="A0A7B0" w:sz="4"/>
+              <w:right w:val="single" w:color="A0A7B0" w:sz="4"/>
+            </w:tcBorders>
+            <w:shd w:fill="F7F5F1" w:val="clear"/>
+            <w:tcMar>
+              <w:top w:type="dxa" w:w="50"/>
+              <w:left w:type="dxa" w:w="80"/>
+              <w:bottom w:type="dxa" w:w="50"/>
+              <w:right w:type="dxa" w:w="80"/>
+            </w:tcMar>
+            <w:vAlign w:val="center"/>
+          </w:tcPr>
+          <w:p>
+            <w:pPr>
+              <w:spacing w:after="0" w:line="260"/>
+              <w:jc w:val="left"/>
+            </w:pPr>
+            <w:r>
+              <w:rPr>
+                <w:rFonts w:ascii="Times New Roman" w:cs="Times New Roman" w:eastAsia="Times New Roman" w:hAnsi="Times New Roman"/>
+                <w:b w:val="false"/>
+                <w:bCs w:val="false"/>
+                <w:sz w:val="18"/>
+                <w:szCs w:val="18"/>
+              </w:rPr>
+              <w:t xml:space="preserve">MongoDB</w:t>
+            </w:r>
+          </w:p>
+        </w:tc>
+        <w:tc>
+          <w:tcPr>
+            <w:tcW w:type="dxa" w:w="2500"/>
+            <w:tcBorders>
+              <w:top w:val="single" w:color="A0A7B0" w:sz="4"/>
+              <w:left w:val="single" w:color="A0A7B0" w:sz="4"/>
+              <w:bottom w:val="single" w:color="A0A7B0" w:sz="4"/>
+              <w:right w:val="single" w:color="A0A7B0" w:sz="4"/>
+            </w:tcBorders>
+            <w:shd w:fill="F7F5F1" w:val="clear"/>
+            <w:tcMar>
+              <w:top w:type="dxa" w:w="50"/>
+              <w:left w:type="dxa" w:w="80"/>
+              <w:bottom w:type="dxa" w:w="50"/>
+              <w:right w:type="dxa" w:w="80"/>
+            </w:tcMar>
+            <w:vAlign w:val="center"/>
+          </w:tcPr>
+          <w:p>
+            <w:pPr>
+              <w:spacing w:after="0" w:line="260"/>
+              <w:jc w:val="left"/>
+            </w:pPr>
+            <w:r>
+              <w:rPr>
+                <w:rFonts w:ascii="Times New Roman" w:cs="Times New Roman" w:eastAsia="Times New Roman" w:hAnsi="Times New Roman"/>
+                <w:b w:val="false"/>
+                <w:bCs w:val="false"/>
+                <w:sz w:val="18"/>
+                <w:szCs w:val="18"/>
+              </w:rPr>
+              <w:t xml:space="preserve">MongoDB Atlas M0, 8.0.34</w:t>
+            </w:r>
+          </w:p>
+        </w:tc>
+        <w:tc>
+          <w:tcPr>
+            <w:tcW w:type="dxa" w:w="3400"/>
+            <w:tcBorders>
+              <w:top w:val="single" w:color="A0A7B0" w:sz="4"/>
+              <w:left w:val="single" w:color="A0A7B0" w:sz="4"/>
+              <w:bottom w:val="single" w:color="A0A7B0" w:sz="4"/>
+              <w:right w:val="single" w:color="A0A7B0" w:sz="4"/>
+            </w:tcBorders>
+            <w:shd w:fill="F7F5F1" w:val="clear"/>
+            <w:tcMar>
+              <w:top w:type="dxa" w:w="50"/>
+              <w:left w:type="dxa" w:w="80"/>
+              <w:bottom w:type="dxa" w:w="50"/>
+              <w:right w:type="dxa" w:w="80"/>
+            </w:tcMar>
+            <w:vAlign w:val="center"/>
+          </w:tcPr>
+          <w:p>
+            <w:pPr>
+              <w:spacing w:after="0" w:line="260"/>
+              <w:jc w:val="left"/>
+            </w:pPr>
+            <w:r>
+              <w:rPr>
+                <w:rFonts w:ascii="Times New Roman" w:cs="Times New Roman" w:eastAsia="Times New Roman" w:hAnsi="Times New Roman"/>
+                <w:b w:val="false"/>
+                <w:bCs w:val="false"/>
+                <w:sz w:val="18"/>
+                <w:szCs w:val="18"/>
+              </w:rPr>
+              <w:t xml:space="preserve">cluster0.47ee9jp.mongodb.net</w:t>
+            </w:r>
+          </w:p>
+        </w:tc>
+        <w:tc>
+          <w:tcPr>
+            <w:tcW w:type="dxa" w:w="2238"/>
+            <w:tcBorders>
+              <w:top w:val="single" w:color="A0A7B0" w:sz="4"/>
+              <w:left w:val="single" w:color="A0A7B0" w:sz="4"/>
+              <w:bottom w:val="single" w:color="A0A7B0" w:sz="4"/>
+              <w:right w:val="single" w:color="A0A7B0" w:sz="4"/>
+            </w:tcBorders>
+            <w:shd w:fill="F7F5F1" w:val="clear"/>
+            <w:tcMar>
+              <w:top w:type="dxa" w:w="50"/>
+              <w:left w:type="dxa" w:w="80"/>
+              <w:bottom w:type="dxa" w:w="50"/>
+              <w:right w:type="dxa" w:w="80"/>
+            </w:tcMar>
+            <w:vAlign w:val="center"/>
+          </w:tcPr>
+          <w:p>
+            <w:pPr>
+              <w:spacing w:after="0" w:line="260"/>
+              <w:jc w:val="left"/>
+            </w:pPr>
+            <w:r>
+              <w:rPr>
+                <w:rFonts w:ascii="Times New Roman" w:cs="Times New Roman" w:eastAsia="Times New Roman" w:hAnsi="Times New Roman"/>
+                <w:b w:val="false"/>
+                <w:bCs w:val="false"/>
+                <w:sz w:val="18"/>
+                <w:szCs w:val="18"/>
+              </w:rPr>
+              <w:t xml:space="preserve">249 reports (168 ms)</w:t>
+            </w:r>
+          </w:p>
+        </w:tc>
+      </w:tr>
+      <w:tr>
+        <w:trPr>
+          <w:cantSplit/>
+          <w:tblHeader w:val="false"/>
+        </w:trPr>
+        <w:tc>
+          <w:tcPr>
+            <w:tcW w:type="dxa" w:w="1500"/>
+            <w:tcBorders>
+              <w:top w:val="single" w:color="A0A7B0" w:sz="4"/>
+              <w:left w:val="single" w:color="A0A7B0" w:sz="4"/>
+              <w:bottom w:val="single" w:color="A0A7B0" w:sz="4"/>
+              <w:right w:val="single" w:color="A0A7B0" w:sz="4"/>
+            </w:tcBorders>
+            <w:shd w:fill="FFFFFF" w:val="clear"/>
+            <w:tcMar>
+              <w:top w:type="dxa" w:w="50"/>
+              <w:left w:type="dxa" w:w="80"/>
+              <w:bottom w:type="dxa" w:w="50"/>
+              <w:right w:type="dxa" w:w="80"/>
+            </w:tcMar>
+            <w:vAlign w:val="center"/>
+          </w:tcPr>
+          <w:p>
+            <w:pPr>
+              <w:spacing w:after="0" w:line="260"/>
+              <w:jc w:val="left"/>
+            </w:pPr>
+            <w:r>
+              <w:rPr>
+                <w:rFonts w:ascii="Times New Roman" w:cs="Times New Roman" w:eastAsia="Times New Roman" w:hAnsi="Times New Roman"/>
+                <w:b w:val="false"/>
+                <w:bCs w:val="false"/>
+                <w:sz w:val="18"/>
+                <w:szCs w:val="18"/>
+              </w:rPr>
+              <w:t xml:space="preserve">Redis</w:t>
+            </w:r>
+          </w:p>
+        </w:tc>
+        <w:tc>
+          <w:tcPr>
+            <w:tcW w:type="dxa" w:w="2500"/>
+            <w:tcBorders>
+              <w:top w:val="single" w:color="A0A7B0" w:sz="4"/>
+              <w:left w:val="single" w:color="A0A7B0" w:sz="4"/>
+              <w:bottom w:val="single" w:color="A0A7B0" w:sz="4"/>
+              <w:right w:val="single" w:color="A0A7B0" w:sz="4"/>
+            </w:tcBorders>
+            <w:shd w:fill="FFFFFF" w:val="clear"/>
+            <w:tcMar>
+              <w:top w:type="dxa" w:w="50"/>
+              <w:left w:type="dxa" w:w="80"/>
+              <w:bottom w:type="dxa" w:w="50"/>
+              <w:right w:type="dxa" w:w="80"/>
+            </w:tcMar>
+            <w:vAlign w:val="center"/>
+          </w:tcPr>
+          <w:p>
+            <w:pPr>
+              <w:spacing w:after="0" w:line="260"/>
+              <w:jc w:val="left"/>
+            </w:pPr>
+            <w:r>
+              <w:rPr>
+                <w:rFonts w:ascii="Times New Roman" w:cs="Times New Roman" w:eastAsia="Times New Roman" w:hAnsi="Times New Roman"/>
+                <w:b w:val="false"/>
+                <w:bCs w:val="false"/>
+                <w:sz w:val="18"/>
+                <w:szCs w:val="18"/>
+              </w:rPr>
+              <w:t xml:space="preserve">Redis Cloud (free, 30 MB, 100 ops/s), 8.6.2</w:t>
+            </w:r>
+          </w:p>
+        </w:tc>
+        <w:tc>
+          <w:tcPr>
+            <w:tcW w:type="dxa" w:w="3400"/>
+            <w:tcBorders>
+              <w:top w:val="single" w:color="A0A7B0" w:sz="4"/>
+              <w:left w:val="single" w:color="A0A7B0" w:sz="4"/>
+              <w:bottom w:val="single" w:color="A0A7B0" w:sz="4"/>
+              <w:right w:val="single" w:color="A0A7B0" w:sz="4"/>
+            </w:tcBorders>
+            <w:shd w:fill="FFFFFF" w:val="clear"/>
+            <w:tcMar>
+              <w:top w:type="dxa" w:w="50"/>
+              <w:left w:type="dxa" w:w="80"/>
+              <w:bottom w:type="dxa" w:w="50"/>
+              <w:right w:type="dxa" w:w="80"/>
+            </w:tcMar>
+            <w:vAlign w:val="center"/>
+          </w:tcPr>
+          <w:p>
+            <w:pPr>
+              <w:spacing w:after="0" w:line="260"/>
+              <w:jc w:val="left"/>
+            </w:pPr>
+            <w:r>
+              <w:rPr>
+                <w:rFonts w:ascii="Times New Roman" w:cs="Times New Roman" w:eastAsia="Times New Roman" w:hAnsi="Times New Roman"/>
+                <w:b w:val="false"/>
+                <w:bCs w:val="false"/>
+                <w:sz w:val="18"/>
+                <w:szCs w:val="18"/>
+              </w:rPr>
+              <w:t xml:space="preserve">trains-turquoiseish-inherent-33986.db.redis.io</w:t>
+            </w:r>
+          </w:p>
+        </w:tc>
+        <w:tc>
+          <w:tcPr>
+            <w:tcW w:type="dxa" w:w="2238"/>
+            <w:tcBorders>
+              <w:top w:val="single" w:color="A0A7B0" w:sz="4"/>
+              <w:left w:val="single" w:color="A0A7B0" w:sz="4"/>
+              <w:bottom w:val="single" w:color="A0A7B0" w:sz="4"/>
+              <w:right w:val="single" w:color="A0A7B0" w:sz="4"/>
+            </w:tcBorders>
+            <w:shd w:fill="FFFFFF" w:val="clear"/>
+            <w:tcMar>
+              <w:top w:type="dxa" w:w="50"/>
+              <w:left w:type="dxa" w:w="80"/>
+              <w:bottom w:type="dxa" w:w="50"/>
+              <w:right w:type="dxa" w:w="80"/>
+            </w:tcMar>
+            <w:vAlign w:val="center"/>
+          </w:tcPr>
+          <w:p>
+            <w:pPr>
+              <w:spacing w:after="0" w:line="260"/>
+              <w:jc w:val="left"/>
+            </w:pPr>
+            <w:r>
+              <w:rPr>
+                <w:rFonts w:ascii="Times New Roman" w:cs="Times New Roman" w:eastAsia="Times New Roman" w:hAnsi="Times New Roman"/>
+                <w:b w:val="false"/>
+                <w:bCs w:val="false"/>
+                <w:sz w:val="18"/>
+                <w:szCs w:val="18"/>
+              </w:rPr>
+              <w:t xml:space="preserve">515 live IOCs (361 ms)</w:t>
+            </w:r>
+          </w:p>
+        </w:tc>
+      </w:tr>
+      <w:tr>
+        <w:trPr>
+          <w:cantSplit/>
+          <w:tblHeader w:val="false"/>
+        </w:trPr>
+        <w:tc>
+          <w:tcPr>
+            <w:tcW w:type="dxa" w:w="1500"/>
+            <w:tcBorders>
+              <w:top w:val="single" w:color="A0A7B0" w:sz="4"/>
+              <w:left w:val="single" w:color="A0A7B0" w:sz="4"/>
+              <w:bottom w:val="single" w:color="A0A7B0" w:sz="4"/>
+              <w:right w:val="single" w:color="A0A7B0" w:sz="4"/>
+            </w:tcBorders>
+            <w:shd w:fill="F7F5F1" w:val="clear"/>
+            <w:tcMar>
+              <w:top w:type="dxa" w:w="50"/>
+              <w:left w:type="dxa" w:w="80"/>
+              <w:bottom w:type="dxa" w:w="50"/>
+              <w:right w:type="dxa" w:w="80"/>
+            </w:tcMar>
+            <w:vAlign w:val="center"/>
+          </w:tcPr>
+          <w:p>
+            <w:pPr>
+              <w:spacing w:after="0" w:line="260"/>
+              <w:jc w:val="left"/>
+            </w:pPr>
+            <w:r>
+              <w:rPr>
+                <w:rFonts w:ascii="Times New Roman" w:cs="Times New Roman" w:eastAsia="Times New Roman" w:hAnsi="Times New Roman"/>
+                <w:b w:val="false"/>
+                <w:bCs w:val="false"/>
+                <w:sz w:val="18"/>
+                <w:szCs w:val="18"/>
+              </w:rPr>
+              <w:t xml:space="preserve">Qdrant</w:t>
+            </w:r>
+          </w:p>
+        </w:tc>
+        <w:tc>
+          <w:tcPr>
+            <w:tcW w:type="dxa" w:w="2500"/>
+            <w:tcBorders>
+              <w:top w:val="single" w:color="A0A7B0" w:sz="4"/>
+              <w:left w:val="single" w:color="A0A7B0" w:sz="4"/>
+              <w:bottom w:val="single" w:color="A0A7B0" w:sz="4"/>
+              <w:right w:val="single" w:color="A0A7B0" w:sz="4"/>
+            </w:tcBorders>
+            <w:shd w:fill="F7F5F1" w:val="clear"/>
+            <w:tcMar>
+              <w:top w:type="dxa" w:w="50"/>
+              <w:left w:type="dxa" w:w="80"/>
+              <w:bottom w:type="dxa" w:w="50"/>
+              <w:right w:type="dxa" w:w="80"/>
+            </w:tcMar>
+            <w:vAlign w:val="center"/>
+          </w:tcPr>
+          <w:p>
+            <w:pPr>
+              <w:spacing w:after="0" w:line="260"/>
+              <w:jc w:val="left"/>
+            </w:pPr>
+            <w:r>
+              <w:rPr>
+                <w:rFonts w:ascii="Times New Roman" w:cs="Times New Roman" w:eastAsia="Times New Roman" w:hAnsi="Times New Roman"/>
+                <w:b w:val="false"/>
+                <w:bCs w:val="false"/>
+                <w:sz w:val="18"/>
+                <w:szCs w:val="18"/>
+              </w:rPr>
+              <w:t xml:space="preserve">Qdrant Cloud (free, AWS eu-west-1), 1.20.0</w:t>
+            </w:r>
+          </w:p>
+        </w:tc>
+        <w:tc>
+          <w:tcPr>
+            <w:tcW w:type="dxa" w:w="3400"/>
+            <w:tcBorders>
+              <w:top w:val="single" w:color="A0A7B0" w:sz="4"/>
+              <w:left w:val="single" w:color="A0A7B0" w:sz="4"/>
+              <w:bottom w:val="single" w:color="A0A7B0" w:sz="4"/>
+              <w:right w:val="single" w:color="A0A7B0" w:sz="4"/>
+            </w:tcBorders>
+            <w:shd w:fill="F7F5F1" w:val="clear"/>
+            <w:tcMar>
+              <w:top w:type="dxa" w:w="50"/>
+              <w:left w:type="dxa" w:w="80"/>
+              <w:bottom w:type="dxa" w:w="50"/>
+              <w:right w:type="dxa" w:w="80"/>
+            </w:tcMar>
+            <w:vAlign w:val="center"/>
+          </w:tcPr>
+          <w:p>
+            <w:pPr>
+              <w:spacing w:after="0" w:line="260"/>
+              <w:jc w:val="left"/>
+            </w:pPr>
+            <w:r>
+              <w:rPr>
+                <w:rFonts w:ascii="Times New Roman" w:cs="Times New Roman" w:eastAsia="Times New Roman" w:hAnsi="Times New Roman"/>
+                <w:b w:val="false"/>
+                <w:bCs w:val="false"/>
+                <w:sz w:val="18"/>
+                <w:szCs w:val="18"/>
+              </w:rPr>
+              <w:t xml:space="preserve">3f3fa6c2….eu-west-1-0.aws.cloud.qdrant.io</w:t>
+            </w:r>
+          </w:p>
+        </w:tc>
+        <w:tc>
+          <w:tcPr>
+            <w:tcW w:type="dxa" w:w="2238"/>
+            <w:tcBorders>
+              <w:top w:val="single" w:color="A0A7B0" w:sz="4"/>
+              <w:left w:val="single" w:color="A0A7B0" w:sz="4"/>
+              <w:bottom w:val="single" w:color="A0A7B0" w:sz="4"/>
+              <w:right w:val="single" w:color="A0A7B0" w:sz="4"/>
+            </w:tcBorders>
+            <w:shd w:fill="F7F5F1" w:val="clear"/>
+            <w:tcMar>
+              <w:top w:type="dxa" w:w="50"/>
+              <w:left w:type="dxa" w:w="80"/>
+              <w:bottom w:type="dxa" w:w="50"/>
+              <w:right w:type="dxa" w:w="80"/>
+            </w:tcMar>
+            <w:vAlign w:val="center"/>
+          </w:tcPr>
+          <w:p>
+            <w:pPr>
+              <w:spacing w:after="0" w:line="260"/>
+              <w:jc w:val="left"/>
+            </w:pPr>
+            <w:r>
+              <w:rPr>
+                <w:rFonts w:ascii="Times New Roman" w:cs="Times New Roman" w:eastAsia="Times New Roman" w:hAnsi="Times New Roman"/>
+                <w:b w:val="false"/>
+                <w:bCs w:val="false"/>
+                <w:sz w:val="18"/>
+                <w:szCs w:val="18"/>
+              </w:rPr>
+              <w:t xml:space="preserve">server: threat_chunks (794 chunks) (824 ms)</w:t>
+            </w:r>
+          </w:p>
+        </w:tc>
+      </w:tr>
+    </w:tbl>
+    <w:p>
+      <w:pPr>
+        <w:spacing w:after="240" w:before="60"/>
+        <w:jc w:val="center"/>
+      </w:pPr>
+      <w:r>
+        <w:rPr>
+          <w:rFonts w:ascii="Times New Roman" w:cs="Times New Roman" w:eastAsia="Times New Roman" w:hAnsi="Times New Roman"/>
+          <w:i/>
+          <w:iCs/>
+          <w:sz w:val="20"/>
+          <w:szCs w:val="20"/>
+        </w:rPr>
+        <w:t xml:space="preserve">Table 7.  The four hosted databases. All are free tiers; the project uses well under 1% of each quota.</w:t>
+      </w:r>
+    </w:p>
+    <w:p>
+      <w:pPr>
+        <w:keepNext/>
+        <w:spacing w:after="40" w:before="120"/>
+        <w:jc w:val="center"/>
+      </w:pPr>
+      <w:r>
+        <w:drawing>
+          <wp:inline distT="0" distB="0" distL="0" distR="0">
+            <wp:extent cx="6096000" cy="3810000"/>
+            <wp:effectExtent t="0" r="0" b="0" l="0"/>
+            <wp:docPr id="1" name="Operations page with the API on the hosted databases: AuraDB, Atlas, Redis Cloud and Qdrant Cloud, their contents and per-store latency." descr="Operations page with the API on the hosted databases: AuraDB, Atlas, Redis Cloud and Qdrant Cloud, their contents and per-store latency." title="Operations page with the API on the hosted databases: AuraDB, Atlas, Redis Cloud and Qdrant Cloud, their contents and per-store latency."/>
+            <wp:cNvGraphicFramePr>
+              <a:graphicFrameLocks xmlns:a="http://schemas.openxmlformats.org/drawingml/2006/main" noChangeAspect="1"/>
+            </wp:cNvGraphicFramePr>
+            <a:graphic xmlns:a="http://schemas.openxmlformats.org/drawingml/2006/main">
+              <a:graphicData uri="http://schemas.openxmlformats.org/drawingml/2006/picture">
+                <pic:pic xmlns:pic="http://schemas.openxmlformats.org/drawingml/2006/picture">
+                  <pic:nvPicPr>
+                    <pic:cNvPr id="0" name="" descr=""/>
+                    <pic:cNvPicPr>
+                      <a:picLocks noChangeAspect="1" noChangeArrowheads="1"/>
+                    </pic:cNvPicPr>
+                  </pic:nvPicPr>
+                  <pic:blipFill>
+                    <a:blip r:embed="rId18" cstate="none"/>
+                    <a:srcRect/>
+                    <a:stretch>
+                      <a:fillRect/>
+                    </a:stretch>
+                  </pic:blipFill>
+                  <pic:spPr bwMode="auto">
+                    <a:xfrm>
+                      <a:off x="0" y="0"/>
+                      <a:ext cx="6096000" cy="3810000"/>
+                    </a:xfrm>
+                    <a:prstGeom prst="rect">
+                      <a:avLst/>
+                    </a:prstGeom>
+                  </pic:spPr>
+                </pic:pic>
+              </a:graphicData>
+            </a:graphic>
+          </wp:inline>
+        </w:drawing>
+      </w:r>
+    </w:p>
+    <w:p>
+      <w:pPr>
+        <w:spacing w:after="240" w:before="60"/>
+        <w:jc w:val="center"/>
+      </w:pPr>
+      <w:r>
+        <w:rPr>
+          <w:rFonts w:ascii="Times New Roman" w:cs="Times New Roman" w:eastAsia="Times New Roman" w:hAnsi="Times New Roman"/>
+          <w:i/>
+          <w:iCs/>
+          <w:sz w:val="20"/>
+          <w:szCs w:val="20"/>
+        </w:rPr>
+        <w:t xml:space="preserve">Figure 8.  Operations page with the API on the hosted databases: AuraDB, Atlas, Redis Cloud and Qdrant Cloud, their contents and per-store latency.</w:t>
+      </w:r>
+    </w:p>
+    <w:p>
+      <w:pPr>
+        <w:pStyle w:val="Heading2"/>
+        <w:keepNext/>
+        <w:spacing w:after="120" w:before="240"/>
+      </w:pPr>
+      <w:r>
+        <w:rPr>
+          <w:rFonts w:ascii="Times New Roman" w:cs="Times New Roman" w:eastAsia="Times New Roman" w:hAnsi="Times New Roman"/>
+          <w:b/>
+          <w:bCs/>
+          <w:color w:val="1B4F72"/>
+          <w:sz w:val="26"/>
+          <w:szCs w:val="26"/>
+        </w:rPr>
+        <w:t xml:space="preserve">6.9  Real threat intelligence</w:t>
+      </w:r>
+    </w:p>
+    <w:p>
+      <w:pPr>
+        <w:spacing w:after="160" w:line="340"/>
+        <w:jc w:val="both"/>
+      </w:pPr>
+      <w:r>
+        <w:rPr>
+          <w:rFonts w:ascii="Courier New" w:cs="Courier New" w:eastAsia="Courier New" w:hAnsi="Courier New"/>
+          <w:sz w:val="20"/>
+          <w:szCs w:val="20"/>
+        </w:rPr>
+        <w:t xml:space="preserve">make import-feeds</w:t>
+      </w:r>
+      <w:r>
+        <w:rPr>
+          <w:rFonts w:ascii="Times New Roman" w:cs="Times New Roman" w:eastAsia="Times New Roman" w:hAnsi="Times New Roman"/>
+          <w:sz w:val="24"/>
+          <w:szCs w:val="24"/>
+        </w:rPr>
+        <w:t xml:space="preserve"> (</w:t>
+      </w:r>
+      <w:r>
+        <w:rPr>
+          <w:rFonts w:ascii="Courier New" w:cs="Courier New" w:eastAsia="Courier New" w:hAnsi="Courier New"/>
+          <w:sz w:val="20"/>
+          <w:szCs w:val="20"/>
+        </w:rPr>
+        <w:t xml:space="preserve">backend/scripts/import_feeds.py</w:t>
+      </w:r>
+      <w:r>
+        <w:rPr>
+          <w:rFonts w:ascii="Times New Roman" w:cs="Times New Roman" w:eastAsia="Times New Roman" w:hAnsi="Times New Roman"/>
+          <w:sz w:val="24"/>
+          <w:szCs w:val="24"/>
+        </w:rPr>
+        <w:t xml:space="preserve">) adds three public feeds that need no account (Table 8). ATT&amp;CK's STIX bundle is mapped onto the existing schema: intrusion sets become ThreatActor nodes, malware and tools Malware, techniques Technique (sub-techniques fold into their parent) and campaigns Campaign, with USES, EMPLOYS, IMPLEMENTS, USES_MALWARE and ATTRIBUTED_TO_CAMPAIGN edges. ATT&amp;CK's APT28, APT29, Sandworm Team, Lazarus Group, FIN7, APT41, Scattered Spider and Kimsuky, and 13 malware families, merge onto the seed corpus's nodes by name and alias instead of duplicating them. Each group and campaign also becomes a MongoDB report written from ATT&amp;CK's own descriptions, which is chunked into Qdrant. Feodo Tracker C2 servers become Infrastructure nodes that HOST their malware family, and every feed IP becomes an Indicator node and a Redis key whose TTL follows the feed's status (7 days for an online C2, 2–3 days for recent ones, 24 hours for compromised hosts). Writes are batched with UNWIND, and Redis writes are paced under the free plan's 100 operations per second. Names that are ordinary words ("Net", "Silence", "Wiper") are stored with </w:t>
+      </w:r>
+      <w:r>
+        <w:rPr>
+          <w:rFonts w:ascii="Courier New" w:cs="Courier New" w:eastAsia="Courier New" w:hAnsi="Courier New"/>
+          <w:sz w:val="20"/>
+          <w:szCs w:val="20"/>
+        </w:rPr>
+        <w:t xml:space="preserve">linkable=false</w:t>
+      </w:r>
+      <w:r>
+        <w:rPr>
+          <w:rFonts w:ascii="Times New Roman" w:cs="Times New Roman" w:eastAsia="Times New Roman" w:hAnsi="Times New Roman"/>
+          <w:sz w:val="24"/>
+          <w:szCs w:val="24"/>
+        </w:rPr>
+        <w:t xml:space="preserve">, so a question links to them only by ATT&amp;CK id. Figure 9 shows a GraphRAG answer over the imported ATT&amp;CK data.</w:t>
+      </w:r>
+    </w:p>
+    <w:tbl>
+      <w:tblPr>
+        <w:tblW w:type="dxa" w:w="9638"/>
+        <w:tblBorders>
+          <w:top w:val="single" w:color="auto" w:sz="4"/>
+          <w:left w:val="single" w:color="auto" w:sz="4"/>
+          <w:bottom w:val="single" w:color="auto" w:sz="4"/>
+          <w:right w:val="single" w:color="auto" w:sz="4"/>
+          <w:insideH w:val="single" w:color="auto" w:sz="4"/>
+          <w:insideV w:val="single" w:color="auto" w:sz="4"/>
+        </w:tblBorders>
+      </w:tblPr>
+      <w:tblGrid>
+        <w:gridCol w:w="2600"/>
+        <w:gridCol w:w="4400"/>
+        <w:gridCol w:w="2638"/>
+      </w:tblGrid>
+      <w:tr>
+        <w:trPr>
+          <w:cantSplit/>
+          <w:tblHeader/>
+        </w:trPr>
+        <w:tc>
+          <w:tcPr>
+            <w:tcW w:type="dxa" w:w="2600"/>
+            <w:tcBorders>
+              <w:top w:val="single" w:color="A0A7B0" w:sz="4"/>
+              <w:left w:val="single" w:color="A0A7B0" w:sz="4"/>
+              <w:bottom w:val="single" w:color="A0A7B0" w:sz="4"/>
+              <w:right w:val="single" w:color="A0A7B0" w:sz="4"/>
+            </w:tcBorders>
+            <w:shd w:fill="E8EEF4" w:val="clear"/>
+            <w:tcMar>
+              <w:top w:type="dxa" w:w="50"/>
+              <w:left w:type="dxa" w:w="80"/>
+              <w:bottom w:type="dxa" w:w="50"/>
+              <w:right w:type="dxa" w:w="80"/>
+            </w:tcMar>
+            <w:vAlign w:val="center"/>
+          </w:tcPr>
+          <w:p>
+            <w:pPr>
+              <w:spacing w:after="0" w:line="260"/>
+              <w:jc w:val="center"/>
+            </w:pPr>
+            <w:r>
+              <w:rPr>
+                <w:rFonts w:ascii="Times New Roman" w:cs="Times New Roman" w:eastAsia="Times New Roman" w:hAnsi="Times New Roman"/>
+                <w:b/>
+                <w:bCs/>
+                <w:sz w:val="18"/>
+                <w:szCs w:val="18"/>
+              </w:rPr>
+              <w:t xml:space="preserve">Feed</w:t>
+            </w:r>
+          </w:p>
+        </w:tc>
+        <w:tc>
+          <w:tcPr>
+            <w:tcW w:type="dxa" w:w="4400"/>
+            <w:tcBorders>
+              <w:top w:val="single" w:color="A0A7B0" w:sz="4"/>
+              <w:left w:val="single" w:color="A0A7B0" w:sz="4"/>
+              <w:bottom w:val="single" w:color="A0A7B0" w:sz="4"/>
+              <w:right w:val="single" w:color="A0A7B0" w:sz="4"/>
+            </w:tcBorders>
+            <w:shd w:fill="E8EEF4" w:val="clear"/>
+            <w:tcMar>
+              <w:top w:type="dxa" w:w="50"/>
+              <w:left w:type="dxa" w:w="80"/>
+              <w:bottom w:type="dxa" w:w="50"/>
+              <w:right w:type="dxa" w:w="80"/>
+            </w:tcMar>
+            <w:vAlign w:val="center"/>
+          </w:tcPr>
+          <w:p>
+            <w:pPr>
+              <w:spacing w:after="0" w:line="260"/>
+              <w:jc w:val="center"/>
+            </w:pPr>
+            <w:r>
+              <w:rPr>
+                <w:rFonts w:ascii="Times New Roman" w:cs="Times New Roman" w:eastAsia="Times New Roman" w:hAnsi="Times New Roman"/>
+                <w:b/>
+                <w:bCs/>
+                <w:sz w:val="18"/>
+                <w:szCs w:val="18"/>
+              </w:rPr>
+              <w:t xml:space="preserve">What is imported</w:t>
+            </w:r>
+          </w:p>
+        </w:tc>
+        <w:tc>
+          <w:tcPr>
+            <w:tcW w:type="dxa" w:w="2638"/>
+            <w:tcBorders>
+              <w:top w:val="single" w:color="A0A7B0" w:sz="4"/>
+              <w:left w:val="single" w:color="A0A7B0" w:sz="4"/>
+              <w:bottom w:val="single" w:color="A0A7B0" w:sz="4"/>
+              <w:right w:val="single" w:color="A0A7B0" w:sz="4"/>
+            </w:tcBorders>
+            <w:shd w:fill="E8EEF4" w:val="clear"/>
+            <w:tcMar>
+              <w:top w:type="dxa" w:w="50"/>
+              <w:left w:type="dxa" w:w="80"/>
+              <w:bottom w:type="dxa" w:w="50"/>
+              <w:right w:type="dxa" w:w="80"/>
+            </w:tcMar>
+            <w:vAlign w:val="center"/>
+          </w:tcPr>
+          <w:p>
+            <w:pPr>
+              <w:spacing w:after="0" w:line="260"/>
+              <w:jc w:val="center"/>
+            </w:pPr>
+            <w:r>
+              <w:rPr>
+                <w:rFonts w:ascii="Times New Roman" w:cs="Times New Roman" w:eastAsia="Times New Roman" w:hAnsi="Times New Roman"/>
+                <w:b/>
+                <w:bCs/>
+                <w:sz w:val="18"/>
+                <w:szCs w:val="18"/>
+              </w:rPr>
+              <w:t xml:space="preserve">Size</w:t>
+            </w:r>
+          </w:p>
+        </w:tc>
+      </w:tr>
+      <w:tr>
+        <w:trPr>
+          <w:cantSplit/>
+          <w:tblHeader w:val="false"/>
+        </w:trPr>
+        <w:tc>
+          <w:tcPr>
+            <w:tcW w:type="dxa" w:w="2600"/>
+            <w:tcBorders>
+              <w:top w:val="single" w:color="A0A7B0" w:sz="4"/>
+              <w:left w:val="single" w:color="A0A7B0" w:sz="4"/>
+              <w:bottom w:val="single" w:color="A0A7B0" w:sz="4"/>
+              <w:right w:val="single" w:color="A0A7B0" w:sz="4"/>
+            </w:tcBorders>
+            <w:shd w:fill="FFFFFF" w:val="clear"/>
+            <w:tcMar>
+              <w:top w:type="dxa" w:w="50"/>
+              <w:left w:type="dxa" w:w="80"/>
+              <w:bottom w:type="dxa" w:w="50"/>
+              <w:right w:type="dxa" w:w="80"/>
+            </w:tcMar>
+            <w:vAlign w:val="center"/>
+          </w:tcPr>
+          <w:p>
+            <w:pPr>
+              <w:spacing w:after="0" w:line="260"/>
+              <w:jc w:val="left"/>
+            </w:pPr>
+            <w:r>
+              <w:rPr>
+                <w:rFonts w:ascii="Times New Roman" w:cs="Times New Roman" w:eastAsia="Times New Roman" w:hAnsi="Times New Roman"/>
+                <w:b w:val="false"/>
+                <w:bCs w:val="false"/>
+                <w:sz w:val="18"/>
+                <w:szCs w:val="18"/>
+              </w:rPr>
+              <w:t xml:space="preserve">MITRE ATT&amp;CK Enterprise v20.0 (STIX 2.1)</w:t>
+            </w:r>
+          </w:p>
+        </w:tc>
+        <w:tc>
+          <w:tcPr>
+            <w:tcW w:type="dxa" w:w="4400"/>
+            <w:tcBorders>
+              <w:top w:val="single" w:color="A0A7B0" w:sz="4"/>
+              <w:left w:val="single" w:color="A0A7B0" w:sz="4"/>
+              <w:bottom w:val="single" w:color="A0A7B0" w:sz="4"/>
+              <w:right w:val="single" w:color="A0A7B0" w:sz="4"/>
+            </w:tcBorders>
+            <w:shd w:fill="FFFFFF" w:val="clear"/>
+            <w:tcMar>
+              <w:top w:type="dxa" w:w="50"/>
+              <w:left w:type="dxa" w:w="80"/>
+              <w:bottom w:type="dxa" w:w="50"/>
+              <w:right w:type="dxa" w:w="80"/>
+            </w:tcMar>
+            <w:vAlign w:val="center"/>
+          </w:tcPr>
+          <w:p>
+            <w:pPr>
+              <w:spacing w:after="0" w:line="260"/>
+              <w:jc w:val="left"/>
+            </w:pPr>
+            <w:r>
+              <w:rPr>
+                <w:rFonts w:ascii="Times New Roman" w:cs="Times New Roman" w:eastAsia="Times New Roman" w:hAnsi="Times New Roman"/>
+                <w:b w:val="false"/>
+                <w:bCs w:val="false"/>
+                <w:sz w:val="18"/>
+                <w:szCs w:val="18"/>
+              </w:rPr>
+              <w:t xml:space="preserve">groups, malware and tools, techniques, campaigns and their relationships; one report per group and campaign</w:t>
+            </w:r>
+          </w:p>
+        </w:tc>
+        <w:tc>
+          <w:tcPr>
+            <w:tcW w:type="dxa" w:w="2638"/>
+            <w:tcBorders>
+              <w:top w:val="single" w:color="A0A7B0" w:sz="4"/>
+              <w:left w:val="single" w:color="A0A7B0" w:sz="4"/>
+              <w:bottom w:val="single" w:color="A0A7B0" w:sz="4"/>
+              <w:right w:val="single" w:color="A0A7B0" w:sz="4"/>
+            </w:tcBorders>
+            <w:shd w:fill="FFFFFF" w:val="clear"/>
+            <w:tcMar>
+              <w:top w:type="dxa" w:w="50"/>
+              <w:left w:type="dxa" w:w="80"/>
+              <w:bottom w:type="dxa" w:w="50"/>
+              <w:right w:type="dxa" w:w="80"/>
+            </w:tcMar>
+            <w:vAlign w:val="center"/>
+          </w:tcPr>
+          <w:p>
+            <w:pPr>
+              <w:spacing w:after="0" w:line="260"/>
+              <w:jc w:val="left"/>
+            </w:pPr>
+            <w:r>
+              <w:rPr>
+                <w:rFonts w:ascii="Times New Roman" w:cs="Times New Roman" w:eastAsia="Times New Roman" w:hAnsi="Times New Roman"/>
+                <w:b w:val="false"/>
+                <w:bCs w:val="false"/>
+                <w:sz w:val="18"/>
+                <w:szCs w:val="18"/>
+              </w:rPr>
+              <w:t xml:space="preserve">178 groups, 842 software, 227 techniques, 57 campaigns, 16,678 relationships, 237 reports</w:t>
+            </w:r>
+          </w:p>
+        </w:tc>
+      </w:tr>
+      <w:tr>
+        <w:trPr>
+          <w:cantSplit/>
+          <w:tblHeader w:val="false"/>
+        </w:trPr>
+        <w:tc>
+          <w:tcPr>
+            <w:tcW w:type="dxa" w:w="2600"/>
+            <w:tcBorders>
+              <w:top w:val="single" w:color="A0A7B0" w:sz="4"/>
+              <w:left w:val="single" w:color="A0A7B0" w:sz="4"/>
+              <w:bottom w:val="single" w:color="A0A7B0" w:sz="4"/>
+              <w:right w:val="single" w:color="A0A7B0" w:sz="4"/>
+            </w:tcBorders>
+            <w:shd w:fill="F7F5F1" w:val="clear"/>
+            <w:tcMar>
+              <w:top w:type="dxa" w:w="50"/>
+              <w:left w:type="dxa" w:w="80"/>
+              <w:bottom w:type="dxa" w:w="50"/>
+              <w:right w:type="dxa" w:w="80"/>
+            </w:tcMar>
+            <w:vAlign w:val="center"/>
+          </w:tcPr>
+          <w:p>
+            <w:pPr>
+              <w:spacing w:after="0" w:line="260"/>
+              <w:jc w:val="left"/>
+            </w:pPr>
+            <w:r>
+              <w:rPr>
+                <w:rFonts w:ascii="Times New Roman" w:cs="Times New Roman" w:eastAsia="Times New Roman" w:hAnsi="Times New Roman"/>
+                <w:b w:val="false"/>
+                <w:bCs w:val="false"/>
+                <w:sz w:val="18"/>
+                <w:szCs w:val="18"/>
+              </w:rPr>
+              <w:t xml:space="preserve">abuse.ch Feodo Tracker</w:t>
+            </w:r>
+          </w:p>
+        </w:tc>
+        <w:tc>
+          <w:tcPr>
+            <w:tcW w:type="dxa" w:w="4400"/>
+            <w:tcBorders>
+              <w:top w:val="single" w:color="A0A7B0" w:sz="4"/>
+              <w:left w:val="single" w:color="A0A7B0" w:sz="4"/>
+              <w:bottom w:val="single" w:color="A0A7B0" w:sz="4"/>
+              <w:right w:val="single" w:color="A0A7B0" w:sz="4"/>
+            </w:tcBorders>
+            <w:shd w:fill="F7F5F1" w:val="clear"/>
+            <w:tcMar>
+              <w:top w:type="dxa" w:w="50"/>
+              <w:left w:type="dxa" w:w="80"/>
+              <w:bottom w:type="dxa" w:w="50"/>
+              <w:right w:type="dxa" w:w="80"/>
+            </w:tcMar>
+            <w:vAlign w:val="center"/>
+          </w:tcPr>
+          <w:p>
+            <w:pPr>
+              <w:spacing w:after="0" w:line="260"/>
+              <w:jc w:val="left"/>
+            </w:pPr>
+            <w:r>
+              <w:rPr>
+                <w:rFonts w:ascii="Times New Roman" w:cs="Times New Roman" w:eastAsia="Times New Roman" w:hAnsi="Times New Roman"/>
+                <w:b w:val="false"/>
+                <w:bCs w:val="false"/>
+                <w:sz w:val="18"/>
+                <w:szCs w:val="18"/>
+              </w:rPr>
+              <w:t xml:space="preserve">botnet C2 IPs last online since 2025 (QakBot, Emotet), with port, AS, country and status</w:t>
+            </w:r>
+          </w:p>
+        </w:tc>
+        <w:tc>
+          <w:tcPr>
+            <w:tcW w:type="dxa" w:w="2638"/>
+            <w:tcBorders>
+              <w:top w:val="single" w:color="A0A7B0" w:sz="4"/>
+              <w:left w:val="single" w:color="A0A7B0" w:sz="4"/>
+              <w:bottom w:val="single" w:color="A0A7B0" w:sz="4"/>
+              <w:right w:val="single" w:color="A0A7B0" w:sz="4"/>
+            </w:tcBorders>
+            <w:shd w:fill="F7F5F1" w:val="clear"/>
+            <w:tcMar>
+              <w:top w:type="dxa" w:w="50"/>
+              <w:left w:type="dxa" w:w="80"/>
+              <w:bottom w:type="dxa" w:w="50"/>
+              <w:right w:type="dxa" w:w="80"/>
+            </w:tcMar>
+            <w:vAlign w:val="center"/>
+          </w:tcPr>
+          <w:p>
+            <w:pPr>
+              <w:spacing w:after="0" w:line="260"/>
+              <w:jc w:val="left"/>
+            </w:pPr>
+            <w:r>
+              <w:rPr>
+                <w:rFonts w:ascii="Times New Roman" w:cs="Times New Roman" w:eastAsia="Times New Roman" w:hAnsi="Times New Roman"/>
+                <w:b w:val="false"/>
+                <w:bCs w:val="false"/>
+                <w:sz w:val="18"/>
+                <w:szCs w:val="18"/>
+              </w:rPr>
+              <w:t xml:space="preserve">21 C2 servers, one report</w:t>
+            </w:r>
+          </w:p>
+        </w:tc>
+      </w:tr>
+      <w:tr>
+        <w:trPr>
+          <w:cantSplit/>
+          <w:tblHeader w:val="false"/>
+        </w:trPr>
+        <w:tc>
+          <w:tcPr>
+            <w:tcW w:type="dxa" w:w="2600"/>
+            <w:tcBorders>
+              <w:top w:val="single" w:color="A0A7B0" w:sz="4"/>
+              <w:left w:val="single" w:color="A0A7B0" w:sz="4"/>
+              <w:bottom w:val="single" w:color="A0A7B0" w:sz="4"/>
+              <w:right w:val="single" w:color="A0A7B0" w:sz="4"/>
+            </w:tcBorders>
+            <w:shd w:fill="FFFFFF" w:val="clear"/>
+            <w:tcMar>
+              <w:top w:type="dxa" w:w="50"/>
+              <w:left w:type="dxa" w:w="80"/>
+              <w:bottom w:type="dxa" w:w="50"/>
+              <w:right w:type="dxa" w:w="80"/>
+            </w:tcMar>
+            <w:vAlign w:val="center"/>
+          </w:tcPr>
+          <w:p>
+            <w:pPr>
+              <w:spacing w:after="0" w:line="260"/>
+              <w:jc w:val="left"/>
+            </w:pPr>
+            <w:r>
+              <w:rPr>
+                <w:rFonts w:ascii="Times New Roman" w:cs="Times New Roman" w:eastAsia="Times New Roman" w:hAnsi="Times New Roman"/>
+                <w:b w:val="false"/>
+                <w:bCs w:val="false"/>
+                <w:sz w:val="18"/>
+                <w:szCs w:val="18"/>
+              </w:rPr>
+              <w:t xml:space="preserve">Emerging Threats compromised hosts</w:t>
+            </w:r>
+          </w:p>
+        </w:tc>
+        <w:tc>
+          <w:tcPr>
+            <w:tcW w:type="dxa" w:w="4400"/>
+            <w:tcBorders>
+              <w:top w:val="single" w:color="A0A7B0" w:sz="4"/>
+              <w:left w:val="single" w:color="A0A7B0" w:sz="4"/>
+              <w:bottom w:val="single" w:color="A0A7B0" w:sz="4"/>
+              <w:right w:val="single" w:color="A0A7B0" w:sz="4"/>
+            </w:tcBorders>
+            <w:shd w:fill="FFFFFF" w:val="clear"/>
+            <w:tcMar>
+              <w:top w:type="dxa" w:w="50"/>
+              <w:left w:type="dxa" w:w="80"/>
+              <w:bottom w:type="dxa" w:w="50"/>
+              <w:right w:type="dxa" w:w="80"/>
+            </w:tcMar>
+            <w:vAlign w:val="center"/>
+          </w:tcPr>
+          <w:p>
+            <w:pPr>
+              <w:spacing w:after="0" w:line="260"/>
+              <w:jc w:val="left"/>
+            </w:pPr>
+            <w:r>
+              <w:rPr>
+                <w:rFonts w:ascii="Times New Roman" w:cs="Times New Roman" w:eastAsia="Times New Roman" w:hAnsi="Times New Roman"/>
+                <w:b w:val="false"/>
+                <w:bCs w:val="false"/>
+                <w:sz w:val="18"/>
+                <w:szCs w:val="18"/>
+              </w:rPr>
+              <w:t xml:space="preserve">IPs of hosts seen compromised and taking part in attacks</w:t>
+            </w:r>
+          </w:p>
+        </w:tc>
+        <w:tc>
+          <w:tcPr>
+            <w:tcW w:type="dxa" w:w="2638"/>
+            <w:tcBorders>
+              <w:top w:val="single" w:color="A0A7B0" w:sz="4"/>
+              <w:left w:val="single" w:color="A0A7B0" w:sz="4"/>
+              <w:bottom w:val="single" w:color="A0A7B0" w:sz="4"/>
+              <w:right w:val="single" w:color="A0A7B0" w:sz="4"/>
+            </w:tcBorders>
+            <w:shd w:fill="FFFFFF" w:val="clear"/>
+            <w:tcMar>
+              <w:top w:type="dxa" w:w="50"/>
+              <w:left w:type="dxa" w:w="80"/>
+              <w:bottom w:type="dxa" w:w="50"/>
+              <w:right w:type="dxa" w:w="80"/>
+            </w:tcMar>
+            <w:vAlign w:val="center"/>
+          </w:tcPr>
+          <w:p>
+            <w:pPr>
+              <w:spacing w:after="0" w:line="260"/>
+              <w:jc w:val="left"/>
+            </w:pPr>
+            <w:r>
+              <w:rPr>
+                <w:rFonts w:ascii="Times New Roman" w:cs="Times New Roman" w:eastAsia="Times New Roman" w:hAnsi="Times New Roman"/>
+                <w:b w:val="false"/>
+                <w:bCs w:val="false"/>
+                <w:sz w:val="18"/>
+                <w:szCs w:val="18"/>
+              </w:rPr>
+              <w:t xml:space="preserve">482 IPs, one report</w:t>
+            </w:r>
+          </w:p>
+        </w:tc>
+      </w:tr>
+      <w:tr>
+        <w:trPr>
+          <w:cantSplit/>
+          <w:tblHeader w:val="false"/>
+        </w:trPr>
+        <w:tc>
+          <w:tcPr>
+            <w:tcW w:type="dxa" w:w="2600"/>
+            <w:tcBorders>
+              <w:top w:val="single" w:color="A0A7B0" w:sz="4"/>
+              <w:left w:val="single" w:color="A0A7B0" w:sz="4"/>
+              <w:bottom w:val="single" w:color="A0A7B0" w:sz="4"/>
+              <w:right w:val="single" w:color="A0A7B0" w:sz="4"/>
+            </w:tcBorders>
+            <w:shd w:fill="F7F5F1" w:val="clear"/>
+            <w:tcMar>
+              <w:top w:type="dxa" w:w="50"/>
+              <w:left w:type="dxa" w:w="80"/>
+              <w:bottom w:type="dxa" w:w="50"/>
+              <w:right w:type="dxa" w:w="80"/>
+            </w:tcMar>
+            <w:vAlign w:val="center"/>
+          </w:tcPr>
+          <w:p>
+            <w:pPr>
+              <w:spacing w:after="0" w:line="260"/>
+              <w:jc w:val="left"/>
+            </w:pPr>
+            <w:r>
+              <w:rPr>
+                <w:rFonts w:ascii="Times New Roman" w:cs="Times New Roman" w:eastAsia="Times New Roman" w:hAnsi="Times New Roman"/>
+                <w:b w:val="false"/>
+                <w:bCs w:val="false"/>
+                <w:sz w:val="18"/>
+                <w:szCs w:val="18"/>
+              </w:rPr>
+              <w:t xml:space="preserve">Result in the stores</w:t>
+            </w:r>
+          </w:p>
+        </w:tc>
+        <w:tc>
+          <w:tcPr>
+            <w:tcW w:type="dxa" w:w="4400"/>
+            <w:tcBorders>
+              <w:top w:val="single" w:color="A0A7B0" w:sz="4"/>
+              <w:left w:val="single" w:color="A0A7B0" w:sz="4"/>
+              <w:bottom w:val="single" w:color="A0A7B0" w:sz="4"/>
+              <w:right w:val="single" w:color="A0A7B0" w:sz="4"/>
+            </w:tcBorders>
+            <w:shd w:fill="F7F5F1" w:val="clear"/>
+            <w:tcMar>
+              <w:top w:type="dxa" w:w="50"/>
+              <w:left w:type="dxa" w:w="80"/>
+              <w:bottom w:type="dxa" w:w="50"/>
+              <w:right w:type="dxa" w:w="80"/>
+            </w:tcMar>
+            <w:vAlign w:val="center"/>
+          </w:tcPr>
+          <w:p>
+            <w:pPr>
+              <w:spacing w:after="0" w:line="260"/>
+              <w:jc w:val="left"/>
+            </w:pPr>
+            <w:r>
+              <w:rPr>
+                <w:rFonts w:ascii="Times New Roman" w:cs="Times New Roman" w:eastAsia="Times New Roman" w:hAnsi="Times New Roman"/>
+                <w:b w:val="false"/>
+                <w:bCs w:val="false"/>
+                <w:sz w:val="18"/>
+                <w:szCs w:val="18"/>
+              </w:rPr>
+              <w:t xml:space="preserve">Neo4j 2,118 nodes and 18,478 relationships; MongoDB 249 reports; Qdrant 794 chunks; Redis 515 live IOCs</w:t>
+            </w:r>
+          </w:p>
+        </w:tc>
+        <w:tc>
+          <w:tcPr>
+            <w:tcW w:type="dxa" w:w="2638"/>
+            <w:tcBorders>
+              <w:top w:val="single" w:color="A0A7B0" w:sz="4"/>
+              <w:left w:val="single" w:color="A0A7B0" w:sz="4"/>
+              <w:bottom w:val="single" w:color="A0A7B0" w:sz="4"/>
+              <w:right w:val="single" w:color="A0A7B0" w:sz="4"/>
+            </w:tcBorders>
+            <w:shd w:fill="F7F5F1" w:val="clear"/>
+            <w:tcMar>
+              <w:top w:type="dxa" w:w="50"/>
+              <w:left w:type="dxa" w:w="80"/>
+              <w:bottom w:type="dxa" w:w="50"/>
+              <w:right w:type="dxa" w:w="80"/>
+            </w:tcMar>
+            <w:vAlign w:val="center"/>
+          </w:tcPr>
+          <w:p>
+            <w:pPr>
+              <w:spacing w:after="0" w:line="260"/>
+              <w:jc w:val="left"/>
+            </w:pPr>
+            <w:r>
+              <w:rPr>
+                <w:rFonts w:ascii="Times New Roman" w:cs="Times New Roman" w:eastAsia="Times New Roman" w:hAnsi="Times New Roman"/>
+                <w:b w:val="false"/>
+                <w:bCs w:val="false"/>
+                <w:sz w:val="18"/>
+                <w:szCs w:val="18"/>
+              </w:rPr>
+              <w:t xml:space="preserve">import: 5 min over the internet</w:t>
+            </w:r>
+          </w:p>
+        </w:tc>
+      </w:tr>
+    </w:tbl>
+    <w:p>
+      <w:pPr>
+        <w:spacing w:after="240" w:before="60"/>
+        <w:jc w:val="center"/>
+      </w:pPr>
+      <w:r>
+        <w:rPr>
+          <w:rFonts w:ascii="Times New Roman" w:cs="Times New Roman" w:eastAsia="Times New Roman" w:hAnsi="Times New Roman"/>
+          <w:i/>
+          <w:iCs/>
+          <w:sz w:val="20"/>
+          <w:szCs w:val="20"/>
+        </w:rPr>
+        <w:t xml:space="preserve">Table 8.  Public feeds imported into all four stores.</w:t>
+      </w:r>
+    </w:p>
+    <w:p>
+      <w:pPr>
+        <w:keepNext/>
+        <w:spacing w:after="40" w:before="120"/>
+        <w:jc w:val="center"/>
+      </w:pPr>
+      <w:r>
+        <w:drawing>
+          <wp:inline distT="0" distB="0" distL="0" distR="0">
+            <wp:extent cx="6096000" cy="3810000"/>
+            <wp:effectExtent t="0" r="0" b="0" l="0"/>
+            <wp:docPr id="1" name="GraphRAG on the hosted databases: ATT&amp;CK's SolarWinds Compromise (C0024) resolves to APT29 and its malware, every sentence cited, with commodity-tool cautions." descr="GraphRAG on the hosted databases: ATT&amp;CK's SolarWinds Compromise (C0024) resolves to APT29 and its malware, every sentence cited, with commodity-tool cautions." title="GraphRAG on the hosted databases: ATT&amp;CK's SolarWinds Compromise (C0024) resolves to APT29 and its malware, every sentence cited, with commodity-tool cautions."/>
+            <wp:cNvGraphicFramePr>
+              <a:graphicFrameLocks xmlns:a="http://schemas.openxmlformats.org/drawingml/2006/main" noChangeAspect="1"/>
+            </wp:cNvGraphicFramePr>
+            <a:graphic xmlns:a="http://schemas.openxmlformats.org/drawingml/2006/main">
+              <a:graphicData uri="http://schemas.openxmlformats.org/drawingml/2006/picture">
+                <pic:pic xmlns:pic="http://schemas.openxmlformats.org/drawingml/2006/picture">
+                  <pic:nvPicPr>
+                    <pic:cNvPr id="0" name="" descr=""/>
+                    <pic:cNvPicPr>
+                      <a:picLocks noChangeAspect="1" noChangeArrowheads="1"/>
+                    </pic:cNvPicPr>
+                  </pic:nvPicPr>
+                  <pic:blipFill>
+                    <a:blip r:embed="rId19" cstate="none"/>
+                    <a:srcRect/>
+                    <a:stretch>
+                      <a:fillRect/>
+                    </a:stretch>
+                  </pic:blipFill>
+                  <pic:spPr bwMode="auto">
+                    <a:xfrm>
+                      <a:off x="0" y="0"/>
+                      <a:ext cx="6096000" cy="3810000"/>
+                    </a:xfrm>
+                    <a:prstGeom prst="rect">
+                      <a:avLst/>
+                    </a:prstGeom>
+                  </pic:spPr>
+                </pic:pic>
+              </a:graphicData>
+            </a:graphic>
+          </wp:inline>
+        </w:drawing>
+      </w:r>
+    </w:p>
+    <w:p>
+      <w:pPr>
+        <w:spacing w:after="240" w:before="60"/>
+        <w:jc w:val="center"/>
+      </w:pPr>
+      <w:r>
+        <w:rPr>
+          <w:rFonts w:ascii="Times New Roman" w:cs="Times New Roman" w:eastAsia="Times New Roman" w:hAnsi="Times New Roman"/>
+          <w:i/>
+          <w:iCs/>
+          <w:sz w:val="20"/>
+          <w:szCs w:val="20"/>
+        </w:rPr>
+        <w:t xml:space="preserve">Figure 9.  GraphRAG on the hosted databases: ATT&amp;CK's SolarWinds Compromise (C0024) resolves to APT29 and its malware, every sentence cited, with commodity-tool cautions.</w:t>
+      </w:r>
+    </w:p>
+    <w:p>
+      <w:pPr>
         <w:pStyle w:val="Heading1"/>
         <w:pageBreakBefore/>
         <w:pBdr>
@@ -9555,7 +11367,7 @@
           <w:sz w:val="20"/>
           <w:szCs w:val="20"/>
         </w:rPr>
-        <w:t xml:space="preserve">Table 7.  Advanced capabilities of each engine used by the platform.</w:t>
+        <w:t xml:space="preserve">Table 9.  Advanced capabilities of each engine used by the platform.</w:t>
       </w:r>
     </w:p>
     <w:p>
@@ -9857,7 +11669,7 @@
                 <w:sz w:val="19"/>
                 <w:szCs w:val="19"/>
               </w:rPr>
-              <w:t xml:space="preserve">16</w:t>
+              <w:t xml:space="preserve">18</w:t>
             </w:r>
           </w:p>
         </w:tc>
@@ -9968,7 +11780,7 @@
                 <w:sz w:val="19"/>
                 <w:szCs w:val="19"/>
               </w:rPr>
-              <w:t xml:space="preserve">15</w:t>
+              <w:t xml:space="preserve">16</w:t>
             </w:r>
           </w:p>
         </w:tc>
@@ -10355,7 +12167,7 @@
           <w:sz w:val="20"/>
           <w:szCs w:val="20"/>
         </w:rPr>
-        <w:t xml:space="preserve">Table 8.  Test tiers. Integration tests remove everything they write, so they run safely against the demo stack.</w:t>
+        <w:t xml:space="preserve">Table 10.  Test tiers. Integration tests remove everything they write, so they run safely against the demo stack.</w:t>
       </w:r>
     </w:p>
     <w:p>
@@ -10387,7 +12199,7 @@
           <w:sz w:val="24"/>
           <w:szCs w:val="24"/>
         </w:rPr>
-        <w:t xml:space="preserve">The six Appendix A questions of Review I are the acceptance tests. Each must retrieve specified gold edges and gold reports. Table 9 shows the final run with the default model.</w:t>
+        <w:t xml:space="preserve">The six Appendix A questions of Review I are the acceptance tests. Each must retrieve specified gold edges and gold reports. Table 11 shows the final run with the default model.</w:t>
       </w:r>
     </w:p>
     <w:tbl>
@@ -11936,7 +13748,7 @@
           <w:sz w:val="20"/>
           <w:szCs w:val="20"/>
         </w:rPr>
-        <w:t xml:space="preserve">Table 9.  Acceptance results (2026-10-25, llama3.2:3b). Gold edge recall 1.00, gold report recall 1.00, mean citation coverage 0.79.</w:t>
+        <w:t xml:space="preserve">Table 11.  Acceptance results (2026-10-25, llama3.2:3b). Gold edge recall 1.00, gold report recall 1.00, mean citation coverage 0.79.</w:t>
       </w:r>
     </w:p>
     <w:p>
@@ -11951,6 +13763,827 @@
           <w:szCs w:val="24"/>
         </w:rPr>
         <w:t xml:space="preserve">Every question retrieved all of its gold evidence and none was refused. In question 2 the model's draft fell below the coverage threshold and the gate replaced it with the deterministic evidence answer — the intended behaviour, not a failure. Question 6 carries the commodity-hub caution required by UC3. The same questions in retrieve-only mode, as run in CI, reach coverage 1.00 at about 50 ms per question.</w:t>
+      </w:r>
+    </w:p>
+    <w:p>
+      <w:pPr>
+        <w:pStyle w:val="Heading2"/>
+        <w:keepNext/>
+        <w:spacing w:after="120" w:before="240"/>
+      </w:pPr>
+      <w:r>
+        <w:rPr>
+          <w:rFonts w:ascii="Times New Roman" w:cs="Times New Roman" w:eastAsia="Times New Roman" w:hAnsi="Times New Roman"/>
+          <w:b/>
+          <w:bCs/>
+          <w:color w:val="1B4F72"/>
+          <w:sz w:val="26"/>
+          <w:szCs w:val="26"/>
+        </w:rPr>
+        <w:t xml:space="preserve">8.2  Verification on the hosted databases</w:t>
+      </w:r>
+    </w:p>
+    <w:p>
+      <w:pPr>
+        <w:spacing w:after="160" w:line="340"/>
+        <w:jc w:val="both"/>
+      </w:pPr>
+      <w:r>
+        <w:rPr>
+          <w:rFonts w:ascii="Times New Roman" w:cs="Times New Roman" w:eastAsia="Times New Roman" w:hAnsi="Times New Roman"/>
+          <w:sz w:val="24"/>
+          <w:szCs w:val="24"/>
+        </w:rPr>
+        <w:t xml:space="preserve">The four checks below were run against AuraDB, Atlas, Redis Cloud and Qdrant Cloud after the real feeds were loaded (Table 12). Figure 10 shows the refusal log in the console and Figure 11 the blocking key read directly from Redis Cloud.</w:t>
+      </w:r>
+    </w:p>
+    <w:tbl>
+      <w:tblPr>
+        <w:tblW w:type="dxa" w:w="9638"/>
+        <w:tblBorders>
+          <w:top w:val="single" w:color="auto" w:sz="4"/>
+          <w:left w:val="single" w:color="auto" w:sz="4"/>
+          <w:bottom w:val="single" w:color="auto" w:sz="4"/>
+          <w:right w:val="single" w:color="auto" w:sz="4"/>
+          <w:insideH w:val="single" w:color="auto" w:sz="4"/>
+          <w:insideV w:val="single" w:color="auto" w:sz="4"/>
+        </w:tblBorders>
+      </w:tblPr>
+      <w:tblGrid>
+        <w:gridCol w:w="2500"/>
+        <w:gridCol w:w="7138"/>
+      </w:tblGrid>
+      <w:tr>
+        <w:trPr>
+          <w:cantSplit/>
+          <w:tblHeader/>
+        </w:trPr>
+        <w:tc>
+          <w:tcPr>
+            <w:tcW w:type="dxa" w:w="2500"/>
+            <w:tcBorders>
+              <w:top w:val="single" w:color="A0A7B0" w:sz="4"/>
+              <w:left w:val="single" w:color="A0A7B0" w:sz="4"/>
+              <w:bottom w:val="single" w:color="A0A7B0" w:sz="4"/>
+              <w:right w:val="single" w:color="A0A7B0" w:sz="4"/>
+            </w:tcBorders>
+            <w:shd w:fill="E8EEF4" w:val="clear"/>
+            <w:tcMar>
+              <w:top w:type="dxa" w:w="50"/>
+              <w:left w:type="dxa" w:w="80"/>
+              <w:bottom w:type="dxa" w:w="50"/>
+              <w:right w:type="dxa" w:w="80"/>
+            </w:tcMar>
+            <w:vAlign w:val="center"/>
+          </w:tcPr>
+          <w:p>
+            <w:pPr>
+              <w:spacing w:after="0" w:line="260"/>
+              <w:jc w:val="center"/>
+            </w:pPr>
+            <w:r>
+              <w:rPr>
+                <w:rFonts w:ascii="Times New Roman" w:cs="Times New Roman" w:eastAsia="Times New Roman" w:hAnsi="Times New Roman"/>
+                <w:b/>
+                <w:bCs/>
+                <w:sz w:val="18"/>
+                <w:szCs w:val="18"/>
+              </w:rPr>
+              <w:t xml:space="preserve">Check</w:t>
+            </w:r>
+          </w:p>
+        </w:tc>
+        <w:tc>
+          <w:tcPr>
+            <w:tcW w:type="dxa" w:w="7138"/>
+            <w:tcBorders>
+              <w:top w:val="single" w:color="A0A7B0" w:sz="4"/>
+              <w:left w:val="single" w:color="A0A7B0" w:sz="4"/>
+              <w:bottom w:val="single" w:color="A0A7B0" w:sz="4"/>
+              <w:right w:val="single" w:color="A0A7B0" w:sz="4"/>
+            </w:tcBorders>
+            <w:shd w:fill="E8EEF4" w:val="clear"/>
+            <w:tcMar>
+              <w:top w:type="dxa" w:w="50"/>
+              <w:left w:type="dxa" w:w="80"/>
+              <w:bottom w:type="dxa" w:w="50"/>
+              <w:right w:type="dxa" w:w="80"/>
+            </w:tcMar>
+            <w:vAlign w:val="center"/>
+          </w:tcPr>
+          <w:p>
+            <w:pPr>
+              <w:spacing w:after="0" w:line="260"/>
+              <w:jc w:val="center"/>
+            </w:pPr>
+            <w:r>
+              <w:rPr>
+                <w:rFonts w:ascii="Times New Roman" w:cs="Times New Roman" w:eastAsia="Times New Roman" w:hAnsi="Times New Roman"/>
+                <w:b/>
+                <w:bCs/>
+                <w:sz w:val="18"/>
+                <w:szCs w:val="18"/>
+              </w:rPr>
+              <w:t xml:space="preserve">Result</w:t>
+            </w:r>
+          </w:p>
+        </w:tc>
+      </w:tr>
+      <w:tr>
+        <w:trPr>
+          <w:cantSplit/>
+          <w:tblHeader w:val="false"/>
+        </w:trPr>
+        <w:tc>
+          <w:tcPr>
+            <w:tcW w:type="dxa" w:w="2500"/>
+            <w:tcBorders>
+              <w:top w:val="single" w:color="A0A7B0" w:sz="4"/>
+              <w:left w:val="single" w:color="A0A7B0" w:sz="4"/>
+              <w:bottom w:val="single" w:color="A0A7B0" w:sz="4"/>
+              <w:right w:val="single" w:color="A0A7B0" w:sz="4"/>
+            </w:tcBorders>
+            <w:shd w:fill="FFFFFF" w:val="clear"/>
+            <w:tcMar>
+              <w:top w:type="dxa" w:w="50"/>
+              <w:left w:type="dxa" w:w="80"/>
+              <w:bottom w:type="dxa" w:w="50"/>
+              <w:right w:type="dxa" w:w="80"/>
+            </w:tcMar>
+            <w:vAlign w:val="center"/>
+          </w:tcPr>
+          <w:p>
+            <w:pPr>
+              <w:spacing w:after="0" w:line="260"/>
+              <w:jc w:val="left"/>
+            </w:pPr>
+            <w:r>
+              <w:rPr>
+                <w:rFonts w:ascii="Times New Roman" w:cs="Times New Roman" w:eastAsia="Times New Roman" w:hAnsi="Times New Roman"/>
+                <w:b w:val="false"/>
+                <w:bCs w:val="false"/>
+                <w:sz w:val="18"/>
+                <w:szCs w:val="18"/>
+              </w:rPr>
+              <w:t xml:space="preserve">Connection to each database</w:t>
+            </w:r>
+          </w:p>
+        </w:tc>
+        <w:tc>
+          <w:tcPr>
+            <w:tcW w:type="dxa" w:w="7138"/>
+            <w:tcBorders>
+              <w:top w:val="single" w:color="A0A7B0" w:sz="4"/>
+              <w:left w:val="single" w:color="A0A7B0" w:sz="4"/>
+              <w:bottom w:val="single" w:color="A0A7B0" w:sz="4"/>
+              <w:right w:val="single" w:color="A0A7B0" w:sz="4"/>
+            </w:tcBorders>
+            <w:shd w:fill="FFFFFF" w:val="clear"/>
+            <w:tcMar>
+              <w:top w:type="dxa" w:w="50"/>
+              <w:left w:type="dxa" w:w="80"/>
+              <w:bottom w:type="dxa" w:w="50"/>
+              <w:right w:type="dxa" w:w="80"/>
+            </w:tcMar>
+            <w:vAlign w:val="center"/>
+          </w:tcPr>
+          <w:p>
+            <w:pPr>
+              <w:spacing w:after="0" w:line="260"/>
+              <w:jc w:val="left"/>
+            </w:pPr>
+            <w:r>
+              <w:rPr>
+                <w:rFonts w:ascii="Courier New" w:cs="Courier New" w:eastAsia="Courier New" w:hAnsi="Courier New"/>
+                <w:sz w:val="16"/>
+                <w:szCs w:val="16"/>
+              </w:rPr>
+              <w:t xml:space="preserve">make cloud-check</w:t>
+            </w:r>
+            <w:r>
+              <w:rPr>
+                <w:rFonts w:ascii="Times New Roman" w:cs="Times New Roman" w:eastAsia="Times New Roman" w:hAnsi="Times New Roman"/>
+                <w:b w:val="false"/>
+                <w:bCs w:val="false"/>
+                <w:sz w:val="18"/>
+                <w:szCs w:val="18"/>
+              </w:rPr>
+              <w:t xml:space="preserve">: all four reachable over TLS — Neo4j AuraDB Free 5.27-aura, MongoDB Atlas M0 8.0.34, Redis Cloud 8.6.2, Qdrant Cloud 1.20.0</w:t>
+            </w:r>
+          </w:p>
+        </w:tc>
+      </w:tr>
+      <w:tr>
+        <w:trPr>
+          <w:cantSplit/>
+          <w:tblHeader w:val="false"/>
+        </w:trPr>
+        <w:tc>
+          <w:tcPr>
+            <w:tcW w:type="dxa" w:w="2500"/>
+            <w:tcBorders>
+              <w:top w:val="single" w:color="A0A7B0" w:sz="4"/>
+              <w:left w:val="single" w:color="A0A7B0" w:sz="4"/>
+              <w:bottom w:val="single" w:color="A0A7B0" w:sz="4"/>
+              <w:right w:val="single" w:color="A0A7B0" w:sz="4"/>
+            </w:tcBorders>
+            <w:shd w:fill="F7F5F1" w:val="clear"/>
+            <w:tcMar>
+              <w:top w:type="dxa" w:w="50"/>
+              <w:left w:type="dxa" w:w="80"/>
+              <w:bottom w:type="dxa" w:w="50"/>
+              <w:right w:type="dxa" w:w="80"/>
+            </w:tcMar>
+            <w:vAlign w:val="center"/>
+          </w:tcPr>
+          <w:p>
+            <w:pPr>
+              <w:spacing w:after="0" w:line="260"/>
+              <w:jc w:val="left"/>
+            </w:pPr>
+            <w:r>
+              <w:rPr>
+                <w:rFonts w:ascii="Times New Roman" w:cs="Times New Roman" w:eastAsia="Times New Roman" w:hAnsi="Times New Roman"/>
+                <w:b w:val="false"/>
+                <w:bCs w:val="false"/>
+                <w:sz w:val="18"/>
+                <w:szCs w:val="18"/>
+              </w:rPr>
+              <w:t xml:space="preserve">Data stored in each database</w:t>
+            </w:r>
+          </w:p>
+        </w:tc>
+        <w:tc>
+          <w:tcPr>
+            <w:tcW w:type="dxa" w:w="7138"/>
+            <w:tcBorders>
+              <w:top w:val="single" w:color="A0A7B0" w:sz="4"/>
+              <w:left w:val="single" w:color="A0A7B0" w:sz="4"/>
+              <w:bottom w:val="single" w:color="A0A7B0" w:sz="4"/>
+              <w:right w:val="single" w:color="A0A7B0" w:sz="4"/>
+            </w:tcBorders>
+            <w:shd w:fill="F7F5F1" w:val="clear"/>
+            <w:tcMar>
+              <w:top w:type="dxa" w:w="50"/>
+              <w:left w:type="dxa" w:w="80"/>
+              <w:bottom w:type="dxa" w:w="50"/>
+              <w:right w:type="dxa" w:w="80"/>
+            </w:tcMar>
+            <w:vAlign w:val="center"/>
+          </w:tcPr>
+          <w:p>
+            <w:pPr>
+              <w:spacing w:after="0" w:line="260"/>
+              <w:jc w:val="left"/>
+            </w:pPr>
+            <w:r>
+              <w:rPr>
+                <w:rFonts w:ascii="Times New Roman" w:cs="Times New Roman" w:eastAsia="Times New Roman" w:hAnsi="Times New Roman"/>
+                <w:b w:val="false"/>
+                <w:bCs w:val="false"/>
+                <w:sz w:val="18"/>
+                <w:szCs w:val="18"/>
+              </w:rPr>
+              <w:t xml:space="preserve">cross-store integrity check passes on the hosted stores: 249 MongoDB reports = 249 Report nodes = 249 reports with Qdrant chunks; 515 live Redis IOCs, each traceable to an Indicator node or a report</w:t>
+            </w:r>
+          </w:p>
+        </w:tc>
+      </w:tr>
+      <w:tr>
+        <w:trPr>
+          <w:cantSplit/>
+          <w:tblHeader w:val="false"/>
+        </w:trPr>
+        <w:tc>
+          <w:tcPr>
+            <w:tcW w:type="dxa" w:w="2500"/>
+            <w:tcBorders>
+              <w:top w:val="single" w:color="A0A7B0" w:sz="4"/>
+              <w:left w:val="single" w:color="A0A7B0" w:sz="4"/>
+              <w:bottom w:val="single" w:color="A0A7B0" w:sz="4"/>
+              <w:right w:val="single" w:color="A0A7B0" w:sz="4"/>
+            </w:tcBorders>
+            <w:shd w:fill="FFFFFF" w:val="clear"/>
+            <w:tcMar>
+              <w:top w:type="dxa" w:w="50"/>
+              <w:left w:type="dxa" w:w="80"/>
+              <w:bottom w:type="dxa" w:w="50"/>
+              <w:right w:type="dxa" w:w="80"/>
+            </w:tcMar>
+            <w:vAlign w:val="center"/>
+          </w:tcPr>
+          <w:p>
+            <w:pPr>
+              <w:spacing w:after="0" w:line="260"/>
+              <w:jc w:val="left"/>
+            </w:pPr>
+            <w:r>
+              <w:rPr>
+                <w:rFonts w:ascii="Times New Roman" w:cs="Times New Roman" w:eastAsia="Times New Roman" w:hAnsi="Times New Roman"/>
+                <w:b w:val="false"/>
+                <w:bCs w:val="false"/>
+                <w:sz w:val="18"/>
+                <w:szCs w:val="18"/>
+              </w:rPr>
+              <w:t xml:space="preserve">GraphRAG retrieves the data</w:t>
+            </w:r>
+          </w:p>
+        </w:tc>
+        <w:tc>
+          <w:tcPr>
+            <w:tcW w:type="dxa" w:w="7138"/>
+            <w:tcBorders>
+              <w:top w:val="single" w:color="A0A7B0" w:sz="4"/>
+              <w:left w:val="single" w:color="A0A7B0" w:sz="4"/>
+              <w:bottom w:val="single" w:color="A0A7B0" w:sz="4"/>
+              <w:right w:val="single" w:color="A0A7B0" w:sz="4"/>
+            </w:tcBorders>
+            <w:shd w:fill="FFFFFF" w:val="clear"/>
+            <w:tcMar>
+              <w:top w:type="dxa" w:w="50"/>
+              <w:left w:type="dxa" w:w="80"/>
+              <w:bottom w:type="dxa" w:w="50"/>
+              <w:right w:type="dxa" w:w="80"/>
+            </w:tcMar>
+            <w:vAlign w:val="center"/>
+          </w:tcPr>
+          <w:p>
+            <w:pPr>
+              <w:spacing w:after="0" w:line="260"/>
+              <w:jc w:val="left"/>
+            </w:pPr>
+            <w:r>
+              <w:rPr>
+                <w:rFonts w:ascii="Times New Roman" w:cs="Times New Roman" w:eastAsia="Times New Roman" w:hAnsi="Times New Roman"/>
+                <w:b w:val="false"/>
+                <w:bCs w:val="false"/>
+                <w:sz w:val="18"/>
+                <w:szCs w:val="18"/>
+              </w:rPr>
+              <w:t xml:space="preserve">acceptance questions: gold edge recall 1.00, gold report recall 1.00, citation coverage 0.87; real-data questions answered from ATT&amp;CK and Feodo documents (feed-feodo, attack-C0024, attack-G0034)</w:t>
+            </w:r>
+          </w:p>
+        </w:tc>
+      </w:tr>
+      <w:tr>
+        <w:trPr>
+          <w:cantSplit/>
+          <w:tblHeader w:val="false"/>
+        </w:trPr>
+        <w:tc>
+          <w:tcPr>
+            <w:tcW w:type="dxa" w:w="2500"/>
+            <w:tcBorders>
+              <w:top w:val="single" w:color="A0A7B0" w:sz="4"/>
+              <w:left w:val="single" w:color="A0A7B0" w:sz="4"/>
+              <w:bottom w:val="single" w:color="A0A7B0" w:sz="4"/>
+              <w:right w:val="single" w:color="A0A7B0" w:sz="4"/>
+            </w:tcBorders>
+            <w:shd w:fill="F7F5F1" w:val="clear"/>
+            <w:tcMar>
+              <w:top w:type="dxa" w:w="50"/>
+              <w:left w:type="dxa" w:w="80"/>
+              <w:bottom w:type="dxa" w:w="50"/>
+              <w:right w:type="dxa" w:w="80"/>
+            </w:tcMar>
+            <w:vAlign w:val="center"/>
+          </w:tcPr>
+          <w:p>
+            <w:pPr>
+              <w:spacing w:after="0" w:line="260"/>
+              <w:jc w:val="left"/>
+            </w:pPr>
+            <w:r>
+              <w:rPr>
+                <w:rFonts w:ascii="Times New Roman" w:cs="Times New Roman" w:eastAsia="Times New Roman" w:hAnsi="Times New Roman"/>
+                <w:b w:val="false"/>
+                <w:bCs w:val="false"/>
+                <w:sz w:val="18"/>
+                <w:szCs w:val="18"/>
+              </w:rPr>
+              <w:t xml:space="preserve">Blocking by client IP</w:t>
+            </w:r>
+          </w:p>
+        </w:tc>
+        <w:tc>
+          <w:tcPr>
+            <w:tcW w:type="dxa" w:w="7138"/>
+            <w:tcBorders>
+              <w:top w:val="single" w:color="A0A7B0" w:sz="4"/>
+              <w:left w:val="single" w:color="A0A7B0" w:sz="4"/>
+              <w:bottom w:val="single" w:color="A0A7B0" w:sz="4"/>
+              <w:right w:val="single" w:color="A0A7B0" w:sz="4"/>
+            </w:tcBorders>
+            <w:shd w:fill="F7F5F1" w:val="clear"/>
+            <w:tcMar>
+              <w:top w:type="dxa" w:w="50"/>
+              <w:left w:type="dxa" w:w="80"/>
+              <w:bottom w:type="dxa" w:w="50"/>
+              <w:right w:type="dxa" w:w="80"/>
+            </w:tcMar>
+            <w:vAlign w:val="center"/>
+          </w:tcPr>
+          <w:p>
+            <w:pPr>
+              <w:spacing w:after="0" w:line="260"/>
+              <w:jc w:val="left"/>
+            </w:pPr>
+            <w:r>
+              <w:rPr>
+                <w:rFonts w:ascii="Times New Roman" w:cs="Times New Roman" w:eastAsia="Times New Roman" w:hAnsi="Times New Roman"/>
+                <w:b w:val="false"/>
+                <w:bCs w:val="false"/>
+                <w:sz w:val="18"/>
+                <w:szCs w:val="18"/>
+              </w:rPr>
+              <w:t xml:space="preserve">request from 50.16.16.211 (abuse.ch Feodo Tracker QakBot C2, severity critical, TTL 7 days) → HTTP 403 on every route, health check 200; each refusal logged in Atlas with expires_at 7 days ahead</w:t>
+            </w:r>
+          </w:p>
+        </w:tc>
+      </w:tr>
+      <w:tr>
+        <w:trPr>
+          <w:cantSplit/>
+          <w:tblHeader w:val="false"/>
+        </w:trPr>
+        <w:tc>
+          <w:tcPr>
+            <w:tcW w:type="dxa" w:w="2500"/>
+            <w:tcBorders>
+              <w:top w:val="single" w:color="A0A7B0" w:sz="4"/>
+              <w:left w:val="single" w:color="A0A7B0" w:sz="4"/>
+              <w:bottom w:val="single" w:color="A0A7B0" w:sz="4"/>
+              <w:right w:val="single" w:color="A0A7B0" w:sz="4"/>
+            </w:tcBorders>
+            <w:shd w:fill="FFFFFF" w:val="clear"/>
+            <w:tcMar>
+              <w:top w:type="dxa" w:w="50"/>
+              <w:left w:type="dxa" w:w="80"/>
+              <w:bottom w:type="dxa" w:w="50"/>
+              <w:right w:type="dxa" w:w="80"/>
+            </w:tcMar>
+            <w:vAlign w:val="center"/>
+          </w:tcPr>
+          <w:p>
+            <w:pPr>
+              <w:spacing w:after="0" w:line="260"/>
+              <w:jc w:val="left"/>
+            </w:pPr>
+            <w:r>
+              <w:rPr>
+                <w:rFonts w:ascii="Times New Roman" w:cs="Times New Roman" w:eastAsia="Times New Roman" w:hAnsi="Times New Roman"/>
+                <w:b w:val="false"/>
+                <w:bCs w:val="false"/>
+                <w:sz w:val="18"/>
+                <w:szCs w:val="18"/>
+              </w:rPr>
+              <w:t xml:space="preserve">TTL on the refusal log</w:t>
+            </w:r>
+          </w:p>
+        </w:tc>
+        <w:tc>
+          <w:tcPr>
+            <w:tcW w:type="dxa" w:w="7138"/>
+            <w:tcBorders>
+              <w:top w:val="single" w:color="A0A7B0" w:sz="4"/>
+              <w:left w:val="single" w:color="A0A7B0" w:sz="4"/>
+              <w:bottom w:val="single" w:color="A0A7B0" w:sz="4"/>
+              <w:right w:val="single" w:color="A0A7B0" w:sz="4"/>
+            </w:tcBorders>
+            <w:shd w:fill="FFFFFF" w:val="clear"/>
+            <w:tcMar>
+              <w:top w:type="dxa" w:w="50"/>
+              <w:left w:type="dxa" w:w="80"/>
+              <w:bottom w:type="dxa" w:w="50"/>
+              <w:right w:type="dxa" w:w="80"/>
+            </w:tcMar>
+            <w:vAlign w:val="center"/>
+          </w:tcPr>
+          <w:p>
+            <w:pPr>
+              <w:spacing w:after="0" w:line="260"/>
+              <w:jc w:val="left"/>
+            </w:pPr>
+            <w:r>
+              <w:rPr>
+                <w:rFonts w:ascii="Times New Roman" w:cs="Times New Roman" w:eastAsia="Times New Roman" w:hAnsi="Times New Roman"/>
+                <w:b w:val="false"/>
+                <w:bCs w:val="false"/>
+                <w:sz w:val="18"/>
+                <w:szCs w:val="18"/>
+              </w:rPr>
+              <w:t xml:space="preserve">Atlas index expires_at_1 with expireAfterSeconds 0; an already-expired entry was deleted by MongoDB's TTL monitor after 36 s</w:t>
+            </w:r>
+          </w:p>
+        </w:tc>
+      </w:tr>
+      <w:tr>
+        <w:trPr>
+          <w:cantSplit/>
+          <w:tblHeader w:val="false"/>
+        </w:trPr>
+        <w:tc>
+          <w:tcPr>
+            <w:tcW w:type="dxa" w:w="2500"/>
+            <w:tcBorders>
+              <w:top w:val="single" w:color="A0A7B0" w:sz="4"/>
+              <w:left w:val="single" w:color="A0A7B0" w:sz="4"/>
+              <w:bottom w:val="single" w:color="A0A7B0" w:sz="4"/>
+              <w:right w:val="single" w:color="A0A7B0" w:sz="4"/>
+            </w:tcBorders>
+            <w:shd w:fill="F7F5F1" w:val="clear"/>
+            <w:tcMar>
+              <w:top w:type="dxa" w:w="50"/>
+              <w:left w:type="dxa" w:w="80"/>
+              <w:bottom w:type="dxa" w:w="50"/>
+              <w:right w:type="dxa" w:w="80"/>
+            </w:tcMar>
+            <w:vAlign w:val="center"/>
+          </w:tcPr>
+          <w:p>
+            <w:pPr>
+              <w:spacing w:after="0" w:line="260"/>
+              <w:jc w:val="left"/>
+            </w:pPr>
+            <w:r>
+              <w:rPr>
+                <w:rFonts w:ascii="Times New Roman" w:cs="Times New Roman" w:eastAsia="Times New Roman" w:hAnsi="Times New Roman"/>
+                <w:b w:val="false"/>
+                <w:bCs w:val="false"/>
+                <w:sz w:val="18"/>
+                <w:szCs w:val="18"/>
+              </w:rPr>
+              <w:t xml:space="preserve">TTL on the block itself</w:t>
+            </w:r>
+          </w:p>
+        </w:tc>
+        <w:tc>
+          <w:tcPr>
+            <w:tcW w:type="dxa" w:w="7138"/>
+            <w:tcBorders>
+              <w:top w:val="single" w:color="A0A7B0" w:sz="4"/>
+              <w:left w:val="single" w:color="A0A7B0" w:sz="4"/>
+              <w:bottom w:val="single" w:color="A0A7B0" w:sz="4"/>
+              <w:right w:val="single" w:color="A0A7B0" w:sz="4"/>
+            </w:tcBorders>
+            <w:shd w:fill="F7F5F1" w:val="clear"/>
+            <w:tcMar>
+              <w:top w:type="dxa" w:w="50"/>
+              <w:left w:type="dxa" w:w="80"/>
+              <w:bottom w:type="dxa" w:w="50"/>
+              <w:right w:type="dxa" w:w="80"/>
+            </w:tcMar>
+            <w:vAlign w:val="center"/>
+          </w:tcPr>
+          <w:p>
+            <w:pPr>
+              <w:spacing w:after="0" w:line="260"/>
+              <w:jc w:val="left"/>
+            </w:pPr>
+            <w:r>
+              <w:rPr>
+                <w:rFonts w:ascii="Times New Roman" w:cs="Times New Roman" w:eastAsia="Times New Roman" w:hAnsi="Times New Roman"/>
+                <w:b w:val="false"/>
+                <w:bCs w:val="false"/>
+                <w:sz w:val="18"/>
+                <w:szCs w:val="18"/>
+              </w:rPr>
+              <w:t xml:space="preserve">an IP published with a 45 s TTL was refused, then admitted again 47 s later when Redis expired the key</w:t>
+            </w:r>
+          </w:p>
+        </w:tc>
+      </w:tr>
+      <w:tr>
+        <w:trPr>
+          <w:cantSplit/>
+          <w:tblHeader w:val="false"/>
+        </w:trPr>
+        <w:tc>
+          <w:tcPr>
+            <w:tcW w:type="dxa" w:w="2500"/>
+            <w:tcBorders>
+              <w:top w:val="single" w:color="A0A7B0" w:sz="4"/>
+              <w:left w:val="single" w:color="A0A7B0" w:sz="4"/>
+              <w:bottom w:val="single" w:color="A0A7B0" w:sz="4"/>
+              <w:right w:val="single" w:color="A0A7B0" w:sz="4"/>
+            </w:tcBorders>
+            <w:shd w:fill="FFFFFF" w:val="clear"/>
+            <w:tcMar>
+              <w:top w:type="dxa" w:w="50"/>
+              <w:left w:type="dxa" w:w="80"/>
+              <w:bottom w:type="dxa" w:w="50"/>
+              <w:right w:type="dxa" w:w="80"/>
+            </w:tcMar>
+            <w:vAlign w:val="center"/>
+          </w:tcPr>
+          <w:p>
+            <w:pPr>
+              <w:spacing w:after="0" w:line="260"/>
+              <w:jc w:val="left"/>
+            </w:pPr>
+            <w:r>
+              <w:rPr>
+                <w:rFonts w:ascii="Times New Roman" w:cs="Times New Roman" w:eastAsia="Times New Roman" w:hAnsi="Times New Roman"/>
+                <w:b w:val="false"/>
+                <w:bCs w:val="false"/>
+                <w:sz w:val="18"/>
+                <w:szCs w:val="18"/>
+              </w:rPr>
+              <w:t xml:space="preserve">Integration tests</w:t>
+            </w:r>
+          </w:p>
+        </w:tc>
+        <w:tc>
+          <w:tcPr>
+            <w:tcW w:type="dxa" w:w="7138"/>
+            <w:tcBorders>
+              <w:top w:val="single" w:color="A0A7B0" w:sz="4"/>
+              <w:left w:val="single" w:color="A0A7B0" w:sz="4"/>
+              <w:bottom w:val="single" w:color="A0A7B0" w:sz="4"/>
+              <w:right w:val="single" w:color="A0A7B0" w:sz="4"/>
+            </w:tcBorders>
+            <w:shd w:fill="FFFFFF" w:val="clear"/>
+            <w:tcMar>
+              <w:top w:type="dxa" w:w="50"/>
+              <w:left w:type="dxa" w:w="80"/>
+              <w:bottom w:type="dxa" w:w="50"/>
+              <w:right w:type="dxa" w:w="80"/>
+            </w:tcMar>
+            <w:vAlign w:val="center"/>
+          </w:tcPr>
+          <w:p>
+            <w:pPr>
+              <w:spacing w:after="0" w:line="260"/>
+              <w:jc w:val="left"/>
+            </w:pPr>
+            <w:r>
+              <w:rPr>
+                <w:rFonts w:ascii="Times New Roman" w:cs="Times New Roman" w:eastAsia="Times New Roman" w:hAnsi="Times New Roman"/>
+                <w:b w:val="false"/>
+                <w:bCs w:val="false"/>
+                <w:sz w:val="18"/>
+                <w:szCs w:val="18"/>
+              </w:rPr>
+              <w:t xml:space="preserve">16/16 pass against the hosted stores (47 s)</w:t>
+            </w:r>
+          </w:p>
+        </w:tc>
+      </w:tr>
+    </w:tbl>
+    <w:p>
+      <w:pPr>
+        <w:spacing w:after="240" w:before="60"/>
+        <w:jc w:val="center"/>
+      </w:pPr>
+      <w:r>
+        <w:rPr>
+          <w:rFonts w:ascii="Times New Roman" w:cs="Times New Roman" w:eastAsia="Times New Roman" w:hAnsi="Times New Roman"/>
+          <w:i/>
+          <w:iCs/>
+          <w:sz w:val="20"/>
+          <w:szCs w:val="20"/>
+        </w:rPr>
+        <w:t xml:space="preserve">Table 12.  Verification on the hosted databases (2026-10-27).</w:t>
+      </w:r>
+    </w:p>
+    <w:p>
+      <w:pPr>
+        <w:keepNext/>
+        <w:spacing w:after="40" w:before="120"/>
+        <w:jc w:val="center"/>
+      </w:pPr>
+      <w:r>
+        <w:drawing>
+          <wp:inline distT="0" distB="0" distL="0" distR="0">
+            <wp:extent cx="5334000" cy="1276350"/>
+            <wp:effectExtent t="0" r="0" b="0" l="0"/>
+            <wp:docPr id="1" name="IOC blocklist page: API requests from the QakBot C2 address 50.16.16.211 refused, with the time each log entry expires." descr="IOC blocklist page: API requests from the QakBot C2 address 50.16.16.211 refused, with the time each log entry expires." title="IOC blocklist page: API requests from the QakBot C2 address 50.16.16.211 refused, with the time each log entry expires."/>
+            <wp:cNvGraphicFramePr>
+              <a:graphicFrameLocks xmlns:a="http://schemas.openxmlformats.org/drawingml/2006/main" noChangeAspect="1"/>
+            </wp:cNvGraphicFramePr>
+            <a:graphic xmlns:a="http://schemas.openxmlformats.org/drawingml/2006/main">
+              <a:graphicData uri="http://schemas.openxmlformats.org/drawingml/2006/picture">
+                <pic:pic xmlns:pic="http://schemas.openxmlformats.org/drawingml/2006/picture">
+                  <pic:nvPicPr>
+                    <pic:cNvPr id="0" name="" descr=""/>
+                    <pic:cNvPicPr>
+                      <a:picLocks noChangeAspect="1" noChangeArrowheads="1"/>
+                    </pic:cNvPicPr>
+                  </pic:nvPicPr>
+                  <pic:blipFill>
+                    <a:blip r:embed="rId20" cstate="none"/>
+                    <a:srcRect/>
+                    <a:stretch>
+                      <a:fillRect/>
+                    </a:stretch>
+                  </pic:blipFill>
+                  <pic:spPr bwMode="auto">
+                    <a:xfrm>
+                      <a:off x="0" y="0"/>
+                      <a:ext cx="5334000" cy="1276350"/>
+                    </a:xfrm>
+                    <a:prstGeom prst="rect">
+                      <a:avLst/>
+                    </a:prstGeom>
+                  </pic:spPr>
+                </pic:pic>
+              </a:graphicData>
+            </a:graphic>
+          </wp:inline>
+        </w:drawing>
+      </w:r>
+    </w:p>
+    <w:p>
+      <w:pPr>
+        <w:spacing w:after="240" w:before="60"/>
+        <w:jc w:val="center"/>
+      </w:pPr>
+      <w:r>
+        <w:rPr>
+          <w:rFonts w:ascii="Times New Roman" w:cs="Times New Roman" w:eastAsia="Times New Roman" w:hAnsi="Times New Roman"/>
+          <w:i/>
+          <w:iCs/>
+          <w:sz w:val="20"/>
+          <w:szCs w:val="20"/>
+        </w:rPr>
+        <w:t xml:space="preserve">Figure 10.  IOC blocklist page: API requests from the QakBot C2 address 50.16.16.211 refused, with the time each log entry expires.</w:t>
+      </w:r>
+    </w:p>
+    <w:p>
+      <w:pPr>
+        <w:keepNext/>
+        <w:spacing w:after="40" w:before="120"/>
+        <w:jc w:val="center"/>
+      </w:pPr>
+      <w:r>
+        <w:drawing>
+          <wp:inline distT="0" distB="0" distL="0" distR="0">
+            <wp:extent cx="6096000" cy="1285875"/>
+            <wp:effectExtent t="0" r="0" b="0" l="0"/>
+            <wp:docPr id="1" name="Redis Commander connected to Redis Cloud: blocklist keys of two Feodo Tracker QakBot C2 servers and their remaining TTL in seconds." descr="Redis Commander connected to Redis Cloud: blocklist keys of two Feodo Tracker QakBot C2 servers and their remaining TTL in seconds." title="Redis Commander connected to Redis Cloud: blocklist keys of two Feodo Tracker QakBot C2 servers and their remaining TTL in seconds."/>
+            <wp:cNvGraphicFramePr>
+              <a:graphicFrameLocks xmlns:a="http://schemas.openxmlformats.org/drawingml/2006/main" noChangeAspect="1"/>
+            </wp:cNvGraphicFramePr>
+            <a:graphic xmlns:a="http://schemas.openxmlformats.org/drawingml/2006/main">
+              <a:graphicData uri="http://schemas.openxmlformats.org/drawingml/2006/picture">
+                <pic:pic xmlns:pic="http://schemas.openxmlformats.org/drawingml/2006/picture">
+                  <pic:nvPicPr>
+                    <pic:cNvPr id="0" name="" descr=""/>
+                    <pic:cNvPicPr>
+                      <a:picLocks noChangeAspect="1" noChangeArrowheads="1"/>
+                    </pic:cNvPicPr>
+                  </pic:nvPicPr>
+                  <pic:blipFill>
+                    <a:blip r:embed="rId21" cstate="none"/>
+                    <a:srcRect/>
+                    <a:stretch>
+                      <a:fillRect/>
+                    </a:stretch>
+                  </pic:blipFill>
+                  <pic:spPr bwMode="auto">
+                    <a:xfrm>
+                      <a:off x="0" y="0"/>
+                      <a:ext cx="6096000" cy="1285875"/>
+                    </a:xfrm>
+                    <a:prstGeom prst="rect">
+                      <a:avLst/>
+                    </a:prstGeom>
+                  </pic:spPr>
+                </pic:pic>
+              </a:graphicData>
+            </a:graphic>
+          </wp:inline>
+        </w:drawing>
+      </w:r>
+    </w:p>
+    <w:p>
+      <w:pPr>
+        <w:spacing w:after="240" w:before="60"/>
+        <w:jc w:val="center"/>
+      </w:pPr>
+      <w:r>
+        <w:rPr>
+          <w:rFonts w:ascii="Times New Roman" w:cs="Times New Roman" w:eastAsia="Times New Roman" w:hAnsi="Times New Roman"/>
+          <w:i/>
+          <w:iCs/>
+          <w:sz w:val="20"/>
+          <w:szCs w:val="20"/>
+        </w:rPr>
+        <w:t xml:space="preserve">Figure 11.  Redis Commander connected to Redis Cloud: blocklist keys of two Feodo Tracker QakBot C2 servers and their remaining TTL in seconds.</w:t>
+      </w:r>
+    </w:p>
+    <w:p>
+      <w:pPr>
+        <w:spacing w:after="160" w:line="340"/>
+        <w:jc w:val="both"/>
+      </w:pPr>
+      <w:r>
+        <w:rPr>
+          <w:rFonts w:ascii="Times New Roman" w:cs="Times New Roman" w:eastAsia="Times New Roman" w:hAnsi="Times New Roman"/>
+          <w:sz w:val="24"/>
+          <w:szCs w:val="24"/>
+        </w:rPr>
+        <w:t xml:space="preserve">Correctness is unchanged, but latency now includes the internet: a Redis lookup takes 779 ms at p99 (local 1.16 ms) and GraphRAG 18.3 s at p95 (local 12.7 s), so the Redis and GraphRAG targets of NFR2, set for co-located stores, are not met on free tiers in other regions. Graph traversals stay within their 500 ms target (3-hop p95 457 ms).</w:t>
       </w:r>
     </w:p>
     <w:p>
@@ -12464,7 +15097,7 @@
           <w:sz w:val="20"/>
           <w:szCs w:val="20"/>
         </w:rPr>
-        <w:t xml:space="preserve">Table 10.  Benchmark environment.</w:t>
+        <w:t xml:space="preserve">Table 13.  Benchmark environment.</w:t>
       </w:r>
     </w:p>
     <w:p>
@@ -13417,7 +16050,7 @@
           <w:sz w:val="20"/>
           <w:szCs w:val="20"/>
         </w:rPr>
-        <w:t xml:space="preserve">Table 11.  Service-level objectives.</w:t>
+        <w:t xml:space="preserve">Table 14.  Service-level objectives.</w:t>
       </w:r>
     </w:p>
     <w:p>
@@ -14979,7 +17612,7 @@
           <w:sz w:val="20"/>
           <w:szCs w:val="20"/>
         </w:rPr>
-        <w:t xml:space="preserve">Table 12.  Corpus at each scale, loaded through the production seed path.</w:t>
+        <w:t xml:space="preserve">Table 15.  Corpus at each scale, loaded through the production seed path.</w:t>
       </w:r>
     </w:p>
     <w:p>
@@ -15007,7 +17640,7 @@
                     </pic:cNvPicPr>
                   </pic:nvPicPr>
                   <pic:blipFill>
-                    <a:blip r:embed="rId18" cstate="none"/>
+                    <a:blip r:embed="rId22" cstate="none"/>
                     <a:srcRect/>
                     <a:stretch>
                       <a:fillRect/>
@@ -15042,7 +17675,7 @@
           <w:sz w:val="20"/>
           <w:szCs w:val="20"/>
         </w:rPr>
-        <w:t xml:space="preserve">Figure 8.  p95 latency of each store's GraphRAG query as the corpus grows 200× (after the fixes of Section 9.4).</w:t>
+        <w:t xml:space="preserve">Figure 12.  p95 latency of each store's GraphRAG query as the corpus grows 200× (after the fixes of Section 9.4).</w:t>
       </w:r>
     </w:p>
     <w:p>
@@ -15088,7 +17721,7 @@
           <w:sz w:val="24"/>
           <w:szCs w:val="24"/>
         </w:rPr>
-        <w:t xml:space="preserve">The first scaling run did not look like Figure 8. GraphRAG retrieval grew roughly linearly with corpus size — median 26.8 ms at 1× to 675 ms at 200×, p95 14.7 s — and ingest throughput fell from 20.4 to 1.5 reports per second. Per-channel timing and Neo4j PROFILE output traced this to four defects, none visible on the 87-node seed corpus:</w:t>
+        <w:t xml:space="preserve">The first scaling run did not look like Figure 12. GraphRAG retrieval grew roughly linearly with corpus size — median 26.8 ms at 1× to 675 ms at 200×, p95 14.7 s — and ingest throughput fell from 20.4 to 1.5 reports per second. Per-channel timing and Neo4j PROFILE output traced this to four defects, none visible on the 87-node seed corpus:</w:t>
       </w:r>
     </w:p>
     <w:tbl>
@@ -15677,7 +18310,7 @@
           <w:sz w:val="20"/>
           <w:szCs w:val="20"/>
         </w:rPr>
-        <w:t xml:space="preserve">Table 13.  Scalability defects exposed by the benchmark and their fixes.</w:t>
+        <w:t xml:space="preserve">Table 16.  Scalability defects exposed by the benchmark and their fixes.</w:t>
       </w:r>
     </w:p>
     <w:p>
@@ -15705,7 +18338,7 @@
                     </pic:cNvPicPr>
                   </pic:nvPicPr>
                   <pic:blipFill>
-                    <a:blip r:embed="rId19" cstate="none"/>
+                    <a:blip r:embed="rId23" cstate="none"/>
                     <a:srcRect/>
                     <a:stretch>
                       <a:fillRect/>
@@ -15740,7 +18373,7 @@
           <w:sz w:val="20"/>
           <w:szCs w:val="20"/>
         </w:rPr>
-        <w:t xml:space="preserve">Figure 9.  Entity linking and GraphRAG retrieval latency before and after the fixes, 1× to 200×.</w:t>
+        <w:t xml:space="preserve">Figure 13.  Entity linking and GraphRAG retrieval latency before and after the fixes, 1× to 200×.</w:t>
       </w:r>
     </w:p>
     <w:p>
@@ -15754,7 +18387,7 @@
           <w:sz w:val="24"/>
           <w:szCs w:val="24"/>
         </w:rPr>
-        <w:t xml:space="preserve">At 200× the fixes reduce entity linking from 379 ms to 0.06 ms (median), GraphRAG retrieval from 675 ms to 65.4 ms (median) and from 14.7 s to 185 ms (p95), and raise ingest throughput from 1.5 to 31.6 reports per second (Figure 10). The full scale experiment now runs in 123.4 s instead of 331.8 s.</w:t>
+        <w:t xml:space="preserve">At 200× the fixes reduce entity linking from 379 ms to 0.06 ms (median), GraphRAG retrieval from 675 ms to 65.4 ms (median) and from 14.7 s to 185 ms (p95), and raise ingest throughput from 1.5 to 31.6 reports per second (Figure 14). The full scale experiment now runs in 123.4 s instead of 331.8 s.</w:t>
       </w:r>
     </w:p>
     <w:p>
@@ -15782,7 +18415,7 @@
                     </pic:cNvPicPr>
                   </pic:nvPicPr>
                   <pic:blipFill>
-                    <a:blip r:embed="rId20" cstate="none"/>
+                    <a:blip r:embed="rId24" cstate="none"/>
                     <a:srcRect/>
                     <a:stretch>
                       <a:fillRect/>
@@ -15817,7 +18450,7 @@
           <w:sz w:val="20"/>
           <w:szCs w:val="20"/>
         </w:rPr>
-        <w:t xml:space="preserve">Figure 10.  Ingest throughput through the full four-store fan-out, before and after the fixes.</w:t>
+        <w:t xml:space="preserve">Figure 14.  Ingest throughput through the full four-store fan-out, before and after the fixes.</w:t>
       </w:r>
     </w:p>
     <w:p>
@@ -15849,7 +18482,7 @@
           <w:sz w:val="24"/>
           <w:szCs w:val="24"/>
         </w:rPr>
-        <w:t xml:space="preserve">Each store's indexes were ablated on dedicated data: 200,000 synthetic reports in MongoDB and 100,000 hosts in Neo4j. Figure 11 and Table 14 show latency together with the work the engine reports — documents and keys examined from MongoDB </w:t>
+        <w:t xml:space="preserve">Each store's indexes were ablated on dedicated data: 200,000 synthetic reports in MongoDB and 100,000 hosts in Neo4j. Figure 15 and Table 17 show latency together with the work the engine reports — documents and keys examined from MongoDB </w:t>
       </w:r>
       <w:r>
         <w:rPr>
@@ -15909,7 +18542,7 @@
                     </pic:cNvPicPr>
                   </pic:nvPicPr>
                   <pic:blipFill>
-                    <a:blip r:embed="rId21" cstate="none"/>
+                    <a:blip r:embed="rId25" cstate="none"/>
                     <a:srcRect/>
                     <a:stretch>
                       <a:fillRect/>
@@ -15944,7 +18577,7 @@
           <w:sz w:val="20"/>
           <w:szCs w:val="20"/>
         </w:rPr>
-        <w:t xml:space="preserve">Figure 11.  Index ablation: MongoDB report queries and Neo4j property lookup, without and with indexes (median latency).</w:t>
+        <w:t xml:space="preserve">Figure 15.  Index ablation: MongoDB report queries and Neo4j property lookup, without and with indexes (median latency).</w:t>
       </w:r>
     </w:p>
     <w:tbl>
@@ -16885,7 +19518,7 @@
           <w:sz w:val="20"/>
           <w:szCs w:val="20"/>
         </w:rPr>
-        <w:t xml:space="preserve">Table 14.  Index ablation results.</w:t>
+        <w:t xml:space="preserve">Table 17.  Index ablation results.</w:t>
       </w:r>
     </w:p>
     <w:p>
@@ -16945,7 +19578,7 @@
                     </pic:cNvPicPr>
                   </pic:nvPicPr>
                   <pic:blipFill>
-                    <a:blip r:embed="rId22" cstate="none"/>
+                    <a:blip r:embed="rId26" cstate="none"/>
                     <a:srcRect/>
                     <a:stretch>
                       <a:fillRect/>
@@ -16980,7 +19613,7 @@
           <w:sz w:val="20"/>
           <w:szCs w:val="20"/>
         </w:rPr>
-        <w:t xml:space="preserve">Figure 12.  Redis: blocklist lookup p99 against a full keyspace scan as the number of IOC keys grows to 500,000.</w:t>
+        <w:t xml:space="preserve">Figure 16.  Redis: blocklist lookup p99 against a full keyspace scan as the number of IOC keys grows to 500,000.</w:t>
       </w:r>
     </w:p>
     <w:p>
@@ -17040,7 +19673,7 @@
                     </pic:cNvPicPr>
                   </pic:nvPicPr>
                   <pic:blipFill>
-                    <a:blip r:embed="rId23" cstate="none"/>
+                    <a:blip r:embed="rId27" cstate="none"/>
                     <a:srcRect/>
                     <a:stretch>
                       <a:fillRect/>
@@ -17075,7 +19708,7 @@
           <w:sz w:val="20"/>
           <w:szCs w:val="20"/>
         </w:rPr>
-        <w:t xml:space="preserve">Figure 13.  Qdrant: recall@10 of HNSW as search breadth grows, and median latency of HNSW and exact search as the collection grows.</w:t>
+        <w:t xml:space="preserve">Figure 17.  Qdrant: recall@10 of HNSW as search breadth grows, and median latency of HNSW and exact search as the collection grows.</w:t>
       </w:r>
     </w:p>
     <w:tbl>
@@ -17835,7 +20468,7 @@
           <w:sz w:val="20"/>
           <w:szCs w:val="20"/>
         </w:rPr>
-        <w:t xml:space="preserve">Table 15.  HNSW against exact search on 64-dimensional clustered vectors (100 queries, k = 10).</w:t>
+        <w:t xml:space="preserve">Table 18.  HNSW against exact search on 64-dimensional clustered vectors (100 queries, k = 10).</w:t>
       </w:r>
     </w:p>
     <w:p>
@@ -17895,7 +20528,7 @@
                     </pic:cNvPicPr>
                   </pic:nvPicPr>
                   <pic:blipFill>
-                    <a:blip r:embed="rId24" cstate="none"/>
+                    <a:blip r:embed="rId28" cstate="none"/>
                     <a:srcRect/>
                     <a:stretch>
                       <a:fillRect/>
@@ -17930,7 +20563,7 @@
           <w:sz w:val="20"/>
           <w:szCs w:val="20"/>
         </w:rPr>
-        <w:t xml:space="preserve">Figure 14.  API throughput and p95 latency from 1 to 64 concurrent clients (200× corpus, one Uvicorn worker).</w:t>
+        <w:t xml:space="preserve">Figure 18.  API throughput and p95 latency from 1 to 64 concurrent clients (200× corpus, one Uvicorn worker).</w:t>
       </w:r>
     </w:p>
     <w:p>
@@ -18024,7 +20657,7 @@
           <w:sz w:val="24"/>
           <w:szCs w:val="24"/>
         </w:rPr>
-        <w:t xml:space="preserve"> to 9.5 s p95 (Figure 15). Keeping the most relevant evidence also follows the observation that models use long contexts poorly [36].</w:t>
+        <w:t xml:space="preserve"> to 9.5 s p95 (Figure 19). Keeping the most relevant evidence also follows the observation that models use long contexts poorly [36].</w:t>
       </w:r>
     </w:p>
     <w:p>
@@ -18052,7 +20685,7 @@
                     </pic:cNvPicPr>
                   </pic:nvPicPr>
                   <pic:blipFill>
-                    <a:blip r:embed="rId25" cstate="none"/>
+                    <a:blip r:embed="rId29" cstate="none"/>
                     <a:srcRect/>
                     <a:stretch>
                       <a:fillRect/>
@@ -18087,7 +20720,7 @@
           <w:sz w:val="20"/>
           <w:szCs w:val="20"/>
         </w:rPr>
-        <w:t xml:space="preserve">Figure 15.  GraphRAG end-to-end p95 across measured configurations, with mean citation coverage (six acceptance questions).</w:t>
+        <w:t xml:space="preserve">Figure 19.  GraphRAG end-to-end p95 across measured configurations, with mean citation coverage (six acceptance questions).</w:t>
       </w:r>
     </w:p>
     <w:p>
@@ -19154,7 +21787,7 @@
                 <w:sz w:val="18"/>
                 <w:szCs w:val="18"/>
               </w:rPr>
-              <w:t xml:space="preserve">Table 9</w:t>
+              <w:t xml:space="preserve">Table 11</w:t>
             </w:r>
           </w:p>
         </w:tc>
@@ -20322,7 +22955,7 @@
                 <w:sz w:val="18"/>
                 <w:szCs w:val="18"/>
               </w:rPr>
-              <w:t xml:space="preserve">no external calls</w:t>
+              <w:t xml:space="preserve">no LLM or embedding API calls</w:t>
             </w:r>
           </w:p>
         </w:tc>
@@ -20760,7 +23393,7 @@
                 <w:sz w:val="18"/>
                 <w:szCs w:val="18"/>
               </w:rPr>
-              <w:t xml:space="preserve">unit tests; Table 9</w:t>
+              <w:t xml:space="preserve">unit tests; Table 11</w:t>
             </w:r>
           </w:p>
         </w:tc>
@@ -21363,7 +23996,7 @@
           <w:sz w:val="20"/>
           <w:szCs w:val="20"/>
         </w:rPr>
-        <w:t xml:space="preserve">Table 16.  Requirement traceability. All functional and non-functional requirements are met.</w:t>
+        <w:t xml:space="preserve">Table 19.  Requirement traceability. All functional and non-functional requirements are met.</w:t>
       </w:r>
     </w:p>
     <w:tbl>
@@ -22063,7 +24696,7 @@
           <w:sz w:val="20"/>
           <w:szCs w:val="20"/>
         </w:rPr>
-        <w:t xml:space="preserve">Table 17.  Review I gaps and how the final system closes them.</w:t>
+        <w:t xml:space="preserve">Table 20.  Review I gaps and how the final system closes them.</w:t>
       </w:r>
     </w:p>
     <w:p>
@@ -22159,7 +24792,7 @@
           <w:sz w:val="24"/>
           <w:szCs w:val="24"/>
         </w:rPr>
-        <w:t xml:space="preserve">Small, curated corpus.</w:t>
+        <w:t xml:space="preserve">Corpus.</w:t>
       </w:r>
       <w:r>
         <w:rPr>
@@ -22167,7 +24800,7 @@
           <w:sz w:val="24"/>
           <w:szCs w:val="24"/>
         </w:rPr>
-        <w:t xml:space="preserve"> Twelve public-knowledge reports cover every mechanism; the 200× scaling is synthetic. A TAXII feed connector would supply real volume.</w:t>
+        <w:t xml:space="preserve"> Twelve curated reports exercise every mechanism and the real feeds add ATT&amp;CK and two IP feeds; the 200× scaling is synthetic. A TAXII connector with scheduled refresh would keep the feeds current without re-running the import.</w:t>
       </w:r>
     </w:p>
     <w:p>
@@ -22187,7 +24820,7 @@
           <w:sz w:val="24"/>
           <w:szCs w:val="24"/>
         </w:rPr>
-        <w:t xml:space="preserve">Model quality versus latency.</w:t>
+        <w:t xml:space="preserve">Hosted latency.</w:t>
       </w:r>
       <w:r>
         <w:rPr>
@@ -22195,39 +24828,7 @@
           <w:sz w:val="24"/>
           <w:szCs w:val="24"/>
         </w:rPr>
-        <w:t xml:space="preserve"> </w:t>
-      </w:r>
-      <w:r>
-        <w:rPr>
-          <w:rFonts w:ascii="Courier New" w:cs="Courier New" w:eastAsia="Courier New" w:hAnsi="Courier New"/>
-          <w:sz w:val="20"/>
-          <w:szCs w:val="20"/>
-        </w:rPr>
-        <w:t xml:space="preserve">llama3.2:3b</w:t>
-      </w:r>
-      <w:r>
-        <w:rPr>
-          <w:rFonts w:ascii="Times New Roman" w:cs="Times New Roman" w:eastAsia="Times New Roman" w:hAnsi="Times New Roman"/>
-          <w:sz w:val="24"/>
-          <w:szCs w:val="24"/>
-        </w:rPr>
-        <w:t xml:space="preserve"> meets the SLO but writes terser answers than </w:t>
-      </w:r>
-      <w:r>
-        <w:rPr>
-          <w:rFonts w:ascii="Courier New" w:cs="Courier New" w:eastAsia="Courier New" w:hAnsi="Courier New"/>
-          <w:sz w:val="20"/>
-          <w:szCs w:val="20"/>
-        </w:rPr>
-        <w:t xml:space="preserve">llama3.1:8b</w:t>
-      </w:r>
-      <w:r>
-        <w:rPr>
-          <w:rFonts w:ascii="Times New Roman" w:cs="Times New Roman" w:eastAsia="Times New Roman" w:hAnsi="Times New Roman"/>
-          <w:sz w:val="24"/>
-          <w:szCs w:val="24"/>
-        </w:rPr>
-        <w:t xml:space="preserve">; streaming the answer with the gate applied on completion would let the larger model feel interactive.</w:t>
+        <w:t xml:space="preserve"> On free tiers in other regions, Redis and GraphRAG miss their co-located latency targets (Section 8.2). Paid tiers in the analyst's region, or the local stack, meet them.</w:t>
       </w:r>
     </w:p>
     <w:p>
@@ -22247,7 +24848,7 @@
           <w:sz w:val="24"/>
           <w:szCs w:val="24"/>
         </w:rPr>
-        <w:t xml:space="preserve">Embeddings.</w:t>
+        <w:t xml:space="preserve">Model quality versus latency.</w:t>
       </w:r>
       <w:r>
         <w:rPr>
@@ -22255,7 +24856,7 @@
           <w:sz w:val="24"/>
           <w:szCs w:val="24"/>
         </w:rPr>
-        <w:t xml:space="preserve"> The default TF-IDF + SVD model is deterministic and offline but weaker than neural embeddings; </w:t>
+        <w:t xml:space="preserve"> </w:t>
       </w:r>
       <w:r>
         <w:rPr>
@@ -22263,7 +24864,7 @@
           <w:sz w:val="20"/>
           <w:szCs w:val="20"/>
         </w:rPr>
-        <w:t xml:space="preserve">nomic-embed-text</w:t>
+        <w:t xml:space="preserve">llama3.2:3b</w:t>
       </w:r>
       <w:r>
         <w:rPr>
@@ -22271,7 +24872,23 @@
           <w:sz w:val="24"/>
           <w:szCs w:val="24"/>
         </w:rPr>
-        <w:t xml:space="preserve"> is supported and should become the default once download size is acceptable for the target environment.</w:t>
+        <w:t xml:space="preserve"> meets the SLO but writes terser answers than </w:t>
+      </w:r>
+      <w:r>
+        <w:rPr>
+          <w:rFonts w:ascii="Courier New" w:cs="Courier New" w:eastAsia="Courier New" w:hAnsi="Courier New"/>
+          <w:sz w:val="20"/>
+          <w:szCs w:val="20"/>
+        </w:rPr>
+        <w:t xml:space="preserve">llama3.1:8b</w:t>
+      </w:r>
+      <w:r>
+        <w:rPr>
+          <w:rFonts w:ascii="Times New Roman" w:cs="Times New Roman" w:eastAsia="Times New Roman" w:hAnsi="Times New Roman"/>
+          <w:sz w:val="24"/>
+          <w:szCs w:val="24"/>
+        </w:rPr>
+        <w:t xml:space="preserve">; streaming the answer with the gate applied on completion would let the larger model feel interactive.</w:t>
       </w:r>
     </w:p>
     <w:p>
@@ -22291,6 +24908,50 @@
           <w:sz w:val="24"/>
           <w:szCs w:val="24"/>
         </w:rPr>
+        <w:t xml:space="preserve">Embeddings.</w:t>
+      </w:r>
+      <w:r>
+        <w:rPr>
+          <w:rFonts w:ascii="Times New Roman" w:cs="Times New Roman" w:eastAsia="Times New Roman" w:hAnsi="Times New Roman"/>
+          <w:sz w:val="24"/>
+          <w:szCs w:val="24"/>
+        </w:rPr>
+        <w:t xml:space="preserve"> The default TF-IDF + SVD model is deterministic and offline but weaker than neural embeddings; </w:t>
+      </w:r>
+      <w:r>
+        <w:rPr>
+          <w:rFonts w:ascii="Courier New" w:cs="Courier New" w:eastAsia="Courier New" w:hAnsi="Courier New"/>
+          <w:sz w:val="20"/>
+          <w:szCs w:val="20"/>
+        </w:rPr>
+        <w:t xml:space="preserve">nomic-embed-text</w:t>
+      </w:r>
+      <w:r>
+        <w:rPr>
+          <w:rFonts w:ascii="Times New Roman" w:cs="Times New Roman" w:eastAsia="Times New Roman" w:hAnsi="Times New Roman"/>
+          <w:sz w:val="24"/>
+          <w:szCs w:val="24"/>
+        </w:rPr>
+        <w:t xml:space="preserve"> is supported and should become the default once download size is acceptable for the target environment.</w:t>
+      </w:r>
+    </w:p>
+    <w:p>
+      <w:pPr>
+        <w:pStyle w:val="ListParagraph"/>
+        <w:numPr>
+          <w:ilvl w:val="0"/>
+          <w:numId w:val="2"/>
+        </w:numPr>
+        <w:spacing w:after="70" w:line="300"/>
+      </w:pPr>
+      <w:r>
+        <w:rPr>
+          <w:rFonts w:ascii="Times New Roman" w:cs="Times New Roman" w:eastAsia="Times New Roman" w:hAnsi="Times New Roman"/>
+          <w:b/>
+          <w:bCs/>
+          <w:sz w:val="24"/>
+          <w:szCs w:val="24"/>
+        </w:rPr>
         <w:t xml:space="preserve">Demo-grade secrets.</w:t>
       </w:r>
       <w:r>
@@ -22349,7 +25010,7 @@
           <w:sz w:val="24"/>
           <w:szCs w:val="24"/>
         </w:rPr>
-        <w:t xml:space="preserve">The platform shows that CTI is best served by a polyglot design in which each NoSQL model does what it is best at, and that GraphRAG over such a design can be both useful and accountable. Relationships live in Neo4j, reports in MongoDB, live indicators in Redis and narrative similarity in Qdrant; a local LLM turns their combined evidence into answers whose every sentence can be traced and replayed. Review III completed the system, verified it with 31 automated tests and continuous integration, and measured it: all latency objectives are met, store-level queries remain flat across a 200-fold corpus increase, and the benchmark harness proved its worth by exposing and confirming the fix of four defects that would have surfaced only in production.</w:t>
+        <w:t xml:space="preserve">The platform shows that CTI is best served by a polyglot design in which each NoSQL model does what it is best at, and that GraphRAG over such a design can be both useful and accountable. Relationships live in Neo4j, reports in MongoDB, live indicators in Redis and narrative similarity in Qdrant; a local LLM turns their combined evidence into answers whose every sentence can be traced and replayed. Review III completed the system, verified it with 34 automated tests and continuous integration, and measured it: all latency objectives are met, store-level queries remain flat across a 200-fold corpus increase, and the benchmark harness proved its worth by exposing and confirming the fix of four defects that would have surfaced only in production.</w:t>
       </w:r>
     </w:p>
     <w:p>
@@ -23438,6 +26099,32 @@
                 <w:sz w:val="18"/>
                 <w:szCs w:val="18"/>
               </w:rPr>
+              <w:t xml:space="preserve">make import-feeds                   # real feeds: MITRE ATT&amp;CK, abuse.ch Feodo Tracker, Emerging Threats</w:t>
+            </w:r>
+          </w:p>
+          <w:p>
+            <w:pPr>
+              <w:spacing w:after="0" w:line="250"/>
+            </w:pPr>
+            <w:r>
+              <w:rPr>
+                <w:rFonts w:ascii="Courier New" w:cs="Courier New" w:eastAsia="Courier New" w:hAnsi="Courier New"/>
+                <w:sz w:val="18"/>
+                <w:szCs w:val="18"/>
+              </w:rPr>
+              <w:t xml:space="preserve">make cloud-check &amp;&amp; make cloud-seed &amp;&amp; make cloud-import-feeds &amp;&amp; make cloud-api   # hosted databases</w:t>
+            </w:r>
+          </w:p>
+          <w:p>
+            <w:pPr>
+              <w:spacing w:after="0" w:line="250"/>
+            </w:pPr>
+            <w:r>
+              <w:rPr>
+                <w:rFonts w:ascii="Courier New" w:cs="Courier New" w:eastAsia="Courier New" w:hAnsi="Courier New"/>
+                <w:sz w:val="18"/>
+                <w:szCs w:val="18"/>
+              </w:rPr>
               <w:t xml:space="preserve">docker compose --profile app stop   # pause the demo stack before benchmarking</w:t>
             </w:r>
           </w:p>
@@ -23560,7 +26247,7 @@
           <w:sz w:val="24"/>
           <w:szCs w:val="24"/>
         </w:rPr>
-        <w:t xml:space="preserve">, the three evaluation runs and </w:t>
+        <w:t xml:space="preserve">, the evaluation runs (including </w:t>
       </w:r>
       <w:r>
         <w:rPr>
@@ -23568,7 +26255,7 @@
           <w:sz w:val="20"/>
           <w:szCs w:val="20"/>
         </w:rPr>
-        <w:t xml:space="preserve">llm_latency_runs.json</w:t>
+        <w:t xml:space="preserve">eval_real_data_local.json</w:t>
       </w:r>
       <w:r>
         <w:rPr>
@@ -23576,7 +26263,55 @@
           <w:sz w:val="24"/>
           <w:szCs w:val="24"/>
         </w:rPr>
-        <w:t xml:space="preserve">, which records the provenance of every LLM measurement in Figure 15.</w:t>
+        <w:t xml:space="preserve"> and </w:t>
+      </w:r>
+      <w:r>
+        <w:rPr>
+          <w:rFonts w:ascii="Courier New" w:cs="Courier New" w:eastAsia="Courier New" w:hAnsi="Courier New"/>
+          <w:sz w:val="20"/>
+          <w:szCs w:val="20"/>
+        </w:rPr>
+        <w:t xml:space="preserve">eval_real_data_cloud.json</w:t>
+      </w:r>
+      <w:r>
+        <w:rPr>
+          <w:rFonts w:ascii="Times New Roman" w:cs="Times New Roman" w:eastAsia="Times New Roman" w:hAnsi="Times New Roman"/>
+          <w:sz w:val="24"/>
+          <w:szCs w:val="24"/>
+        </w:rPr>
+        <w:t xml:space="preserve">), </w:t>
+      </w:r>
+      <w:r>
+        <w:rPr>
+          <w:rFonts w:ascii="Courier New" w:cs="Courier New" w:eastAsia="Courier New" w:hAnsi="Courier New"/>
+          <w:sz w:val="20"/>
+          <w:szCs w:val="20"/>
+        </w:rPr>
+        <w:t xml:space="preserve">cloud_verification.json</w:t>
+      </w:r>
+      <w:r>
+        <w:rPr>
+          <w:rFonts w:ascii="Times New Roman" w:cs="Times New Roman" w:eastAsia="Times New Roman" w:hAnsi="Times New Roman"/>
+          <w:sz w:val="24"/>
+          <w:szCs w:val="24"/>
+        </w:rPr>
+        <w:t xml:space="preserve"> and </w:t>
+      </w:r>
+      <w:r>
+        <w:rPr>
+          <w:rFonts w:ascii="Courier New" w:cs="Courier New" w:eastAsia="Courier New" w:hAnsi="Courier New"/>
+          <w:sz w:val="20"/>
+          <w:szCs w:val="20"/>
+        </w:rPr>
+        <w:t xml:space="preserve">llm_latency_runs.json</w:t>
+      </w:r>
+      <w:r>
+        <w:rPr>
+          <w:rFonts w:ascii="Times New Roman" w:cs="Times New Roman" w:eastAsia="Times New Roman" w:hAnsi="Times New Roman"/>
+          <w:sz w:val="24"/>
+          <w:szCs w:val="24"/>
+        </w:rPr>
+        <w:t xml:space="preserve">, which records the provenance of every LLM measurement in Figure 19.</w:t>
       </w:r>
     </w:p>
     <w:sectPr>

</xml_diff>